<commit_message>
Fixed resume images and downloads for JUNIOR STANDFORD SANS SERIF
</commit_message>
<xml_diff>
--- a/public/downloadables/junior_stanford-template_sans-serif.docx
+++ b/public/downloadables/junior_stanford-template_sans-serif.docx
@@ -69,940 +69,6 @@
         <mc:AlternateContent>
           <mc:Choice Requires="wps">
             <w:drawing xmlns:a="http://schemas.openxmlformats.org/drawingml/2006/main">
-              <wp:anchor distT="0" distB="0" distL="0" distR="0" simplePos="0" relativeHeight="251679744" behindDoc="0" locked="0" layoutInCell="1" allowOverlap="1">
-                <wp:simplePos x="0" y="0"/>
-                <wp:positionH relativeFrom="margin">
-                  <wp:posOffset>6350</wp:posOffset>
-                </wp:positionH>
-                <wp:positionV relativeFrom="line">
-                  <wp:posOffset>1116210</wp:posOffset>
-                </wp:positionV>
-                <wp:extent cx="6858000" cy="0"/>
-                <wp:effectExtent l="0" t="0" r="0" b="0"/>
-                <wp:wrapTopAndBottom distT="0" distB="0"/>
-                <wp:docPr id="1073741826" name="officeArt object" descr="Line"/>
-                <wp:cNvGraphicFramePr/>
-                <a:graphic xmlns:a="http://schemas.openxmlformats.org/drawingml/2006/main">
-                  <a:graphicData uri="http://schemas.microsoft.com/office/word/2010/wordprocessingShape">
-                    <wps:wsp>
-                      <wps:cNvSpPr/>
-                      <wps:spPr>
-                        <a:xfrm>
-                          <a:off x="0" y="0"/>
-                          <a:ext cx="6858000" cy="0"/>
-                        </a:xfrm>
-                        <a:prstGeom prst="line">
-                          <a:avLst/>
-                        </a:prstGeom>
-                        <a:noFill/>
-                        <a:ln w="6350" cap="flat">
-                          <a:solidFill>
-                            <a:srgbClr val="000000"/>
-                          </a:solidFill>
-                          <a:prstDash val="solid"/>
-                          <a:miter lim="400000"/>
-                        </a:ln>
-                        <a:effectLst/>
-                      </wps:spPr>
-                      <wps:bodyPr/>
-                    </wps:wsp>
-                  </a:graphicData>
-                </a:graphic>
-              </wp:anchor>
-            </w:drawing>
-          </mc:Choice>
-          <mc:Fallback>
-            <w:pict>
-              <v:line id="_x0000_s1027" style="visibility:visible;position:absolute;margin-left:0.5pt;margin-top:87.9pt;width:540.0pt;height:0.0pt;z-index:251679744;mso-position-horizontal:absolute;mso-position-horizontal-relative:margin;mso-position-vertical:absolute;mso-position-vertical-relative:line;mso-wrap-distance-left:0.0pt;mso-wrap-distance-top:0.0pt;mso-wrap-distance-right:0.0pt;mso-wrap-distance-bottom:0.0pt;">
-                <v:fill on="f"/>
-                <v:stroke filltype="solid" color="#000000" opacity="100.0%" weight="0.5pt" dashstyle="solid" endcap="flat" miterlimit="400.0%" joinstyle="miter" linestyle="single" startarrow="none" startarrowwidth="medium" startarrowlength="medium" endarrow="none" endarrowwidth="medium" endarrowlength="medium"/>
-                <w10:wrap type="topAndBottom" side="bothSides" anchorx="margin"/>
-              </v:line>
-            </w:pict>
-          </mc:Fallback>
-        </mc:AlternateContent>
-      </w:r>
-      <w:r>
-        <mc:AlternateContent>
-          <mc:Choice Requires="wps">
-            <w:drawing xmlns:a="http://schemas.openxmlformats.org/drawingml/2006/main">
-              <wp:anchor distT="0" distB="0" distL="0" distR="0" simplePos="0" relativeHeight="251683840" behindDoc="0" locked="0" layoutInCell="1" allowOverlap="1">
-                <wp:simplePos x="0" y="0"/>
-                <wp:positionH relativeFrom="margin">
-                  <wp:posOffset>6350</wp:posOffset>
-                </wp:positionH>
-                <wp:positionV relativeFrom="line">
-                  <wp:posOffset>3618568</wp:posOffset>
-                </wp:positionV>
-                <wp:extent cx="6858000" cy="0"/>
-                <wp:effectExtent l="0" t="0" r="0" b="0"/>
-                <wp:wrapTopAndBottom distT="0" distB="0"/>
-                <wp:docPr id="1073741827" name="officeArt object" descr="Line"/>
-                <wp:cNvGraphicFramePr/>
-                <a:graphic xmlns:a="http://schemas.openxmlformats.org/drawingml/2006/main">
-                  <a:graphicData uri="http://schemas.microsoft.com/office/word/2010/wordprocessingShape">
-                    <wps:wsp>
-                      <wps:cNvSpPr/>
-                      <wps:spPr>
-                        <a:xfrm>
-                          <a:off x="0" y="0"/>
-                          <a:ext cx="6858000" cy="0"/>
-                        </a:xfrm>
-                        <a:prstGeom prst="line">
-                          <a:avLst/>
-                        </a:prstGeom>
-                        <a:noFill/>
-                        <a:ln w="6350" cap="flat">
-                          <a:solidFill>
-                            <a:srgbClr val="000000"/>
-                          </a:solidFill>
-                          <a:prstDash val="solid"/>
-                          <a:miter lim="400000"/>
-                        </a:ln>
-                        <a:effectLst/>
-                      </wps:spPr>
-                      <wps:bodyPr/>
-                    </wps:wsp>
-                  </a:graphicData>
-                </a:graphic>
-              </wp:anchor>
-            </w:drawing>
-          </mc:Choice>
-          <mc:Fallback>
-            <w:pict>
-              <v:line id="_x0000_s1028" style="visibility:visible;position:absolute;margin-left:0.5pt;margin-top:284.9pt;width:540.0pt;height:0.0pt;z-index:251683840;mso-position-horizontal:absolute;mso-position-horizontal-relative:margin;mso-position-vertical:absolute;mso-position-vertical-relative:line;mso-wrap-distance-left:0.0pt;mso-wrap-distance-top:0.0pt;mso-wrap-distance-right:0.0pt;mso-wrap-distance-bottom:0.0pt;">
-                <v:fill on="f"/>
-                <v:stroke filltype="solid" color="#000000" opacity="100.0%" weight="0.5pt" dashstyle="solid" endcap="flat" miterlimit="400.0%" joinstyle="miter" linestyle="single" startarrow="none" startarrowwidth="medium" startarrowlength="medium" endarrow="none" endarrowwidth="medium" endarrowlength="medium"/>
-                <w10:wrap type="topAndBottom" side="bothSides" anchorx="margin"/>
-              </v:line>
-            </w:pict>
-          </mc:Fallback>
-        </mc:AlternateContent>
-      </w:r>
-      <w:r>
-        <mc:AlternateContent>
-          <mc:Choice Requires="wps">
-            <w:drawing xmlns:a="http://schemas.openxmlformats.org/drawingml/2006/main">
-              <wp:anchor distT="0" distB="0" distL="0" distR="0" simplePos="0" relativeHeight="251671552" behindDoc="0" locked="0" layoutInCell="1" allowOverlap="1">
-                <wp:simplePos x="0" y="0"/>
-                <wp:positionH relativeFrom="margin">
-                  <wp:posOffset>6350</wp:posOffset>
-                </wp:positionH>
-                <wp:positionV relativeFrom="line">
-                  <wp:posOffset>4304043</wp:posOffset>
-                </wp:positionV>
-                <wp:extent cx="6858000" cy="0"/>
-                <wp:effectExtent l="0" t="0" r="0" b="0"/>
-                <wp:wrapTopAndBottom distT="0" distB="0"/>
-                <wp:docPr id="1073741828" name="officeArt object" descr="Line"/>
-                <wp:cNvGraphicFramePr/>
-                <a:graphic xmlns:a="http://schemas.openxmlformats.org/drawingml/2006/main">
-                  <a:graphicData uri="http://schemas.microsoft.com/office/word/2010/wordprocessingShape">
-                    <wps:wsp>
-                      <wps:cNvSpPr/>
-                      <wps:spPr>
-                        <a:xfrm>
-                          <a:off x="0" y="0"/>
-                          <a:ext cx="6858000" cy="0"/>
-                        </a:xfrm>
-                        <a:prstGeom prst="line">
-                          <a:avLst/>
-                        </a:prstGeom>
-                        <a:noFill/>
-                        <a:ln w="6350" cap="flat">
-                          <a:solidFill>
-                            <a:srgbClr val="000000"/>
-                          </a:solidFill>
-                          <a:prstDash val="solid"/>
-                          <a:miter lim="400000"/>
-                        </a:ln>
-                        <a:effectLst/>
-                      </wps:spPr>
-                      <wps:bodyPr/>
-                    </wps:wsp>
-                  </a:graphicData>
-                </a:graphic>
-              </wp:anchor>
-            </w:drawing>
-          </mc:Choice>
-          <mc:Fallback>
-            <w:pict>
-              <v:line id="_x0000_s1029" style="visibility:visible;position:absolute;margin-left:0.5pt;margin-top:338.9pt;width:540.0pt;height:0.0pt;z-index:251671552;mso-position-horizontal:absolute;mso-position-horizontal-relative:margin;mso-position-vertical:absolute;mso-position-vertical-relative:line;mso-wrap-distance-left:0.0pt;mso-wrap-distance-top:0.0pt;mso-wrap-distance-right:0.0pt;mso-wrap-distance-bottom:0.0pt;">
-                <v:fill on="f"/>
-                <v:stroke filltype="solid" color="#000000" opacity="100.0%" weight="0.5pt" dashstyle="solid" endcap="flat" miterlimit="400.0%" joinstyle="miter" linestyle="single" startarrow="none" startarrowwidth="medium" startarrowlength="medium" endarrow="none" endarrowwidth="medium" endarrowlength="medium"/>
-                <w10:wrap type="topAndBottom" side="bothSides" anchorx="margin"/>
-              </v:line>
-            </w:pict>
-          </mc:Fallback>
-        </mc:AlternateContent>
-      </w:r>
-      <w:r>
-        <mc:AlternateContent>
-          <mc:Choice Requires="wps">
-            <w:drawing xmlns:a="http://schemas.openxmlformats.org/drawingml/2006/main">
-              <wp:anchor distT="152400" distB="152400" distL="152400" distR="152400" simplePos="0" relativeHeight="251661312" behindDoc="0" locked="0" layoutInCell="1" allowOverlap="1">
-                <wp:simplePos x="0" y="0"/>
-                <wp:positionH relativeFrom="margin">
-                  <wp:posOffset>1721966</wp:posOffset>
-                </wp:positionH>
-                <wp:positionV relativeFrom="line">
-                  <wp:posOffset>4189743</wp:posOffset>
-                </wp:positionV>
-                <wp:extent cx="5232574" cy="621308"/>
-                <wp:effectExtent l="0" t="0" r="0" b="0"/>
-                <wp:wrapThrough wrapText="bothSides" distL="152400" distR="152400">
-                  <wp:wrapPolygon edited="1">
-                    <wp:start x="0" y="0"/>
-                    <wp:lineTo x="21600" y="0"/>
-                    <wp:lineTo x="21600" y="21600"/>
-                    <wp:lineTo x="0" y="21600"/>
-                    <wp:lineTo x="0" y="0"/>
-                  </wp:wrapPolygon>
-                </wp:wrapThrough>
-                <wp:docPr id="1073741829" name="officeArt object" descr="HTML, CSS, JS, TypeScript, Sass, Less, React, Redux, Next.js, Angular, Bootstrap, Tailwind, Material UI…"/>
-                <wp:cNvGraphicFramePr/>
-                <a:graphic xmlns:a="http://schemas.openxmlformats.org/drawingml/2006/main">
-                  <a:graphicData uri="http://schemas.microsoft.com/office/word/2010/wordprocessingShape">
-                    <wps:wsp>
-                      <wps:cNvSpPr txBox="1"/>
-                      <wps:spPr>
-                        <a:xfrm>
-                          <a:off x="0" y="0"/>
-                          <a:ext cx="5232574" cy="621308"/>
-                        </a:xfrm>
-                        <a:prstGeom prst="rect">
-                          <a:avLst/>
-                        </a:prstGeom>
-                        <a:noFill/>
-                        <a:ln w="12700" cap="flat">
-                          <a:noFill/>
-                          <a:miter lim="400000"/>
-                        </a:ln>
-                        <a:effectLst/>
-                      </wps:spPr>
-                      <wps:txbx>
-                        <w:txbxContent>
-                          <w:p>
-                            <w:pPr>
-                              <w:pStyle w:val="Body"/>
-                              <w:spacing w:line="336" w:lineRule="auto"/>
-                              <w:rPr>
-                                <w:outline w:val="0"/>
-                                <w:color w:val="000000"/>
-                                <w:sz w:val="16"/>
-                                <w:szCs w:val="16"/>
-                                <w14:textFill>
-                                  <w14:solidFill>
-                                    <w14:srgbClr w14:val="000000"/>
-                                  </w14:solidFill>
-                                </w14:textFill>
-                              </w:rPr>
-                            </w:pPr>
-                            <w:r>
-                              <w:rPr>
-                                <w:outline w:val="0"/>
-                                <w:color w:val="000000"/>
-                                <w:sz w:val="16"/>
-                                <w:szCs w:val="16"/>
-                                <w:rtl w:val="0"/>
-                                <w:lang w:val="en-US"/>
-                                <w14:textFill>
-                                  <w14:solidFill>
-                                    <w14:srgbClr w14:val="000000"/>
-                                  </w14:solidFill>
-                                </w14:textFill>
-                              </w:rPr>
-                              <w:t xml:space="preserve">HTML, CSS, </w:t>
-                            </w:r>
-                            <w:r>
-                              <w:rPr>
-                                <w:outline w:val="0"/>
-                                <w:color w:val="000000"/>
-                                <w:sz w:val="16"/>
-                                <w:szCs w:val="16"/>
-                                <w:rtl w:val="0"/>
-                                <w14:textFill>
-                                  <w14:solidFill>
-                                    <w14:srgbClr w14:val="000000"/>
-                                  </w14:solidFill>
-                                </w14:textFill>
-                              </w:rPr>
-                              <w:t>JS</w:t>
-                            </w:r>
-                            <w:r>
-                              <w:rPr>
-                                <w:outline w:val="0"/>
-                                <w:color w:val="000000"/>
-                                <w:sz w:val="16"/>
-                                <w:szCs w:val="16"/>
-                                <w:rtl w:val="0"/>
-                                <w:lang w:val="en-US"/>
-                                <w14:textFill>
-                                  <w14:solidFill>
-                                    <w14:srgbClr w14:val="000000"/>
-                                  </w14:solidFill>
-                                </w14:textFill>
-                              </w:rPr>
-                              <w:t xml:space="preserve">, </w:t>
-                            </w:r>
-                            <w:r>
-                              <w:rPr>
-                                <w:outline w:val="0"/>
-                                <w:color w:val="000000"/>
-                                <w:sz w:val="16"/>
-                                <w:szCs w:val="16"/>
-                                <w:rtl w:val="0"/>
-                                <w:lang w:val="en-US"/>
-                                <w14:textFill>
-                                  <w14:solidFill>
-                                    <w14:srgbClr w14:val="000000"/>
-                                  </w14:solidFill>
-                                </w14:textFill>
-                              </w:rPr>
-                              <w:t>TypeScript</w:t>
-                            </w:r>
-                            <w:r>
-                              <w:rPr>
-                                <w:outline w:val="0"/>
-                                <w:color w:val="000000"/>
-                                <w:sz w:val="16"/>
-                                <w:szCs w:val="16"/>
-                                <w:rtl w:val="0"/>
-                                <w:lang w:val="en-US"/>
-                                <w14:textFill>
-                                  <w14:solidFill>
-                                    <w14:srgbClr w14:val="000000"/>
-                                  </w14:solidFill>
-                                </w14:textFill>
-                              </w:rPr>
-                              <w:t>, Sass, Less, React, Redux, Next.js, Angular, Bootstrap, Tailwind, Material UI</w:t>
-                            </w:r>
-                          </w:p>
-                          <w:p>
-                            <w:pPr>
-                              <w:pStyle w:val="Body"/>
-                              <w:spacing w:line="336" w:lineRule="auto"/>
-                              <w:rPr>
-                                <w:outline w:val="0"/>
-                                <w:color w:val="000000"/>
-                                <w:sz w:val="16"/>
-                                <w:szCs w:val="16"/>
-                                <w14:textFill>
-                                  <w14:solidFill>
-                                    <w14:srgbClr w14:val="000000"/>
-                                  </w14:solidFill>
-                                </w14:textFill>
-                              </w:rPr>
-                            </w:pPr>
-                            <w:r>
-                              <w:rPr>
-                                <w:outline w:val="0"/>
-                                <w:color w:val="000000"/>
-                                <w:sz w:val="16"/>
-                                <w:szCs w:val="16"/>
-                                <w:rtl w:val="0"/>
-                                <w:lang w:val="en-US"/>
-                                <w14:textFill>
-                                  <w14:solidFill>
-                                    <w14:srgbClr w14:val="000000"/>
-                                  </w14:solidFill>
-                                </w14:textFill>
-                              </w:rPr>
-                              <w:t xml:space="preserve">Git/Github, Jira/Agile, Azure, Bitbucket, Storybook, Docker, </w:t>
-                            </w:r>
-                            <w:r>
-                              <w:rPr>
-                                <w:outline w:val="0"/>
-                                <w:color w:val="000000"/>
-                                <w:sz w:val="16"/>
-                                <w:szCs w:val="16"/>
-                                <w:rtl w:val="0"/>
-                                <w:lang w:val="en-US"/>
-                                <w14:textFill>
-                                  <w14:solidFill>
-                                    <w14:srgbClr w14:val="000000"/>
-                                  </w14:solidFill>
-                                </w14:textFill>
-                              </w:rPr>
-                              <w:t>Figma, Sketch</w:t>
-                            </w:r>
-                            <w:r>
-                              <w:rPr>
-                                <w:outline w:val="0"/>
-                                <w:color w:val="000000"/>
-                                <w:sz w:val="16"/>
-                                <w:szCs w:val="16"/>
-                                <w:rtl w:val="0"/>
-                                <w:lang w:val="en-US"/>
-                                <w14:textFill>
-                                  <w14:solidFill>
-                                    <w14:srgbClr w14:val="000000"/>
-                                  </w14:solidFill>
-                                </w14:textFill>
-                              </w:rPr>
-                              <w:t>, Adobe Photoshop, Illustrator, AEM</w:t>
-                            </w:r>
-                          </w:p>
-                          <w:p>
-                            <w:pPr>
-                              <w:pStyle w:val="Body"/>
-                              <w:spacing w:line="336" w:lineRule="auto"/>
-                            </w:pPr>
-                            <w:r>
-                              <w:rPr>
-                                <w:outline w:val="0"/>
-                                <w:color w:val="000000"/>
-                                <w:sz w:val="16"/>
-                                <w:szCs w:val="16"/>
-                                <w:rtl w:val="0"/>
-                                <w:lang w:val="en-US"/>
-                                <w14:textFill>
-                                  <w14:solidFill>
-                                    <w14:srgbClr w14:val="000000"/>
-                                  </w14:solidFill>
-                                </w14:textFill>
-                              </w:rPr>
-                              <w:t xml:space="preserve">RxJS, Redux, Postman, Wordpress, Salesforce, </w:t>
-                            </w:r>
-                            <w:r>
-                              <w:rPr>
-                                <w:outline w:val="0"/>
-                                <w:color w:val="000000"/>
-                                <w:sz w:val="16"/>
-                                <w:szCs w:val="16"/>
-                                <w:rtl w:val="0"/>
-                                <w14:textFill>
-                                  <w14:solidFill>
-                                    <w14:srgbClr w14:val="000000"/>
-                                  </w14:solidFill>
-                                </w14:textFill>
-                              </w:rPr>
-                              <w:t>Node.js</w:t>
-                            </w:r>
-                            <w:r>
-                              <w:rPr>
-                                <w:outline w:val="0"/>
-                                <w:color w:val="000000"/>
-                                <w:sz w:val="16"/>
-                                <w:szCs w:val="16"/>
-                                <w:rtl w:val="0"/>
-                                <w:lang w:val="en-US"/>
-                                <w14:textFill>
-                                  <w14:solidFill>
-                                    <w14:srgbClr w14:val="000000"/>
-                                  </w14:solidFill>
-                                </w14:textFill>
-                              </w:rPr>
-                              <w:t>, Gulp.js, Emergence.js, Animate.css, Slick.js, Swiper.js</w:t>
-                            </w:r>
-                          </w:p>
-                        </w:txbxContent>
-                      </wps:txbx>
-                      <wps:bodyPr wrap="square" lIns="0" tIns="0" rIns="0" bIns="0" numCol="1" anchor="t">
-                        <a:noAutofit/>
-                      </wps:bodyPr>
-                    </wps:wsp>
-                  </a:graphicData>
-                </a:graphic>
-              </wp:anchor>
-            </w:drawing>
-          </mc:Choice>
-          <mc:Fallback>
-            <w:pict>
-              <v:shape id="_x0000_s1030" type="#_x0000_t202" style="visibility:visible;position:absolute;margin-left:135.6pt;margin-top:329.9pt;width:412.0pt;height:48.9pt;z-index:251661312;mso-position-horizontal:absolute;mso-position-horizontal-relative:margin;mso-position-vertical:absolute;mso-position-vertical-relative:line;mso-wrap-distance-left:12.0pt;mso-wrap-distance-top:12.0pt;mso-wrap-distance-right:12.0pt;mso-wrap-distance-bottom:12.0pt;">
-                <v:fill on="f"/>
-                <v:stroke on="f" weight="1.0pt" dashstyle="solid" endcap="flat" miterlimit="400.0%" joinstyle="miter" linestyle="single" startarrow="none" startarrowwidth="medium" startarrowlength="medium" endarrow="none" endarrowwidth="medium" endarrowlength="medium"/>
-                <v:textbox>
-                  <w:txbxContent>
-                    <w:p>
-                      <w:pPr>
-                        <w:pStyle w:val="Body"/>
-                        <w:spacing w:line="336" w:lineRule="auto"/>
-                        <w:rPr>
-                          <w:outline w:val="0"/>
-                          <w:color w:val="000000"/>
-                          <w:sz w:val="16"/>
-                          <w:szCs w:val="16"/>
-                          <w14:textFill>
-                            <w14:solidFill>
-                              <w14:srgbClr w14:val="000000"/>
-                            </w14:solidFill>
-                          </w14:textFill>
-                        </w:rPr>
-                      </w:pPr>
-                      <w:r>
-                        <w:rPr>
-                          <w:outline w:val="0"/>
-                          <w:color w:val="000000"/>
-                          <w:sz w:val="16"/>
-                          <w:szCs w:val="16"/>
-                          <w:rtl w:val="0"/>
-                          <w:lang w:val="en-US"/>
-                          <w14:textFill>
-                            <w14:solidFill>
-                              <w14:srgbClr w14:val="000000"/>
-                            </w14:solidFill>
-                          </w14:textFill>
-                        </w:rPr>
-                        <w:t xml:space="preserve">HTML, CSS, </w:t>
-                      </w:r>
-                      <w:r>
-                        <w:rPr>
-                          <w:outline w:val="0"/>
-                          <w:color w:val="000000"/>
-                          <w:sz w:val="16"/>
-                          <w:szCs w:val="16"/>
-                          <w:rtl w:val="0"/>
-                          <w14:textFill>
-                            <w14:solidFill>
-                              <w14:srgbClr w14:val="000000"/>
-                            </w14:solidFill>
-                          </w14:textFill>
-                        </w:rPr>
-                        <w:t>JS</w:t>
-                      </w:r>
-                      <w:r>
-                        <w:rPr>
-                          <w:outline w:val="0"/>
-                          <w:color w:val="000000"/>
-                          <w:sz w:val="16"/>
-                          <w:szCs w:val="16"/>
-                          <w:rtl w:val="0"/>
-                          <w:lang w:val="en-US"/>
-                          <w14:textFill>
-                            <w14:solidFill>
-                              <w14:srgbClr w14:val="000000"/>
-                            </w14:solidFill>
-                          </w14:textFill>
-                        </w:rPr>
-                        <w:t xml:space="preserve">, </w:t>
-                      </w:r>
-                      <w:r>
-                        <w:rPr>
-                          <w:outline w:val="0"/>
-                          <w:color w:val="000000"/>
-                          <w:sz w:val="16"/>
-                          <w:szCs w:val="16"/>
-                          <w:rtl w:val="0"/>
-                          <w:lang w:val="en-US"/>
-                          <w14:textFill>
-                            <w14:solidFill>
-                              <w14:srgbClr w14:val="000000"/>
-                            </w14:solidFill>
-                          </w14:textFill>
-                        </w:rPr>
-                        <w:t>TypeScript</w:t>
-                      </w:r>
-                      <w:r>
-                        <w:rPr>
-                          <w:outline w:val="0"/>
-                          <w:color w:val="000000"/>
-                          <w:sz w:val="16"/>
-                          <w:szCs w:val="16"/>
-                          <w:rtl w:val="0"/>
-                          <w:lang w:val="en-US"/>
-                          <w14:textFill>
-                            <w14:solidFill>
-                              <w14:srgbClr w14:val="000000"/>
-                            </w14:solidFill>
-                          </w14:textFill>
-                        </w:rPr>
-                        <w:t>, Sass, Less, React, Redux, Next.js, Angular, Bootstrap, Tailwind, Material UI</w:t>
-                      </w:r>
-                    </w:p>
-                    <w:p>
-                      <w:pPr>
-                        <w:pStyle w:val="Body"/>
-                        <w:spacing w:line="336" w:lineRule="auto"/>
-                        <w:rPr>
-                          <w:outline w:val="0"/>
-                          <w:color w:val="000000"/>
-                          <w:sz w:val="16"/>
-                          <w:szCs w:val="16"/>
-                          <w14:textFill>
-                            <w14:solidFill>
-                              <w14:srgbClr w14:val="000000"/>
-                            </w14:solidFill>
-                          </w14:textFill>
-                        </w:rPr>
-                      </w:pPr>
-                      <w:r>
-                        <w:rPr>
-                          <w:outline w:val="0"/>
-                          <w:color w:val="000000"/>
-                          <w:sz w:val="16"/>
-                          <w:szCs w:val="16"/>
-                          <w:rtl w:val="0"/>
-                          <w:lang w:val="en-US"/>
-                          <w14:textFill>
-                            <w14:solidFill>
-                              <w14:srgbClr w14:val="000000"/>
-                            </w14:solidFill>
-                          </w14:textFill>
-                        </w:rPr>
-                        <w:t xml:space="preserve">Git/Github, Jira/Agile, Azure, Bitbucket, Storybook, Docker, </w:t>
-                      </w:r>
-                      <w:r>
-                        <w:rPr>
-                          <w:outline w:val="0"/>
-                          <w:color w:val="000000"/>
-                          <w:sz w:val="16"/>
-                          <w:szCs w:val="16"/>
-                          <w:rtl w:val="0"/>
-                          <w:lang w:val="en-US"/>
-                          <w14:textFill>
-                            <w14:solidFill>
-                              <w14:srgbClr w14:val="000000"/>
-                            </w14:solidFill>
-                          </w14:textFill>
-                        </w:rPr>
-                        <w:t>Figma, Sketch</w:t>
-                      </w:r>
-                      <w:r>
-                        <w:rPr>
-                          <w:outline w:val="0"/>
-                          <w:color w:val="000000"/>
-                          <w:sz w:val="16"/>
-                          <w:szCs w:val="16"/>
-                          <w:rtl w:val="0"/>
-                          <w:lang w:val="en-US"/>
-                          <w14:textFill>
-                            <w14:solidFill>
-                              <w14:srgbClr w14:val="000000"/>
-                            </w14:solidFill>
-                          </w14:textFill>
-                        </w:rPr>
-                        <w:t>, Adobe Photoshop, Illustrator, AEM</w:t>
-                      </w:r>
-                    </w:p>
-                    <w:p>
-                      <w:pPr>
-                        <w:pStyle w:val="Body"/>
-                        <w:spacing w:line="336" w:lineRule="auto"/>
-                      </w:pPr>
-                      <w:r>
-                        <w:rPr>
-                          <w:outline w:val="0"/>
-                          <w:color w:val="000000"/>
-                          <w:sz w:val="16"/>
-                          <w:szCs w:val="16"/>
-                          <w:rtl w:val="0"/>
-                          <w:lang w:val="en-US"/>
-                          <w14:textFill>
-                            <w14:solidFill>
-                              <w14:srgbClr w14:val="000000"/>
-                            </w14:solidFill>
-                          </w14:textFill>
-                        </w:rPr>
-                        <w:t xml:space="preserve">RxJS, Redux, Postman, Wordpress, Salesforce, </w:t>
-                      </w:r>
-                      <w:r>
-                        <w:rPr>
-                          <w:outline w:val="0"/>
-                          <w:color w:val="000000"/>
-                          <w:sz w:val="16"/>
-                          <w:szCs w:val="16"/>
-                          <w:rtl w:val="0"/>
-                          <w14:textFill>
-                            <w14:solidFill>
-                              <w14:srgbClr w14:val="000000"/>
-                            </w14:solidFill>
-                          </w14:textFill>
-                        </w:rPr>
-                        <w:t>Node.js</w:t>
-                      </w:r>
-                      <w:r>
-                        <w:rPr>
-                          <w:outline w:val="0"/>
-                          <w:color w:val="000000"/>
-                          <w:sz w:val="16"/>
-                          <w:szCs w:val="16"/>
-                          <w:rtl w:val="0"/>
-                          <w:lang w:val="en-US"/>
-                          <w14:textFill>
-                            <w14:solidFill>
-                              <w14:srgbClr w14:val="000000"/>
-                            </w14:solidFill>
-                          </w14:textFill>
-                        </w:rPr>
-                        <w:t>, Gulp.js, Emergence.js, Animate.css, Slick.js, Swiper.js</w:t>
-                      </w:r>
-                    </w:p>
-                  </w:txbxContent>
-                </v:textbox>
-                <w10:wrap type="through" side="bothSides" anchorx="margin"/>
-              </v:shape>
-            </w:pict>
-          </mc:Fallback>
-        </mc:AlternateContent>
-      </w:r>
-      <w:r>
-        <mc:AlternateContent>
-          <mc:Choice Requires="wps">
-            <w:drawing xmlns:a="http://schemas.openxmlformats.org/drawingml/2006/main">
-              <wp:anchor distT="152400" distB="152400" distL="152400" distR="152400" simplePos="0" relativeHeight="251660288" behindDoc="0" locked="0" layoutInCell="1" allowOverlap="1">
-                <wp:simplePos x="0" y="0"/>
-                <wp:positionH relativeFrom="margin">
-                  <wp:posOffset>-6349</wp:posOffset>
-                </wp:positionH>
-                <wp:positionV relativeFrom="line">
-                  <wp:posOffset>4189743</wp:posOffset>
-                </wp:positionV>
-                <wp:extent cx="1728317" cy="621308"/>
-                <wp:effectExtent l="0" t="0" r="0" b="0"/>
-                <wp:wrapThrough wrapText="bothSides" distL="152400" distR="152400">
-                  <wp:wrapPolygon edited="1">
-                    <wp:start x="0" y="0"/>
-                    <wp:lineTo x="21600" y="0"/>
-                    <wp:lineTo x="21600" y="21600"/>
-                    <wp:lineTo x="0" y="21600"/>
-                    <wp:lineTo x="0" y="0"/>
-                  </wp:wrapPolygon>
-                </wp:wrapThrough>
-                <wp:docPr id="1073741830" name="officeArt object" descr="LANGUAGES &amp; FRAMEWORKS…"/>
-                <wp:cNvGraphicFramePr/>
-                <a:graphic xmlns:a="http://schemas.openxmlformats.org/drawingml/2006/main">
-                  <a:graphicData uri="http://schemas.microsoft.com/office/word/2010/wordprocessingShape">
-                    <wps:wsp>
-                      <wps:cNvSpPr txBox="1"/>
-                      <wps:spPr>
-                        <a:xfrm>
-                          <a:off x="0" y="0"/>
-                          <a:ext cx="1728317" cy="621308"/>
-                        </a:xfrm>
-                        <a:prstGeom prst="rect">
-                          <a:avLst/>
-                        </a:prstGeom>
-                        <a:noFill/>
-                        <a:ln w="12700" cap="flat">
-                          <a:noFill/>
-                          <a:miter lim="400000"/>
-                        </a:ln>
-                        <a:effectLst/>
-                        <a:extLst>
-                          <a:ext uri="{C572A759-6A51-4108-AA02-DFA0A04FC94B}">
-                            <ma14:wrappingTextBoxFlag xmlns:ma14="http://schemas.microsoft.com/office/mac/drawingml/2011/main" val="1"/>
-                          </a:ext>
-                        </a:extLst>
-                      </wps:spPr>
-                      <wps:txbx>
-                        <w:txbxContent>
-                          <w:p>
-                            <w:pPr>
-                              <w:pStyle w:val="Body"/>
-                              <w:spacing w:line="336" w:lineRule="auto"/>
-                              <w:rPr>
-                                <w:rFonts w:ascii="Helvetica Neue Medium" w:cs="Helvetica Neue Medium" w:hAnsi="Helvetica Neue Medium" w:eastAsia="Helvetica Neue Medium"/>
-                                <w:outline w:val="0"/>
-                                <w:color w:val="000000"/>
-                                <w:sz w:val="16"/>
-                                <w:szCs w:val="16"/>
-                                <w14:textFill>
-                                  <w14:solidFill>
-                                    <w14:srgbClr w14:val="000000"/>
-                                  </w14:solidFill>
-                                </w14:textFill>
-                              </w:rPr>
-                            </w:pPr>
-                            <w:r>
-                              <w:rPr>
-                                <w:rFonts w:ascii="Helvetica Neue Medium" w:hAnsi="Helvetica Neue Medium"/>
-                                <w:outline w:val="0"/>
-                                <w:color w:val="000000"/>
-                                <w:sz w:val="16"/>
-                                <w:szCs w:val="16"/>
-                                <w:rtl w:val="0"/>
-                                <w:lang w:val="en-US"/>
-                                <w14:textFill>
-                                  <w14:solidFill>
-                                    <w14:srgbClr w14:val="000000"/>
-                                  </w14:solidFill>
-                                </w14:textFill>
-                              </w:rPr>
-                              <w:t>LANGUAGES &amp; FRAMEWORKS</w:t>
-                            </w:r>
-                          </w:p>
-                          <w:p>
-                            <w:pPr>
-                              <w:pStyle w:val="Body"/>
-                              <w:spacing w:line="336" w:lineRule="auto"/>
-                              <w:rPr>
-                                <w:rFonts w:ascii="Helvetica Neue Medium" w:cs="Helvetica Neue Medium" w:hAnsi="Helvetica Neue Medium" w:eastAsia="Helvetica Neue Medium"/>
-                                <w:outline w:val="0"/>
-                                <w:color w:val="000000"/>
-                                <w:sz w:val="16"/>
-                                <w:szCs w:val="16"/>
-                                <w14:textFill>
-                                  <w14:solidFill>
-                                    <w14:srgbClr w14:val="000000"/>
-                                  </w14:solidFill>
-                                </w14:textFill>
-                              </w:rPr>
-                            </w:pPr>
-                            <w:r>
-                              <w:rPr>
-                                <w:rFonts w:ascii="Helvetica Neue Medium" w:hAnsi="Helvetica Neue Medium"/>
-                                <w:outline w:val="0"/>
-                                <w:color w:val="000000"/>
-                                <w:sz w:val="16"/>
-                                <w:szCs w:val="16"/>
-                                <w:rtl w:val="0"/>
-                                <w:lang w:val="en-US"/>
-                                <w14:textFill>
-                                  <w14:solidFill>
-                                    <w14:srgbClr w14:val="000000"/>
-                                  </w14:solidFill>
-                                </w14:textFill>
-                              </w:rPr>
-                              <w:t>SOFTWARE</w:t>
-                            </w:r>
-                          </w:p>
-                          <w:p>
-                            <w:pPr>
-                              <w:pStyle w:val="Body"/>
-                              <w:spacing w:line="336" w:lineRule="auto"/>
-                            </w:pPr>
-                            <w:r>
-                              <w:rPr>
-                                <w:rFonts w:ascii="Helvetica Neue Medium" w:hAnsi="Helvetica Neue Medium"/>
-                                <w:outline w:val="0"/>
-                                <w:color w:val="000000"/>
-                                <w:sz w:val="16"/>
-                                <w:szCs w:val="16"/>
-                                <w:rtl w:val="0"/>
-                                <w:lang w:val="en-US"/>
-                                <w14:textFill>
-                                  <w14:solidFill>
-                                    <w14:srgbClr w14:val="000000"/>
-                                  </w14:solidFill>
-                                </w14:textFill>
-                              </w:rPr>
-                              <w:t>LIBRARIES &amp; MISC.</w:t>
-                            </w:r>
-                          </w:p>
-                        </w:txbxContent>
-                      </wps:txbx>
-                      <wps:bodyPr wrap="square" lIns="0" tIns="0" rIns="0" bIns="0" numCol="1" anchor="t">
-                        <a:noAutofit/>
-                      </wps:bodyPr>
-                    </wps:wsp>
-                  </a:graphicData>
-                </a:graphic>
-              </wp:anchor>
-            </w:drawing>
-          </mc:Choice>
-          <mc:Fallback>
-            <w:pict>
-              <v:shape id="_x0000_s1031" type="#_x0000_t202" style="visibility:visible;position:absolute;margin-left:-0.5pt;margin-top:329.9pt;width:136.1pt;height:48.9pt;z-index:251660288;mso-position-horizontal:absolute;mso-position-horizontal-relative:margin;mso-position-vertical:absolute;mso-position-vertical-relative:line;mso-wrap-distance-left:12.0pt;mso-wrap-distance-top:12.0pt;mso-wrap-distance-right:12.0pt;mso-wrap-distance-bottom:12.0pt;">
-                <v:fill on="f"/>
-                <v:stroke on="f" weight="1.0pt" dashstyle="solid" endcap="flat" miterlimit="400.0%" joinstyle="miter" linestyle="single" startarrow="none" startarrowwidth="medium" startarrowlength="medium" endarrow="none" endarrowwidth="medium" endarrowlength="medium"/>
-                <v:textbox>
-                  <w:txbxContent>
-                    <w:p>
-                      <w:pPr>
-                        <w:pStyle w:val="Body"/>
-                        <w:spacing w:line="336" w:lineRule="auto"/>
-                        <w:rPr>
-                          <w:rFonts w:ascii="Helvetica Neue Medium" w:cs="Helvetica Neue Medium" w:hAnsi="Helvetica Neue Medium" w:eastAsia="Helvetica Neue Medium"/>
-                          <w:outline w:val="0"/>
-                          <w:color w:val="000000"/>
-                          <w:sz w:val="16"/>
-                          <w:szCs w:val="16"/>
-                          <w14:textFill>
-                            <w14:solidFill>
-                              <w14:srgbClr w14:val="000000"/>
-                            </w14:solidFill>
-                          </w14:textFill>
-                        </w:rPr>
-                      </w:pPr>
-                      <w:r>
-                        <w:rPr>
-                          <w:rFonts w:ascii="Helvetica Neue Medium" w:hAnsi="Helvetica Neue Medium"/>
-                          <w:outline w:val="0"/>
-                          <w:color w:val="000000"/>
-                          <w:sz w:val="16"/>
-                          <w:szCs w:val="16"/>
-                          <w:rtl w:val="0"/>
-                          <w:lang w:val="en-US"/>
-                          <w14:textFill>
-                            <w14:solidFill>
-                              <w14:srgbClr w14:val="000000"/>
-                            </w14:solidFill>
-                          </w14:textFill>
-                        </w:rPr>
-                        <w:t>LANGUAGES &amp; FRAMEWORKS</w:t>
-                      </w:r>
-                    </w:p>
-                    <w:p>
-                      <w:pPr>
-                        <w:pStyle w:val="Body"/>
-                        <w:spacing w:line="336" w:lineRule="auto"/>
-                        <w:rPr>
-                          <w:rFonts w:ascii="Helvetica Neue Medium" w:cs="Helvetica Neue Medium" w:hAnsi="Helvetica Neue Medium" w:eastAsia="Helvetica Neue Medium"/>
-                          <w:outline w:val="0"/>
-                          <w:color w:val="000000"/>
-                          <w:sz w:val="16"/>
-                          <w:szCs w:val="16"/>
-                          <w14:textFill>
-                            <w14:solidFill>
-                              <w14:srgbClr w14:val="000000"/>
-                            </w14:solidFill>
-                          </w14:textFill>
-                        </w:rPr>
-                      </w:pPr>
-                      <w:r>
-                        <w:rPr>
-                          <w:rFonts w:ascii="Helvetica Neue Medium" w:hAnsi="Helvetica Neue Medium"/>
-                          <w:outline w:val="0"/>
-                          <w:color w:val="000000"/>
-                          <w:sz w:val="16"/>
-                          <w:szCs w:val="16"/>
-                          <w:rtl w:val="0"/>
-                          <w:lang w:val="en-US"/>
-                          <w14:textFill>
-                            <w14:solidFill>
-                              <w14:srgbClr w14:val="000000"/>
-                            </w14:solidFill>
-                          </w14:textFill>
-                        </w:rPr>
-                        <w:t>SOFTWARE</w:t>
-                      </w:r>
-                    </w:p>
-                    <w:p>
-                      <w:pPr>
-                        <w:pStyle w:val="Body"/>
-                        <w:spacing w:line="336" w:lineRule="auto"/>
-                      </w:pPr>
-                      <w:r>
-                        <w:rPr>
-                          <w:rFonts w:ascii="Helvetica Neue Medium" w:hAnsi="Helvetica Neue Medium"/>
-                          <w:outline w:val="0"/>
-                          <w:color w:val="000000"/>
-                          <w:sz w:val="16"/>
-                          <w:szCs w:val="16"/>
-                          <w:rtl w:val="0"/>
-                          <w:lang w:val="en-US"/>
-                          <w14:textFill>
-                            <w14:solidFill>
-                              <w14:srgbClr w14:val="000000"/>
-                            </w14:solidFill>
-                          </w14:textFill>
-                        </w:rPr>
-                        <w:t>LIBRARIES &amp; MISC.</w:t>
-                      </w:r>
-                    </w:p>
-                  </w:txbxContent>
-                </v:textbox>
-                <w10:wrap type="through" side="bothSides" anchorx="margin"/>
-              </v:shape>
-            </w:pict>
-          </mc:Fallback>
-        </mc:AlternateContent>
-      </w:r>
-      <w:r>
-        <mc:AlternateContent>
-          <mc:Choice Requires="wps">
-            <w:drawing xmlns:a="http://schemas.openxmlformats.org/drawingml/2006/main">
               <wp:anchor distT="0" distB="0" distL="0" distR="0" simplePos="0" relativeHeight="251670528" behindDoc="0" locked="0" layoutInCell="1" allowOverlap="1">
                 <wp:simplePos x="0" y="0"/>
                 <wp:positionH relativeFrom="margin">
@@ -1014,7 +80,7 @@
                 <wp:extent cx="6858000" cy="415156"/>
                 <wp:effectExtent l="0" t="0" r="0" b="0"/>
                 <wp:wrapTopAndBottom distT="0" distB="0"/>
-                <wp:docPr id="1073741831" name="officeArt object" descr="Software Engineer from [STATE] with background in [FOCUS]. Over XX years experience designing and building accessible, user-centered web apps. Nullam quis risus eget urna mollis ornare vel eu leo. Fusce dapibus, tellus ac cursus commodo, tortor mauris condimentum sit amet risus. Integer posuere erat a ante venenatis dapibus posuere velit aliquet. Nullam quis risus eget urna mollis ornare vel eu leo."/>
+                <wp:docPr id="1073741826" name="officeArt object" descr="Software Engineer from [STATE] with background in [FOCUS]. Over XX years experience designing and building accessible, user-centered web apps. Nullam quis risus eget urna mollis ornare vel eu leo. Fusce dapibus, tellus ac cursus commodo, tortor mauris condimentum sit amet risus. Integer posuere erat a ante venenatis dapibus posuere velit aliquet. Nullam quis risus eget urna mollis ornare vel eu leo."/>
                 <wp:cNvGraphicFramePr/>
                 <a:graphic xmlns:a="http://schemas.openxmlformats.org/drawingml/2006/main">
                   <a:graphicData uri="http://schemas.microsoft.com/office/word/2010/wordprocessingShape">
@@ -1167,7 +233,7 @@
           </mc:Choice>
           <mc:Fallback>
             <w:pict>
-              <v:shape id="_x0000_s1032" type="#_x0000_t202" style="visibility:visible;position:absolute;margin-left:-0.5pt;margin-top:27.2pt;width:540.0pt;height:32.7pt;z-index:251670528;mso-position-horizontal:absolute;mso-position-horizontal-relative:margin;mso-position-vertical:absolute;mso-position-vertical-relative:line;mso-wrap-distance-left:0.0pt;mso-wrap-distance-top:0.0pt;mso-wrap-distance-right:0.0pt;mso-wrap-distance-bottom:0.0pt;">
+              <v:shape id="_x0000_s1027" type="#_x0000_t202" style="visibility:visible;position:absolute;margin-left:-0.5pt;margin-top:27.2pt;width:540.0pt;height:32.7pt;z-index:251670528;mso-position-horizontal:absolute;mso-position-horizontal-relative:margin;mso-position-vertical:absolute;mso-position-vertical-relative:line;mso-wrap-distance-left:0.0pt;mso-wrap-distance-top:0.0pt;mso-wrap-distance-right:0.0pt;mso-wrap-distance-bottom:0.0pt;">
                 <v:fill on="f"/>
                 <v:stroke on="f" weight="1.0pt" dashstyle="solid" endcap="flat" miterlimit="400.0%" joinstyle="miter" linestyle="single" startarrow="none" startarrowwidth="medium" startarrowlength="medium" endarrow="none" endarrowwidth="medium" endarrowlength="medium"/>
                 <v:textbox>
@@ -1301,18 +367,518 @@
         <mc:AlternateContent>
           <mc:Choice Requires="wps">
             <w:drawing xmlns:a="http://schemas.openxmlformats.org/drawingml/2006/main">
-              <wp:anchor distT="0" distB="0" distL="0" distR="0" simplePos="0" relativeHeight="251672576" behindDoc="0" locked="0" layoutInCell="1" allowOverlap="1">
+              <wp:anchor distT="152400" distB="152400" distL="152400" distR="152400" simplePos="0" relativeHeight="251661312" behindDoc="0" locked="0" layoutInCell="1" allowOverlap="1">
+                <wp:simplePos x="0" y="0"/>
+                <wp:positionH relativeFrom="margin">
+                  <wp:posOffset>1721966</wp:posOffset>
+                </wp:positionH>
+                <wp:positionV relativeFrom="line">
+                  <wp:posOffset>4171996</wp:posOffset>
+                </wp:positionV>
+                <wp:extent cx="5232574" cy="621308"/>
+                <wp:effectExtent l="0" t="0" r="0" b="0"/>
+                <wp:wrapThrough wrapText="bothSides" distL="152400" distR="152400">
+                  <wp:wrapPolygon edited="1">
+                    <wp:start x="0" y="0"/>
+                    <wp:lineTo x="21600" y="0"/>
+                    <wp:lineTo x="21600" y="21600"/>
+                    <wp:lineTo x="0" y="21600"/>
+                    <wp:lineTo x="0" y="0"/>
+                  </wp:wrapPolygon>
+                </wp:wrapThrough>
+                <wp:docPr id="1073741827" name="officeArt object" descr="HTML, CSS, JS, TypeScript, Sass, Less, React, Redux, Next.js, Angular, Bootstrap, Tailwind, Material UI…"/>
+                <wp:cNvGraphicFramePr/>
+                <a:graphic xmlns:a="http://schemas.openxmlformats.org/drawingml/2006/main">
+                  <a:graphicData uri="http://schemas.microsoft.com/office/word/2010/wordprocessingShape">
+                    <wps:wsp>
+                      <wps:cNvSpPr txBox="1"/>
+                      <wps:spPr>
+                        <a:xfrm>
+                          <a:off x="0" y="0"/>
+                          <a:ext cx="5232574" cy="621308"/>
+                        </a:xfrm>
+                        <a:prstGeom prst="rect">
+                          <a:avLst/>
+                        </a:prstGeom>
+                        <a:noFill/>
+                        <a:ln w="12700" cap="flat">
+                          <a:noFill/>
+                          <a:miter lim="400000"/>
+                        </a:ln>
+                        <a:effectLst/>
+                      </wps:spPr>
+                      <wps:txbx>
+                        <w:txbxContent>
+                          <w:p>
+                            <w:pPr>
+                              <w:pStyle w:val="Body"/>
+                              <w:spacing w:line="336" w:lineRule="auto"/>
+                              <w:rPr>
+                                <w:outline w:val="0"/>
+                                <w:color w:val="000000"/>
+                                <w:sz w:val="16"/>
+                                <w:szCs w:val="16"/>
+                                <w14:textFill>
+                                  <w14:solidFill>
+                                    <w14:srgbClr w14:val="000000"/>
+                                  </w14:solidFill>
+                                </w14:textFill>
+                              </w:rPr>
+                            </w:pPr>
+                            <w:r>
+                              <w:rPr>
+                                <w:outline w:val="0"/>
+                                <w:color w:val="000000"/>
+                                <w:sz w:val="16"/>
+                                <w:szCs w:val="16"/>
+                                <w:rtl w:val="0"/>
+                                <w:lang w:val="en-US"/>
+                                <w14:textFill>
+                                  <w14:solidFill>
+                                    <w14:srgbClr w14:val="000000"/>
+                                  </w14:solidFill>
+                                </w14:textFill>
+                              </w:rPr>
+                              <w:t xml:space="preserve">HTML, CSS, </w:t>
+                            </w:r>
+                            <w:r>
+                              <w:rPr>
+                                <w:outline w:val="0"/>
+                                <w:color w:val="000000"/>
+                                <w:sz w:val="16"/>
+                                <w:szCs w:val="16"/>
+                                <w:rtl w:val="0"/>
+                                <w14:textFill>
+                                  <w14:solidFill>
+                                    <w14:srgbClr w14:val="000000"/>
+                                  </w14:solidFill>
+                                </w14:textFill>
+                              </w:rPr>
+                              <w:t>JS</w:t>
+                            </w:r>
+                            <w:r>
+                              <w:rPr>
+                                <w:outline w:val="0"/>
+                                <w:color w:val="000000"/>
+                                <w:sz w:val="16"/>
+                                <w:szCs w:val="16"/>
+                                <w:rtl w:val="0"/>
+                                <w:lang w:val="en-US"/>
+                                <w14:textFill>
+                                  <w14:solidFill>
+                                    <w14:srgbClr w14:val="000000"/>
+                                  </w14:solidFill>
+                                </w14:textFill>
+                              </w:rPr>
+                              <w:t xml:space="preserve">, </w:t>
+                            </w:r>
+                            <w:r>
+                              <w:rPr>
+                                <w:outline w:val="0"/>
+                                <w:color w:val="000000"/>
+                                <w:sz w:val="16"/>
+                                <w:szCs w:val="16"/>
+                                <w:rtl w:val="0"/>
+                                <w:lang w:val="en-US"/>
+                                <w14:textFill>
+                                  <w14:solidFill>
+                                    <w14:srgbClr w14:val="000000"/>
+                                  </w14:solidFill>
+                                </w14:textFill>
+                              </w:rPr>
+                              <w:t>TypeScript</w:t>
+                            </w:r>
+                            <w:r>
+                              <w:rPr>
+                                <w:outline w:val="0"/>
+                                <w:color w:val="000000"/>
+                                <w:sz w:val="16"/>
+                                <w:szCs w:val="16"/>
+                                <w:rtl w:val="0"/>
+                                <w:lang w:val="en-US"/>
+                                <w14:textFill>
+                                  <w14:solidFill>
+                                    <w14:srgbClr w14:val="000000"/>
+                                  </w14:solidFill>
+                                </w14:textFill>
+                              </w:rPr>
+                              <w:t>, Sass, Less, React, Redux, Next.js, Angular, Bootstrap, Tailwind, Material UI</w:t>
+                            </w:r>
+                          </w:p>
+                          <w:p>
+                            <w:pPr>
+                              <w:pStyle w:val="Body"/>
+                              <w:spacing w:line="336" w:lineRule="auto"/>
+                              <w:rPr>
+                                <w:outline w:val="0"/>
+                                <w:color w:val="000000"/>
+                                <w:sz w:val="16"/>
+                                <w:szCs w:val="16"/>
+                                <w14:textFill>
+                                  <w14:solidFill>
+                                    <w14:srgbClr w14:val="000000"/>
+                                  </w14:solidFill>
+                                </w14:textFill>
+                              </w:rPr>
+                            </w:pPr>
+                            <w:r>
+                              <w:rPr>
+                                <w:outline w:val="0"/>
+                                <w:color w:val="000000"/>
+                                <w:sz w:val="16"/>
+                                <w:szCs w:val="16"/>
+                                <w:rtl w:val="0"/>
+                                <w:lang w:val="en-US"/>
+                                <w14:textFill>
+                                  <w14:solidFill>
+                                    <w14:srgbClr w14:val="000000"/>
+                                  </w14:solidFill>
+                                </w14:textFill>
+                              </w:rPr>
+                              <w:t xml:space="preserve">Git/Github, Jira/Agile, Azure, Bitbucket, Storybook, Docker, </w:t>
+                            </w:r>
+                            <w:r>
+                              <w:rPr>
+                                <w:outline w:val="0"/>
+                                <w:color w:val="000000"/>
+                                <w:sz w:val="16"/>
+                                <w:szCs w:val="16"/>
+                                <w:rtl w:val="0"/>
+                                <w:lang w:val="en-US"/>
+                                <w14:textFill>
+                                  <w14:solidFill>
+                                    <w14:srgbClr w14:val="000000"/>
+                                  </w14:solidFill>
+                                </w14:textFill>
+                              </w:rPr>
+                              <w:t>Figma, Sketch</w:t>
+                            </w:r>
+                            <w:r>
+                              <w:rPr>
+                                <w:outline w:val="0"/>
+                                <w:color w:val="000000"/>
+                                <w:sz w:val="16"/>
+                                <w:szCs w:val="16"/>
+                                <w:rtl w:val="0"/>
+                                <w:lang w:val="en-US"/>
+                                <w14:textFill>
+                                  <w14:solidFill>
+                                    <w14:srgbClr w14:val="000000"/>
+                                  </w14:solidFill>
+                                </w14:textFill>
+                              </w:rPr>
+                              <w:t>, Adobe Photoshop, Illustrator, AEM</w:t>
+                            </w:r>
+                          </w:p>
+                          <w:p>
+                            <w:pPr>
+                              <w:pStyle w:val="Body"/>
+                              <w:spacing w:line="336" w:lineRule="auto"/>
+                            </w:pPr>
+                            <w:r>
+                              <w:rPr>
+                                <w:outline w:val="0"/>
+                                <w:color w:val="000000"/>
+                                <w:sz w:val="16"/>
+                                <w:szCs w:val="16"/>
+                                <w:rtl w:val="0"/>
+                                <w:lang w:val="en-US"/>
+                                <w14:textFill>
+                                  <w14:solidFill>
+                                    <w14:srgbClr w14:val="000000"/>
+                                  </w14:solidFill>
+                                </w14:textFill>
+                              </w:rPr>
+                              <w:t xml:space="preserve">RxJS, Redux, Postman, Wordpress, Salesforce, </w:t>
+                            </w:r>
+                            <w:r>
+                              <w:rPr>
+                                <w:outline w:val="0"/>
+                                <w:color w:val="000000"/>
+                                <w:sz w:val="16"/>
+                                <w:szCs w:val="16"/>
+                                <w:rtl w:val="0"/>
+                                <w14:textFill>
+                                  <w14:solidFill>
+                                    <w14:srgbClr w14:val="000000"/>
+                                  </w14:solidFill>
+                                </w14:textFill>
+                              </w:rPr>
+                              <w:t>Node.js</w:t>
+                            </w:r>
+                            <w:r>
+                              <w:rPr>
+                                <w:outline w:val="0"/>
+                                <w:color w:val="000000"/>
+                                <w:sz w:val="16"/>
+                                <w:szCs w:val="16"/>
+                                <w:rtl w:val="0"/>
+                                <w:lang w:val="en-US"/>
+                                <w14:textFill>
+                                  <w14:solidFill>
+                                    <w14:srgbClr w14:val="000000"/>
+                                  </w14:solidFill>
+                                </w14:textFill>
+                              </w:rPr>
+                              <w:t>, Gulp.js, Emergence.js, Animate.css, Slick.js, Swiper.js</w:t>
+                            </w:r>
+                          </w:p>
+                        </w:txbxContent>
+                      </wps:txbx>
+                      <wps:bodyPr wrap="square" lIns="0" tIns="0" rIns="0" bIns="0" numCol="1" anchor="t">
+                        <a:noAutofit/>
+                      </wps:bodyPr>
+                    </wps:wsp>
+                  </a:graphicData>
+                </a:graphic>
+              </wp:anchor>
+            </w:drawing>
+          </mc:Choice>
+          <mc:Fallback>
+            <w:pict>
+              <v:shape id="_x0000_s1028" type="#_x0000_t202" style="visibility:visible;position:absolute;margin-left:135.6pt;margin-top:328.5pt;width:412.0pt;height:48.9pt;z-index:251661312;mso-position-horizontal:absolute;mso-position-horizontal-relative:margin;mso-position-vertical:absolute;mso-position-vertical-relative:line;mso-wrap-distance-left:12.0pt;mso-wrap-distance-top:12.0pt;mso-wrap-distance-right:12.0pt;mso-wrap-distance-bottom:12.0pt;">
+                <v:fill on="f"/>
+                <v:stroke on="f" weight="1.0pt" dashstyle="solid" endcap="flat" miterlimit="400.0%" joinstyle="miter" linestyle="single" startarrow="none" startarrowwidth="medium" startarrowlength="medium" endarrow="none" endarrowwidth="medium" endarrowlength="medium"/>
+                <v:textbox>
+                  <w:txbxContent>
+                    <w:p>
+                      <w:pPr>
+                        <w:pStyle w:val="Body"/>
+                        <w:spacing w:line="336" w:lineRule="auto"/>
+                        <w:rPr>
+                          <w:outline w:val="0"/>
+                          <w:color w:val="000000"/>
+                          <w:sz w:val="16"/>
+                          <w:szCs w:val="16"/>
+                          <w14:textFill>
+                            <w14:solidFill>
+                              <w14:srgbClr w14:val="000000"/>
+                            </w14:solidFill>
+                          </w14:textFill>
+                        </w:rPr>
+                      </w:pPr>
+                      <w:r>
+                        <w:rPr>
+                          <w:outline w:val="0"/>
+                          <w:color w:val="000000"/>
+                          <w:sz w:val="16"/>
+                          <w:szCs w:val="16"/>
+                          <w:rtl w:val="0"/>
+                          <w:lang w:val="en-US"/>
+                          <w14:textFill>
+                            <w14:solidFill>
+                              <w14:srgbClr w14:val="000000"/>
+                            </w14:solidFill>
+                          </w14:textFill>
+                        </w:rPr>
+                        <w:t xml:space="preserve">HTML, CSS, </w:t>
+                      </w:r>
+                      <w:r>
+                        <w:rPr>
+                          <w:outline w:val="0"/>
+                          <w:color w:val="000000"/>
+                          <w:sz w:val="16"/>
+                          <w:szCs w:val="16"/>
+                          <w:rtl w:val="0"/>
+                          <w14:textFill>
+                            <w14:solidFill>
+                              <w14:srgbClr w14:val="000000"/>
+                            </w14:solidFill>
+                          </w14:textFill>
+                        </w:rPr>
+                        <w:t>JS</w:t>
+                      </w:r>
+                      <w:r>
+                        <w:rPr>
+                          <w:outline w:val="0"/>
+                          <w:color w:val="000000"/>
+                          <w:sz w:val="16"/>
+                          <w:szCs w:val="16"/>
+                          <w:rtl w:val="0"/>
+                          <w:lang w:val="en-US"/>
+                          <w14:textFill>
+                            <w14:solidFill>
+                              <w14:srgbClr w14:val="000000"/>
+                            </w14:solidFill>
+                          </w14:textFill>
+                        </w:rPr>
+                        <w:t xml:space="preserve">, </w:t>
+                      </w:r>
+                      <w:r>
+                        <w:rPr>
+                          <w:outline w:val="0"/>
+                          <w:color w:val="000000"/>
+                          <w:sz w:val="16"/>
+                          <w:szCs w:val="16"/>
+                          <w:rtl w:val="0"/>
+                          <w:lang w:val="en-US"/>
+                          <w14:textFill>
+                            <w14:solidFill>
+                              <w14:srgbClr w14:val="000000"/>
+                            </w14:solidFill>
+                          </w14:textFill>
+                        </w:rPr>
+                        <w:t>TypeScript</w:t>
+                      </w:r>
+                      <w:r>
+                        <w:rPr>
+                          <w:outline w:val="0"/>
+                          <w:color w:val="000000"/>
+                          <w:sz w:val="16"/>
+                          <w:szCs w:val="16"/>
+                          <w:rtl w:val="0"/>
+                          <w:lang w:val="en-US"/>
+                          <w14:textFill>
+                            <w14:solidFill>
+                              <w14:srgbClr w14:val="000000"/>
+                            </w14:solidFill>
+                          </w14:textFill>
+                        </w:rPr>
+                        <w:t>, Sass, Less, React, Redux, Next.js, Angular, Bootstrap, Tailwind, Material UI</w:t>
+                      </w:r>
+                    </w:p>
+                    <w:p>
+                      <w:pPr>
+                        <w:pStyle w:val="Body"/>
+                        <w:spacing w:line="336" w:lineRule="auto"/>
+                        <w:rPr>
+                          <w:outline w:val="0"/>
+                          <w:color w:val="000000"/>
+                          <w:sz w:val="16"/>
+                          <w:szCs w:val="16"/>
+                          <w14:textFill>
+                            <w14:solidFill>
+                              <w14:srgbClr w14:val="000000"/>
+                            </w14:solidFill>
+                          </w14:textFill>
+                        </w:rPr>
+                      </w:pPr>
+                      <w:r>
+                        <w:rPr>
+                          <w:outline w:val="0"/>
+                          <w:color w:val="000000"/>
+                          <w:sz w:val="16"/>
+                          <w:szCs w:val="16"/>
+                          <w:rtl w:val="0"/>
+                          <w:lang w:val="en-US"/>
+                          <w14:textFill>
+                            <w14:solidFill>
+                              <w14:srgbClr w14:val="000000"/>
+                            </w14:solidFill>
+                          </w14:textFill>
+                        </w:rPr>
+                        <w:t xml:space="preserve">Git/Github, Jira/Agile, Azure, Bitbucket, Storybook, Docker, </w:t>
+                      </w:r>
+                      <w:r>
+                        <w:rPr>
+                          <w:outline w:val="0"/>
+                          <w:color w:val="000000"/>
+                          <w:sz w:val="16"/>
+                          <w:szCs w:val="16"/>
+                          <w:rtl w:val="0"/>
+                          <w:lang w:val="en-US"/>
+                          <w14:textFill>
+                            <w14:solidFill>
+                              <w14:srgbClr w14:val="000000"/>
+                            </w14:solidFill>
+                          </w14:textFill>
+                        </w:rPr>
+                        <w:t>Figma, Sketch</w:t>
+                      </w:r>
+                      <w:r>
+                        <w:rPr>
+                          <w:outline w:val="0"/>
+                          <w:color w:val="000000"/>
+                          <w:sz w:val="16"/>
+                          <w:szCs w:val="16"/>
+                          <w:rtl w:val="0"/>
+                          <w:lang w:val="en-US"/>
+                          <w14:textFill>
+                            <w14:solidFill>
+                              <w14:srgbClr w14:val="000000"/>
+                            </w14:solidFill>
+                          </w14:textFill>
+                        </w:rPr>
+                        <w:t>, Adobe Photoshop, Illustrator, AEM</w:t>
+                      </w:r>
+                    </w:p>
+                    <w:p>
+                      <w:pPr>
+                        <w:pStyle w:val="Body"/>
+                        <w:spacing w:line="336" w:lineRule="auto"/>
+                      </w:pPr>
+                      <w:r>
+                        <w:rPr>
+                          <w:outline w:val="0"/>
+                          <w:color w:val="000000"/>
+                          <w:sz w:val="16"/>
+                          <w:szCs w:val="16"/>
+                          <w:rtl w:val="0"/>
+                          <w:lang w:val="en-US"/>
+                          <w14:textFill>
+                            <w14:solidFill>
+                              <w14:srgbClr w14:val="000000"/>
+                            </w14:solidFill>
+                          </w14:textFill>
+                        </w:rPr>
+                        <w:t xml:space="preserve">RxJS, Redux, Postman, Wordpress, Salesforce, </w:t>
+                      </w:r>
+                      <w:r>
+                        <w:rPr>
+                          <w:outline w:val="0"/>
+                          <w:color w:val="000000"/>
+                          <w:sz w:val="16"/>
+                          <w:szCs w:val="16"/>
+                          <w:rtl w:val="0"/>
+                          <w14:textFill>
+                            <w14:solidFill>
+                              <w14:srgbClr w14:val="000000"/>
+                            </w14:solidFill>
+                          </w14:textFill>
+                        </w:rPr>
+                        <w:t>Node.js</w:t>
+                      </w:r>
+                      <w:r>
+                        <w:rPr>
+                          <w:outline w:val="0"/>
+                          <w:color w:val="000000"/>
+                          <w:sz w:val="16"/>
+                          <w:szCs w:val="16"/>
+                          <w:rtl w:val="0"/>
+                          <w:lang w:val="en-US"/>
+                          <w14:textFill>
+                            <w14:solidFill>
+                              <w14:srgbClr w14:val="000000"/>
+                            </w14:solidFill>
+                          </w14:textFill>
+                        </w:rPr>
+                        <w:t>, Gulp.js, Emergence.js, Animate.css, Slick.js, Swiper.js</w:t>
+                      </w:r>
+                    </w:p>
+                  </w:txbxContent>
+                </v:textbox>
+                <w10:wrap type="through" side="bothSides" anchorx="margin"/>
+              </v:shape>
+            </w:pict>
+          </mc:Fallback>
+        </mc:AlternateContent>
+      </w:r>
+      <w:r>
+        <mc:AlternateContent>
+          <mc:Choice Requires="wps">
+            <w:drawing xmlns:a="http://schemas.openxmlformats.org/drawingml/2006/main">
+              <wp:anchor distT="0" distB="0" distL="0" distR="0" simplePos="0" relativeHeight="251671552" behindDoc="0" locked="0" layoutInCell="1" allowOverlap="1">
                 <wp:simplePos x="0" y="0"/>
                 <wp:positionH relativeFrom="margin">
                   <wp:posOffset>6350</wp:posOffset>
                 </wp:positionH>
                 <wp:positionV relativeFrom="line">
-                  <wp:posOffset>5254302</wp:posOffset>
+                  <wp:posOffset>4286296</wp:posOffset>
                 </wp:positionV>
                 <wp:extent cx="6858000" cy="0"/>
                 <wp:effectExtent l="0" t="0" r="0" b="0"/>
                 <wp:wrapTopAndBottom distT="0" distB="0"/>
-                <wp:docPr id="1073741832" name="officeArt object" descr="Line"/>
+                <wp:docPr id="1073741828" name="officeArt object" descr="Line"/>
                 <wp:cNvGraphicFramePr/>
                 <a:graphic xmlns:a="http://schemas.openxmlformats.org/drawingml/2006/main">
                   <a:graphicData uri="http://schemas.microsoft.com/office/word/2010/wordprocessingShape">
@@ -1345,7 +911,7 @@
           </mc:Choice>
           <mc:Fallback>
             <w:pict>
-              <v:line id="_x0000_s1033" style="visibility:visible;position:absolute;margin-left:0.5pt;margin-top:413.7pt;width:540.0pt;height:0.0pt;z-index:251672576;mso-position-horizontal:absolute;mso-position-horizontal-relative:margin;mso-position-vertical:absolute;mso-position-vertical-relative:line;mso-wrap-distance-left:0.0pt;mso-wrap-distance-top:0.0pt;mso-wrap-distance-right:0.0pt;mso-wrap-distance-bottom:0.0pt;">
+              <v:line id="_x0000_s1029" style="visibility:visible;position:absolute;margin-left:0.5pt;margin-top:337.5pt;width:540.0pt;height:0.0pt;z-index:251671552;mso-position-horizontal:absolute;mso-position-horizontal-relative:margin;mso-position-vertical:absolute;mso-position-vertical-relative:line;mso-wrap-distance-left:0.0pt;mso-wrap-distance-top:0.0pt;mso-wrap-distance-right:0.0pt;mso-wrap-distance-bottom:0.0pt;">
                 <v:fill on="f"/>
                 <v:stroke filltype="solid" color="#000000" opacity="100.0%" weight="0.5pt" dashstyle="solid" endcap="flat" miterlimit="400.0%" joinstyle="miter" linestyle="single" startarrow="none" startarrowwidth="medium" startarrowlength="medium" endarrow="none" endarrowwidth="medium" endarrowlength="medium"/>
                 <w10:wrap type="topAndBottom" side="bothSides" anchorx="margin"/>
@@ -1358,148 +924,42 @@
         <mc:AlternateContent>
           <mc:Choice Requires="wps">
             <w:drawing xmlns:a="http://schemas.openxmlformats.org/drawingml/2006/main">
-              <wp:anchor distT="152400" distB="152400" distL="152400" distR="152400" simplePos="0" relativeHeight="251663360" behindDoc="0" locked="0" layoutInCell="1" allowOverlap="1">
+              <wp:anchor distT="0" distB="0" distL="0" distR="0" simplePos="0" relativeHeight="251683840" behindDoc="0" locked="0" layoutInCell="1" allowOverlap="1">
                 <wp:simplePos x="0" y="0"/>
                 <wp:positionH relativeFrom="margin">
-                  <wp:posOffset>5570884</wp:posOffset>
+                  <wp:posOffset>6350</wp:posOffset>
                 </wp:positionH>
                 <wp:positionV relativeFrom="line">
-                  <wp:posOffset>5138241</wp:posOffset>
+                  <wp:posOffset>3600821</wp:posOffset>
                 </wp:positionV>
-                <wp:extent cx="1280766" cy="929928"/>
+                <wp:extent cx="6858000" cy="0"/>
                 <wp:effectExtent l="0" t="0" r="0" b="0"/>
-                <wp:wrapThrough wrapText="bothSides" distL="152400" distR="152400">
-                  <wp:wrapPolygon edited="1">
-                    <wp:start x="0" y="0"/>
-                    <wp:lineTo x="21600" y="0"/>
-                    <wp:lineTo x="21600" y="21600"/>
-                    <wp:lineTo x="0" y="21600"/>
-                    <wp:lineTo x="0" y="0"/>
-                  </wp:wrapPolygon>
-                </wp:wrapThrough>
-                <wp:docPr id="1073741833" name="officeArt object" descr="May 2021 - Present…"/>
+                <wp:wrapTopAndBottom distT="0" distB="0"/>
+                <wp:docPr id="1073741829" name="officeArt object" descr="Line"/>
                 <wp:cNvGraphicFramePr/>
                 <a:graphic xmlns:a="http://schemas.openxmlformats.org/drawingml/2006/main">
                   <a:graphicData uri="http://schemas.microsoft.com/office/word/2010/wordprocessingShape">
                     <wps:wsp>
-                      <wps:cNvSpPr txBox="1"/>
+                      <wps:cNvSpPr/>
                       <wps:spPr>
                         <a:xfrm>
                           <a:off x="0" y="0"/>
-                          <a:ext cx="1280766" cy="929928"/>
+                          <a:ext cx="6858000" cy="0"/>
                         </a:xfrm>
-                        <a:prstGeom prst="rect">
+                        <a:prstGeom prst="line">
                           <a:avLst/>
                         </a:prstGeom>
                         <a:noFill/>
-                        <a:ln w="12700" cap="flat">
-                          <a:noFill/>
+                        <a:ln w="6350" cap="flat">
+                          <a:solidFill>
+                            <a:srgbClr val="000000"/>
+                          </a:solidFill>
+                          <a:prstDash val="solid"/>
                           <a:miter lim="400000"/>
                         </a:ln>
                         <a:effectLst/>
                       </wps:spPr>
-                      <wps:txbx>
-                        <w:txbxContent>
-                          <w:p>
-                            <w:pPr>
-                              <w:pStyle w:val="Body"/>
-                              <w:spacing w:line="288" w:lineRule="auto"/>
-                              <w:jc w:val="right"/>
-                              <w:rPr>
-                                <w:rFonts w:ascii="Helvetica Neue Medium" w:cs="Helvetica Neue Medium" w:hAnsi="Helvetica Neue Medium" w:eastAsia="Helvetica Neue Medium"/>
-                                <w:outline w:val="0"/>
-                                <w:color w:val="000000"/>
-                                <w:sz w:val="16"/>
-                                <w:szCs w:val="16"/>
-                                <w14:textFill>
-                                  <w14:solidFill>
-                                    <w14:srgbClr w14:val="000000"/>
-                                  </w14:solidFill>
-                                </w14:textFill>
-                              </w:rPr>
-                            </w:pPr>
-                            <w:r>
-                              <w:rPr>
-                                <w:rFonts w:ascii="Helvetica Neue Medium" w:hAnsi="Helvetica Neue Medium"/>
-                                <w:outline w:val="0"/>
-                                <w:color w:val="000000"/>
-                                <w:sz w:val="16"/>
-                                <w:szCs w:val="16"/>
-                                <w:rtl w:val="0"/>
-                                <w:lang w:val="en-US"/>
-                                <w14:textFill>
-                                  <w14:solidFill>
-                                    <w14:srgbClr w14:val="000000"/>
-                                  </w14:solidFill>
-                                </w14:textFill>
-                              </w:rPr>
-                              <w:t>May 2021 - Present</w:t>
-                            </w:r>
-                          </w:p>
-                          <w:p>
-                            <w:pPr>
-                              <w:pStyle w:val="Body"/>
-                              <w:spacing w:line="288" w:lineRule="auto"/>
-                              <w:jc w:val="right"/>
-                              <w:rPr>
-                                <w:outline w:val="0"/>
-                                <w:color w:val="000000"/>
-                                <w:sz w:val="16"/>
-                                <w:szCs w:val="16"/>
-                                <w14:textFill>
-                                  <w14:solidFill>
-                                    <w14:srgbClr w14:val="000000"/>
-                                  </w14:solidFill>
-                                </w14:textFill>
-                              </w:rPr>
-                            </w:pPr>
-                            <w:r>
-                              <w:rPr>
-                                <w:outline w:val="0"/>
-                                <w:color w:val="000000"/>
-                                <w:sz w:val="16"/>
-                                <w:szCs w:val="16"/>
-                                <w:rtl w:val="0"/>
-                                <w:lang w:val="en-US"/>
-                                <w14:textFill>
-                                  <w14:solidFill>
-                                    <w14:srgbClr w14:val="000000"/>
-                                  </w14:solidFill>
-                                </w14:textFill>
-                              </w:rPr>
-                              <w:t>City, CA</w:t>
-                            </w:r>
-                          </w:p>
-                          <w:p>
-                            <w:pPr>
-                              <w:pStyle w:val="Body"/>
-                              <w:spacing w:line="336" w:lineRule="auto"/>
-                              <w:jc w:val="right"/>
-                            </w:pPr>
-                            <w:r>
-                              <w:rPr>
-                                <w:i w:val="1"/>
-                                <w:iCs w:val="1"/>
-                                <w:outline w:val="0"/>
-                                <w:color w:val="000000"/>
-                                <w:sz w:val="16"/>
-                                <w:szCs w:val="16"/>
-                                <w:rtl w:val="0"/>
-                                <w:lang w:val="en-US"/>
-                                <w14:textFill>
-                                  <w14:solidFill>
-                                    <w14:srgbClr w14:val="000000"/>
-                                  </w14:solidFill>
-                                </w14:textFill>
-                              </w:rPr>
-                              <w:t>Hybrid</w:t>
-                            </w:r>
-                          </w:p>
-                        </w:txbxContent>
-                      </wps:txbx>
-                      <wps:bodyPr wrap="square" lIns="0" tIns="0" rIns="0" bIns="0" numCol="1" anchor="t">
-                        <a:noAutofit/>
-                      </wps:bodyPr>
+                      <wps:bodyPr/>
                     </wps:wsp>
                   </a:graphicData>
                 </a:graphic>
@@ -1508,110 +968,11 @@
           </mc:Choice>
           <mc:Fallback>
             <w:pict>
-              <v:shape id="_x0000_s1034" type="#_x0000_t202" style="visibility:visible;position:absolute;margin-left:438.7pt;margin-top:404.6pt;width:100.8pt;height:73.2pt;z-index:251663360;mso-position-horizontal:absolute;mso-position-horizontal-relative:margin;mso-position-vertical:absolute;mso-position-vertical-relative:line;mso-wrap-distance-left:12.0pt;mso-wrap-distance-top:12.0pt;mso-wrap-distance-right:12.0pt;mso-wrap-distance-bottom:12.0pt;">
+              <v:line id="_x0000_s1030" style="visibility:visible;position:absolute;margin-left:0.5pt;margin-top:283.5pt;width:540.0pt;height:0.0pt;z-index:251683840;mso-position-horizontal:absolute;mso-position-horizontal-relative:margin;mso-position-vertical:absolute;mso-position-vertical-relative:line;mso-wrap-distance-left:0.0pt;mso-wrap-distance-top:0.0pt;mso-wrap-distance-right:0.0pt;mso-wrap-distance-bottom:0.0pt;">
                 <v:fill on="f"/>
-                <v:stroke on="f" weight="1.0pt" dashstyle="solid" endcap="flat" miterlimit="400.0%" joinstyle="miter" linestyle="single" startarrow="none" startarrowwidth="medium" startarrowlength="medium" endarrow="none" endarrowwidth="medium" endarrowlength="medium"/>
-                <v:textbox>
-                  <w:txbxContent>
-                    <w:p>
-                      <w:pPr>
-                        <w:pStyle w:val="Body"/>
-                        <w:spacing w:line="288" w:lineRule="auto"/>
-                        <w:jc w:val="right"/>
-                        <w:rPr>
-                          <w:rFonts w:ascii="Helvetica Neue Medium" w:cs="Helvetica Neue Medium" w:hAnsi="Helvetica Neue Medium" w:eastAsia="Helvetica Neue Medium"/>
-                          <w:outline w:val="0"/>
-                          <w:color w:val="000000"/>
-                          <w:sz w:val="16"/>
-                          <w:szCs w:val="16"/>
-                          <w14:textFill>
-                            <w14:solidFill>
-                              <w14:srgbClr w14:val="000000"/>
-                            </w14:solidFill>
-                          </w14:textFill>
-                        </w:rPr>
-                      </w:pPr>
-                      <w:r>
-                        <w:rPr>
-                          <w:rFonts w:ascii="Helvetica Neue Medium" w:hAnsi="Helvetica Neue Medium"/>
-                          <w:outline w:val="0"/>
-                          <w:color w:val="000000"/>
-                          <w:sz w:val="16"/>
-                          <w:szCs w:val="16"/>
-                          <w:rtl w:val="0"/>
-                          <w:lang w:val="en-US"/>
-                          <w14:textFill>
-                            <w14:solidFill>
-                              <w14:srgbClr w14:val="000000"/>
-                            </w14:solidFill>
-                          </w14:textFill>
-                        </w:rPr>
-                        <w:t>May 2021 - Present</w:t>
-                      </w:r>
-                    </w:p>
-                    <w:p>
-                      <w:pPr>
-                        <w:pStyle w:val="Body"/>
-                        <w:spacing w:line="288" w:lineRule="auto"/>
-                        <w:jc w:val="right"/>
-                        <w:rPr>
-                          <w:outline w:val="0"/>
-                          <w:color w:val="000000"/>
-                          <w:sz w:val="16"/>
-                          <w:szCs w:val="16"/>
-                          <w14:textFill>
-                            <w14:solidFill>
-                              <w14:srgbClr w14:val="000000"/>
-                            </w14:solidFill>
-                          </w14:textFill>
-                        </w:rPr>
-                      </w:pPr>
-                      <w:r>
-                        <w:rPr>
-                          <w:outline w:val="0"/>
-                          <w:color w:val="000000"/>
-                          <w:sz w:val="16"/>
-                          <w:szCs w:val="16"/>
-                          <w:rtl w:val="0"/>
-                          <w:lang w:val="en-US"/>
-                          <w14:textFill>
-                            <w14:solidFill>
-                              <w14:srgbClr w14:val="000000"/>
-                            </w14:solidFill>
-                          </w14:textFill>
-                        </w:rPr>
-                        <w:t>City, CA</w:t>
-                      </w:r>
-                    </w:p>
-                    <w:p>
-                      <w:pPr>
-                        <w:pStyle w:val="Body"/>
-                        <w:spacing w:line="336" w:lineRule="auto"/>
-                        <w:jc w:val="right"/>
-                      </w:pPr>
-                      <w:r>
-                        <w:rPr>
-                          <w:i w:val="1"/>
-                          <w:iCs w:val="1"/>
-                          <w:outline w:val="0"/>
-                          <w:color w:val="000000"/>
-                          <w:sz w:val="16"/>
-                          <w:szCs w:val="16"/>
-                          <w:rtl w:val="0"/>
-                          <w:lang w:val="en-US"/>
-                          <w14:textFill>
-                            <w14:solidFill>
-                              <w14:srgbClr w14:val="000000"/>
-                            </w14:solidFill>
-                          </w14:textFill>
-                        </w:rPr>
-                        <w:t>Hybrid</w:t>
-                      </w:r>
-                    </w:p>
-                  </w:txbxContent>
-                </v:textbox>
-                <w10:wrap type="through" side="bothSides" anchorx="margin"/>
-              </v:shape>
+                <v:stroke filltype="solid" color="#000000" opacity="100.0%" weight="0.5pt" dashstyle="solid" endcap="flat" miterlimit="400.0%" joinstyle="miter" linestyle="single" startarrow="none" startarrowwidth="medium" startarrowlength="medium" endarrow="none" endarrowwidth="medium" endarrowlength="medium"/>
+                <w10:wrap type="topAndBottom" side="bothSides" anchorx="margin"/>
+              </v:line>
             </w:pict>
           </mc:Fallback>
         </mc:AlternateContent>
@@ -1626,7 +987,7 @@
                   <wp:posOffset>5570884</wp:posOffset>
                 </wp:positionH>
                 <wp:positionV relativeFrom="line">
-                  <wp:posOffset>6150718</wp:posOffset>
+                  <wp:posOffset>6132971</wp:posOffset>
                 </wp:positionV>
                 <wp:extent cx="1280766" cy="850206"/>
                 <wp:effectExtent l="0" t="0" r="0" b="0"/>
@@ -1639,7 +1000,7 @@
                     <wp:lineTo x="0" y="0"/>
                   </wp:wrapPolygon>
                 </wp:wrapThrough>
-                <wp:docPr id="1073741834" name="officeArt object" descr="Jan 20XX - Mar 20XX…"/>
+                <wp:docPr id="1073741830" name="officeArt object" descr="Jan 20XX - Mar 20XX…"/>
                 <wp:cNvGraphicFramePr/>
                 <a:graphic xmlns:a="http://schemas.openxmlformats.org/drawingml/2006/main">
                   <a:graphicData uri="http://schemas.microsoft.com/office/word/2010/wordprocessingShape">
@@ -1800,7 +1161,7 @@
           </mc:Choice>
           <mc:Fallback>
             <w:pict>
-              <v:shape id="_x0000_s1035" type="#_x0000_t202" style="visibility:visible;position:absolute;margin-left:438.7pt;margin-top:484.3pt;width:100.8pt;height:66.9pt;z-index:251665408;mso-position-horizontal:absolute;mso-position-horizontal-relative:margin;mso-position-vertical:absolute;mso-position-vertical-relative:line;mso-wrap-distance-left:12.0pt;mso-wrap-distance-top:12.0pt;mso-wrap-distance-right:12.0pt;mso-wrap-distance-bottom:12.0pt;">
+              <v:shape id="_x0000_s1031" type="#_x0000_t202" style="visibility:visible;position:absolute;margin-left:438.7pt;margin-top:482.9pt;width:100.8pt;height:66.9pt;z-index:251665408;mso-position-horizontal:absolute;mso-position-horizontal-relative:margin;mso-position-vertical:absolute;mso-position-vertical-relative:line;mso-wrap-distance-left:12.0pt;mso-wrap-distance-top:12.0pt;mso-wrap-distance-right:12.0pt;mso-wrap-distance-bottom:12.0pt;">
                 <v:fill on="f"/>
                 <v:stroke on="f" weight="1.0pt" dashstyle="solid" endcap="flat" miterlimit="400.0%" joinstyle="miter" linestyle="single" startarrow="none" startarrowwidth="medium" startarrowlength="medium" endarrow="none" endarrowwidth="medium" endarrowlength="medium"/>
                 <v:textbox>
@@ -1942,18 +1303,18 @@
         <mc:AlternateContent>
           <mc:Choice Requires="wps">
             <w:drawing xmlns:a="http://schemas.openxmlformats.org/drawingml/2006/main">
-              <wp:anchor distT="0" distB="0" distL="0" distR="0" simplePos="0" relativeHeight="251666432" behindDoc="0" locked="0" layoutInCell="1" allowOverlap="1">
+              <wp:anchor distT="0" distB="0" distL="0" distR="0" simplePos="0" relativeHeight="251662336" behindDoc="0" locked="0" layoutInCell="1" allowOverlap="1">
                 <wp:simplePos x="0" y="0"/>
                 <wp:positionH relativeFrom="margin">
                   <wp:posOffset>-6350</wp:posOffset>
                 </wp:positionH>
                 <wp:positionV relativeFrom="line">
-                  <wp:posOffset>7312768</wp:posOffset>
+                  <wp:posOffset>5272893</wp:posOffset>
                 </wp:positionV>
                 <wp:extent cx="5697166" cy="929928"/>
                 <wp:effectExtent l="0" t="0" r="0" b="0"/>
                 <wp:wrapTopAndBottom distT="0" distB="0"/>
-                <wp:docPr id="1073741835" name="officeArt object" descr="JOB TITLE…"/>
+                <wp:docPr id="1073741831" name="officeArt object" descr="JOB TITLE…"/>
                 <wp:cNvGraphicFramePr/>
                 <a:graphic xmlns:a="http://schemas.openxmlformats.org/drawingml/2006/main">
                   <a:graphicData uri="http://schemas.microsoft.com/office/word/2010/wordprocessingShape">
@@ -2008,7 +1369,7 @@
                                 <w:sz w:val="16"/>
                                 <w:szCs w:val="16"/>
                                 <w:rtl w:val="0"/>
-                                <w:lang w:val="de-DE"/>
+                                <w:lang w:val="en-US"/>
                                 <w14:textFill>
                                   <w14:solidFill>
                                     <w14:srgbClr w14:val="000000"/>
@@ -2016,21 +1377,6 @@
                                 </w14:textFill>
                               </w:rPr>
                               <w:t>JOB TITLE</w:t>
-                            </w:r>
-                            <w:r>
-                              <w:rPr>
-                                <w:b w:val="1"/>
-                                <w:bCs w:val="1"/>
-                                <w:outline w:val="0"/>
-                                <w:color w:val="000000"/>
-                                <w:sz w:val="16"/>
-                                <w:szCs w:val="16"/>
-                                <w14:textFill>
-                                  <w14:solidFill>
-                                    <w14:srgbClr w14:val="000000"/>
-                                  </w14:solidFill>
-                                </w14:textFill>
-                              </w:rPr>
                             </w:r>
                           </w:p>
                           <w:p>
@@ -2070,22 +1416,6 @@
                                 </w14:textFill>
                               </w:rPr>
                               <w:t>Company Name</w:t>
-                            </w:r>
-                            <w:r>
-                              <w:rPr>
-                                <w:rFonts w:ascii="Helvetica Neue Medium" w:cs="Helvetica Neue Medium" w:hAnsi="Helvetica Neue Medium" w:eastAsia="Helvetica Neue Medium"/>
-                                <w:i w:val="1"/>
-                                <w:iCs w:val="1"/>
-                                <w:outline w:val="0"/>
-                                <w:color w:val="000000"/>
-                                <w:sz w:val="16"/>
-                                <w:szCs w:val="16"/>
-                                <w14:textFill>
-                                  <w14:solidFill>
-                                    <w14:srgbClr w14:val="000000"/>
-                                  </w14:solidFill>
-                                </w14:textFill>
-                              </w:rPr>
                             </w:r>
                           </w:p>
                           <w:p>
@@ -2123,7 +1453,7 @@
                                   </w14:solidFill>
                                 </w14:textFill>
                               </w:rPr>
-                              <w:t>Fusce dapibus, tellus ac cursus commodo, tortor mauris condimentum nibh, ut fermentum massa justo sit amet.</w:t>
+                              <w:t>Fusce dapibus, tellus ac cursus commodo, tortor mauris condimentum nibh, ut fermentum massa justo sit amet risus.</w:t>
                             </w:r>
                             <w:r>
                               <w:rPr>
@@ -2152,7 +1482,6 @@
                                 <w:color w:val="000000"/>
                                 <w:sz w:val="16"/>
                                 <w:szCs w:val="16"/>
-                                <w:lang w:val="it-IT"/>
                                 <w14:textFill>
                                   <w14:solidFill>
                                     <w14:srgbClr w14:val="000000"/>
@@ -2160,6 +1489,37 @@
                                 </w14:textFill>
                               </w:rPr>
                             </w:pPr>
+                            <w:r>
+                              <w:rPr>
+                                <w:outline w:val="0"/>
+                                <w:color w:val="000000"/>
+                                <w:sz w:val="16"/>
+                                <w:szCs w:val="16"/>
+                                <w:rtl w:val="0"/>
+                                <w14:textFill>
+                                  <w14:solidFill>
+                                    <w14:srgbClr w14:val="000000"/>
+                                  </w14:solidFill>
+                                </w14:textFill>
+                              </w:rPr>
+                              <w:t>Nullam id dolor id nibh ultricies vehicula ut id elit.</w:t>
+                            </w:r>
+                            <w:r>
+                              <w:rPr>
+                                <w:outline w:val="0"/>
+                                <w:color w:val="000000"/>
+                                <w:sz w:val="16"/>
+                                <w:szCs w:val="16"/>
+                                <w:rtl w:val="0"/>
+                                <w:lang w:val="en-US"/>
+                                <w14:textFill>
+                                  <w14:solidFill>
+                                    <w14:srgbClr w14:val="000000"/>
+                                  </w14:solidFill>
+                                </w14:textFill>
+                              </w:rPr>
+                              <w:t xml:space="preserve"> </w:t>
+                            </w:r>
                             <w:r>
                               <w:rPr>
                                 <w:outline w:val="0"/>
@@ -2174,7 +1534,7 @@
                                   </w14:solidFill>
                                 </w14:textFill>
                               </w:rPr>
-                              <w:t>Sed posuere consectetur est at lobortis. Donec id elit non mi porta gravida at eget metus.</w:t>
+                              <w:t>Morbi leo risus, porta ac consectetur ac, vestibulum at eros.</w:t>
                             </w:r>
                             <w:r>
                               <w:rPr>
@@ -2203,6 +1563,7 @@
                                 <w:color w:val="000000"/>
                                 <w:sz w:val="16"/>
                                 <w:szCs w:val="16"/>
+                                <w:lang w:val="it-IT"/>
                                 <w14:textFill>
                                   <w14:solidFill>
                                     <w14:srgbClr w14:val="000000"/>
@@ -2217,29 +1578,14 @@
                                 <w:sz w:val="16"/>
                                 <w:szCs w:val="16"/>
                                 <w:rtl w:val="0"/>
-                                <w14:textFill>
-                                  <w14:solidFill>
-                                    <w14:srgbClr w14:val="000000"/>
-                                  </w14:solidFill>
-                                </w14:textFill>
-                              </w:rPr>
-                              <w:t>Nullam id dolor id nibh ultricies vehicula ut id elit. Morbi leo risus, porta ac consectetur ac, vestibulum at eros.</w:t>
-                            </w:r>
-                            <w:r>
-                              <w:rPr>
-                                <w:outline w:val="0"/>
-                                <w:color w:val="000000"/>
-                                <w:sz w:val="16"/>
-                                <w:szCs w:val="16"/>
-                                <w:rtl w:val="0"/>
-                                <w:lang w:val="en-US"/>
-                                <w14:textFill>
-                                  <w14:solidFill>
-                                    <w14:srgbClr w14:val="000000"/>
-                                  </w14:solidFill>
-                                </w14:textFill>
-                              </w:rPr>
-                              <w:t xml:space="preserve"> </w:t>
+                                <w:lang w:val="it-IT"/>
+                                <w14:textFill>
+                                  <w14:solidFill>
+                                    <w14:srgbClr w14:val="000000"/>
+                                  </w14:solidFill>
+                                </w14:textFill>
+                              </w:rPr>
+                              <w:t>Sed posuere consectetur est at lobortis. Donec id elit non mi porta gravida at eget metus.</w:t>
                             </w:r>
                           </w:p>
                         </w:txbxContent>
@@ -2255,7 +1601,7 @@
           </mc:Choice>
           <mc:Fallback>
             <w:pict>
-              <v:shape id="_x0000_s1036" type="#_x0000_t202" style="visibility:visible;position:absolute;margin-left:-0.5pt;margin-top:575.8pt;width:448.6pt;height:73.2pt;z-index:251666432;mso-position-horizontal:absolute;mso-position-horizontal-relative:margin;mso-position-vertical:absolute;mso-position-vertical-relative:line;mso-wrap-distance-left:0.0pt;mso-wrap-distance-top:0.0pt;mso-wrap-distance-right:0.0pt;mso-wrap-distance-bottom:0.0pt;">
+              <v:shape id="_x0000_s1032" type="#_x0000_t202" style="visibility:visible;position:absolute;margin-left:-0.5pt;margin-top:415.2pt;width:448.6pt;height:73.2pt;z-index:251662336;mso-position-horizontal:absolute;mso-position-horizontal-relative:margin;mso-position-vertical:absolute;mso-position-vertical-relative:line;mso-wrap-distance-left:0.0pt;mso-wrap-distance-top:0.0pt;mso-wrap-distance-right:0.0pt;mso-wrap-distance-bottom:0.0pt;">
                 <v:fill on="f"/>
                 <v:stroke on="f" weight="1.0pt" dashstyle="solid" endcap="flat" miterlimit="400.0%" joinstyle="miter" linestyle="single" startarrow="none" startarrowwidth="medium" startarrowlength="medium" endarrow="none" endarrowwidth="medium" endarrowlength="medium"/>
                 <v:textbox>
@@ -2287,7 +1633,7 @@
                           <w:sz w:val="16"/>
                           <w:szCs w:val="16"/>
                           <w:rtl w:val="0"/>
-                          <w:lang w:val="de-DE"/>
+                          <w:lang w:val="en-US"/>
                           <w14:textFill>
                             <w14:solidFill>
                               <w14:srgbClr w14:val="000000"/>
@@ -2295,21 +1641,6 @@
                           </w14:textFill>
                         </w:rPr>
                         <w:t>JOB TITLE</w:t>
-                      </w:r>
-                      <w:r>
-                        <w:rPr>
-                          <w:b w:val="1"/>
-                          <w:bCs w:val="1"/>
-                          <w:outline w:val="0"/>
-                          <w:color w:val="000000"/>
-                          <w:sz w:val="16"/>
-                          <w:szCs w:val="16"/>
-                          <w14:textFill>
-                            <w14:solidFill>
-                              <w14:srgbClr w14:val="000000"/>
-                            </w14:solidFill>
-                          </w14:textFill>
-                        </w:rPr>
                       </w:r>
                     </w:p>
                     <w:p>
@@ -2349,22 +1680,6 @@
                           </w14:textFill>
                         </w:rPr>
                         <w:t>Company Name</w:t>
-                      </w:r>
-                      <w:r>
-                        <w:rPr>
-                          <w:rFonts w:ascii="Helvetica Neue Medium" w:cs="Helvetica Neue Medium" w:hAnsi="Helvetica Neue Medium" w:eastAsia="Helvetica Neue Medium"/>
-                          <w:i w:val="1"/>
-                          <w:iCs w:val="1"/>
-                          <w:outline w:val="0"/>
-                          <w:color w:val="000000"/>
-                          <w:sz w:val="16"/>
-                          <w:szCs w:val="16"/>
-                          <w14:textFill>
-                            <w14:solidFill>
-                              <w14:srgbClr w14:val="000000"/>
-                            </w14:solidFill>
-                          </w14:textFill>
-                        </w:rPr>
                       </w:r>
                     </w:p>
                     <w:p>
@@ -2402,7 +1717,7 @@
                             </w14:solidFill>
                           </w14:textFill>
                         </w:rPr>
-                        <w:t>Fusce dapibus, tellus ac cursus commodo, tortor mauris condimentum nibh, ut fermentum massa justo sit amet.</w:t>
+                        <w:t>Fusce dapibus, tellus ac cursus commodo, tortor mauris condimentum nibh, ut fermentum massa justo sit amet risus.</w:t>
                       </w:r>
                       <w:r>
                         <w:rPr>
@@ -2431,7 +1746,6 @@
                           <w:color w:val="000000"/>
                           <w:sz w:val="16"/>
                           <w:szCs w:val="16"/>
-                          <w:lang w:val="it-IT"/>
                           <w14:textFill>
                             <w14:solidFill>
                               <w14:srgbClr w14:val="000000"/>
@@ -2439,6 +1753,37 @@
                           </w14:textFill>
                         </w:rPr>
                       </w:pPr>
+                      <w:r>
+                        <w:rPr>
+                          <w:outline w:val="0"/>
+                          <w:color w:val="000000"/>
+                          <w:sz w:val="16"/>
+                          <w:szCs w:val="16"/>
+                          <w:rtl w:val="0"/>
+                          <w14:textFill>
+                            <w14:solidFill>
+                              <w14:srgbClr w14:val="000000"/>
+                            </w14:solidFill>
+                          </w14:textFill>
+                        </w:rPr>
+                        <w:t>Nullam id dolor id nibh ultricies vehicula ut id elit.</w:t>
+                      </w:r>
+                      <w:r>
+                        <w:rPr>
+                          <w:outline w:val="0"/>
+                          <w:color w:val="000000"/>
+                          <w:sz w:val="16"/>
+                          <w:szCs w:val="16"/>
+                          <w:rtl w:val="0"/>
+                          <w:lang w:val="en-US"/>
+                          <w14:textFill>
+                            <w14:solidFill>
+                              <w14:srgbClr w14:val="000000"/>
+                            </w14:solidFill>
+                          </w14:textFill>
+                        </w:rPr>
+                        <w:t xml:space="preserve"> </w:t>
+                      </w:r>
                       <w:r>
                         <w:rPr>
                           <w:outline w:val="0"/>
@@ -2453,7 +1798,7 @@
                             </w14:solidFill>
                           </w14:textFill>
                         </w:rPr>
-                        <w:t>Sed posuere consectetur est at lobortis. Donec id elit non mi porta gravida at eget metus.</w:t>
+                        <w:t>Morbi leo risus, porta ac consectetur ac, vestibulum at eros.</w:t>
                       </w:r>
                       <w:r>
                         <w:rPr>
@@ -2482,6 +1827,7 @@
                           <w:color w:val="000000"/>
                           <w:sz w:val="16"/>
                           <w:szCs w:val="16"/>
+                          <w:lang w:val="it-IT"/>
                           <w14:textFill>
                             <w14:solidFill>
                               <w14:srgbClr w14:val="000000"/>
@@ -2496,29 +1842,14 @@
                           <w:sz w:val="16"/>
                           <w:szCs w:val="16"/>
                           <w:rtl w:val="0"/>
-                          <w14:textFill>
-                            <w14:solidFill>
-                              <w14:srgbClr w14:val="000000"/>
-                            </w14:solidFill>
-                          </w14:textFill>
-                        </w:rPr>
-                        <w:t>Nullam id dolor id nibh ultricies vehicula ut id elit. Morbi leo risus, porta ac consectetur ac, vestibulum at eros.</w:t>
-                      </w:r>
-                      <w:r>
-                        <w:rPr>
-                          <w:outline w:val="0"/>
-                          <w:color w:val="000000"/>
-                          <w:sz w:val="16"/>
-                          <w:szCs w:val="16"/>
-                          <w:rtl w:val="0"/>
-                          <w:lang w:val="en-US"/>
-                          <w14:textFill>
-                            <w14:solidFill>
-                              <w14:srgbClr w14:val="000000"/>
-                            </w14:solidFill>
-                          </w14:textFill>
-                        </w:rPr>
-                        <w:t xml:space="preserve"> </w:t>
+                          <w:lang w:val="it-IT"/>
+                          <w14:textFill>
+                            <w14:solidFill>
+                              <w14:srgbClr w14:val="000000"/>
+                            </w14:solidFill>
+                          </w14:textFill>
+                        </w:rPr>
+                        <w:t>Sed posuere consectetur est at lobortis. Donec id elit non mi porta gravida at eget metus.</w:t>
                       </w:r>
                     </w:p>
                   </w:txbxContent>
@@ -2539,12 +1870,12 @@
                   <wp:posOffset>-6350</wp:posOffset>
                 </wp:positionH>
                 <wp:positionV relativeFrom="line">
-                  <wp:posOffset>6303118</wp:posOffset>
+                  <wp:posOffset>6285371</wp:posOffset>
                 </wp:positionV>
                 <wp:extent cx="5697166" cy="929928"/>
                 <wp:effectExtent l="0" t="0" r="0" b="0"/>
                 <wp:wrapTopAndBottom distT="0" distB="0"/>
-                <wp:docPr id="1073741836" name="officeArt object" descr="JOB TITLE…"/>
+                <wp:docPr id="1073741832" name="officeArt object" descr="JOB TITLE…"/>
                 <wp:cNvGraphicFramePr/>
                 <a:graphic xmlns:a="http://schemas.openxmlformats.org/drawingml/2006/main">
                   <a:graphicData uri="http://schemas.microsoft.com/office/word/2010/wordprocessingShape">
@@ -2818,7 +2149,7 @@
           </mc:Choice>
           <mc:Fallback>
             <w:pict>
-              <v:shape id="_x0000_s1037" type="#_x0000_t202" style="visibility:visible;position:absolute;margin-left:-0.5pt;margin-top:496.3pt;width:448.6pt;height:73.2pt;z-index:251664384;mso-position-horizontal:absolute;mso-position-horizontal-relative:margin;mso-position-vertical:absolute;mso-position-vertical-relative:line;mso-wrap-distance-left:0.0pt;mso-wrap-distance-top:0.0pt;mso-wrap-distance-right:0.0pt;mso-wrap-distance-bottom:0.0pt;">
+              <v:shape id="_x0000_s1033" type="#_x0000_t202" style="visibility:visible;position:absolute;margin-left:-0.5pt;margin-top:494.9pt;width:448.6pt;height:73.2pt;z-index:251664384;mso-position-horizontal:absolute;mso-position-horizontal-relative:margin;mso-position-vertical:absolute;mso-position-vertical-relative:line;mso-wrap-distance-left:0.0pt;mso-wrap-distance-top:0.0pt;mso-wrap-distance-right:0.0pt;mso-wrap-distance-bottom:0.0pt;">
                 <v:fill on="f"/>
                 <v:stroke on="f" weight="1.0pt" dashstyle="solid" endcap="flat" miterlimit="400.0%" joinstyle="miter" linestyle="single" startarrow="none" startarrowwidth="medium" startarrowlength="medium" endarrow="none" endarrowwidth="medium" endarrowlength="medium"/>
                 <v:textbox>
@@ -3059,6 +2390,969 @@
                   </w:txbxContent>
                 </v:textbox>
                 <w10:wrap type="topAndBottom" side="bothSides" anchorx="margin"/>
+              </v:shape>
+            </w:pict>
+          </mc:Fallback>
+        </mc:AlternateContent>
+      </w:r>
+      <w:r>
+        <mc:AlternateContent>
+          <mc:Choice Requires="wps">
+            <w:drawing xmlns:a="http://schemas.openxmlformats.org/drawingml/2006/main">
+              <wp:anchor distT="0" distB="0" distL="0" distR="0" simplePos="0" relativeHeight="251672576" behindDoc="0" locked="0" layoutInCell="1" allowOverlap="1">
+                <wp:simplePos x="0" y="0"/>
+                <wp:positionH relativeFrom="margin">
+                  <wp:posOffset>6350</wp:posOffset>
+                </wp:positionH>
+                <wp:positionV relativeFrom="line">
+                  <wp:posOffset>5236554</wp:posOffset>
+                </wp:positionV>
+                <wp:extent cx="6858000" cy="0"/>
+                <wp:effectExtent l="0" t="0" r="0" b="0"/>
+                <wp:wrapTopAndBottom distT="0" distB="0"/>
+                <wp:docPr id="1073741833" name="officeArt object" descr="Line"/>
+                <wp:cNvGraphicFramePr/>
+                <a:graphic xmlns:a="http://schemas.openxmlformats.org/drawingml/2006/main">
+                  <a:graphicData uri="http://schemas.microsoft.com/office/word/2010/wordprocessingShape">
+                    <wps:wsp>
+                      <wps:cNvSpPr/>
+                      <wps:spPr>
+                        <a:xfrm>
+                          <a:off x="0" y="0"/>
+                          <a:ext cx="6858000" cy="0"/>
+                        </a:xfrm>
+                        <a:prstGeom prst="line">
+                          <a:avLst/>
+                        </a:prstGeom>
+                        <a:noFill/>
+                        <a:ln w="6350" cap="flat">
+                          <a:solidFill>
+                            <a:srgbClr val="000000"/>
+                          </a:solidFill>
+                          <a:prstDash val="solid"/>
+                          <a:miter lim="400000"/>
+                        </a:ln>
+                        <a:effectLst/>
+                      </wps:spPr>
+                      <wps:bodyPr/>
+                    </wps:wsp>
+                  </a:graphicData>
+                </a:graphic>
+              </wp:anchor>
+            </w:drawing>
+          </mc:Choice>
+          <mc:Fallback>
+            <w:pict>
+              <v:line id="_x0000_s1034" style="visibility:visible;position:absolute;margin-left:0.5pt;margin-top:412.3pt;width:540.0pt;height:0.0pt;z-index:251672576;mso-position-horizontal:absolute;mso-position-horizontal-relative:margin;mso-position-vertical:absolute;mso-position-vertical-relative:line;mso-wrap-distance-left:0.0pt;mso-wrap-distance-top:0.0pt;mso-wrap-distance-right:0.0pt;mso-wrap-distance-bottom:0.0pt;">
+                <v:fill on="f"/>
+                <v:stroke filltype="solid" color="#000000" opacity="100.0%" weight="0.5pt" dashstyle="solid" endcap="flat" miterlimit="400.0%" joinstyle="miter" linestyle="single" startarrow="none" startarrowwidth="medium" startarrowlength="medium" endarrow="none" endarrowwidth="medium" endarrowlength="medium"/>
+                <w10:wrap type="topAndBottom" side="bothSides" anchorx="margin"/>
+              </v:line>
+            </w:pict>
+          </mc:Fallback>
+        </mc:AlternateContent>
+      </w:r>
+      <w:r>
+        <mc:AlternateContent>
+          <mc:Choice Requires="wps">
+            <w:drawing xmlns:a="http://schemas.openxmlformats.org/drawingml/2006/main">
+              <wp:anchor distT="0" distB="0" distL="0" distR="0" simplePos="0" relativeHeight="251666432" behindDoc="0" locked="0" layoutInCell="1" allowOverlap="1">
+                <wp:simplePos x="0" y="0"/>
+                <wp:positionH relativeFrom="margin">
+                  <wp:posOffset>-6350</wp:posOffset>
+                </wp:positionH>
+                <wp:positionV relativeFrom="line">
+                  <wp:posOffset>7295021</wp:posOffset>
+                </wp:positionV>
+                <wp:extent cx="5697166" cy="929928"/>
+                <wp:effectExtent l="0" t="0" r="0" b="0"/>
+                <wp:wrapTopAndBottom distT="0" distB="0"/>
+                <wp:docPr id="1073741834" name="officeArt object" descr="JOB TITLE…"/>
+                <wp:cNvGraphicFramePr/>
+                <a:graphic xmlns:a="http://schemas.openxmlformats.org/drawingml/2006/main">
+                  <a:graphicData uri="http://schemas.microsoft.com/office/word/2010/wordprocessingShape">
+                    <wps:wsp>
+                      <wps:cNvSpPr txBox="1"/>
+                      <wps:spPr>
+                        <a:xfrm>
+                          <a:off x="0" y="0"/>
+                          <a:ext cx="5697166" cy="929928"/>
+                        </a:xfrm>
+                        <a:prstGeom prst="rect">
+                          <a:avLst/>
+                        </a:prstGeom>
+                        <a:noFill/>
+                        <a:ln w="12700" cap="flat">
+                          <a:noFill/>
+                          <a:miter lim="400000"/>
+                        </a:ln>
+                        <a:effectLst/>
+                        <a:extLst>
+                          <a:ext uri="{C572A759-6A51-4108-AA02-DFA0A04FC94B}">
+                            <ma14:wrappingTextBoxFlag xmlns:ma14="http://schemas.microsoft.com/office/mac/drawingml/2011/main" val="1"/>
+                          </a:ext>
+                        </a:extLst>
+                      </wps:spPr>
+                      <wps:txbx>
+                        <w:txbxContent>
+                          <w:p>
+                            <w:pPr>
+                              <w:pStyle w:val="Body"/>
+                              <w:spacing w:line="288" w:lineRule="auto"/>
+                              <w:rPr>
+                                <w:b w:val="1"/>
+                                <w:bCs w:val="1"/>
+                                <w:outline w:val="0"/>
+                                <w:color w:val="000000"/>
+                                <w:sz w:val="16"/>
+                                <w:szCs w:val="16"/>
+                                <w14:textFill>
+                                  <w14:solidFill>
+                                    <w14:srgbClr w14:val="000000"/>
+                                  </w14:solidFill>
+                                </w14:textFill>
+                              </w:rPr>
+                            </w:pPr>
+                            <w:r>
+                              <w:rPr>
+                                <w:b w:val="1"/>
+                                <w:bCs w:val="1"/>
+                                <w:outline w:val="0"/>
+                                <w:color w:val="000000"/>
+                                <w:sz w:val="16"/>
+                                <w:szCs w:val="16"/>
+                                <w:rtl w:val="0"/>
+                                <w:lang w:val="de-DE"/>
+                                <w14:textFill>
+                                  <w14:solidFill>
+                                    <w14:srgbClr w14:val="000000"/>
+                                  </w14:solidFill>
+                                </w14:textFill>
+                              </w:rPr>
+                              <w:t>JOB TITLE</w:t>
+                            </w:r>
+                            <w:r>
+                              <w:rPr>
+                                <w:b w:val="1"/>
+                                <w:bCs w:val="1"/>
+                                <w:outline w:val="0"/>
+                                <w:color w:val="000000"/>
+                                <w:sz w:val="16"/>
+                                <w:szCs w:val="16"/>
+                                <w14:textFill>
+                                  <w14:solidFill>
+                                    <w14:srgbClr w14:val="000000"/>
+                                  </w14:solidFill>
+                                </w14:textFill>
+                              </w:rPr>
+                            </w:r>
+                          </w:p>
+                          <w:p>
+                            <w:pPr>
+                              <w:pStyle w:val="Body"/>
+                              <w:spacing w:line="336" w:lineRule="auto"/>
+                              <w:rPr>
+                                <w:rFonts w:ascii="Helvetica Neue Medium" w:cs="Helvetica Neue Medium" w:hAnsi="Helvetica Neue Medium" w:eastAsia="Helvetica Neue Medium"/>
+                                <w:i w:val="1"/>
+                                <w:iCs w:val="1"/>
+                                <w:outline w:val="0"/>
+                                <w:color w:val="000000"/>
+                                <w:sz w:val="16"/>
+                                <w:szCs w:val="16"/>
+                                <w14:textFill>
+                                  <w14:solidFill>
+                                    <w14:srgbClr w14:val="000000"/>
+                                  </w14:solidFill>
+                                </w14:textFill>
+                              </w:rPr>
+                            </w:pPr>
+                            <w:r>
+                              <w:rPr>
+                                <w:rFonts w:ascii="Helvetica Neue Medium" w:hAnsi="Helvetica Neue Medium"/>
+                                <w:i w:val="1"/>
+                                <w:iCs w:val="1"/>
+                                <w:outline w:val="0"/>
+                                <w:color w:val="000000"/>
+                                <w:sz w:val="16"/>
+                                <w:szCs w:val="16"/>
+                                <w:rtl w:val="0"/>
+                                <w:lang w:val="en-US"/>
+                                <w14:textFill>
+                                  <w14:solidFill>
+                                    <w14:srgbClr w14:val="000000"/>
+                                  </w14:solidFill>
+                                </w14:textFill>
+                              </w:rPr>
+                              <w:t>Company Name</w:t>
+                            </w:r>
+                            <w:r>
+                              <w:rPr>
+                                <w:rFonts w:ascii="Helvetica Neue Medium" w:cs="Helvetica Neue Medium" w:hAnsi="Helvetica Neue Medium" w:eastAsia="Helvetica Neue Medium"/>
+                                <w:i w:val="1"/>
+                                <w:iCs w:val="1"/>
+                                <w:outline w:val="0"/>
+                                <w:color w:val="000000"/>
+                                <w:sz w:val="16"/>
+                                <w:szCs w:val="16"/>
+                                <w14:textFill>
+                                  <w14:solidFill>
+                                    <w14:srgbClr w14:val="000000"/>
+                                  </w14:solidFill>
+                                </w14:textFill>
+                              </w:rPr>
+                            </w:r>
+                          </w:p>
+                          <w:p>
+                            <w:pPr>
+                              <w:pStyle w:val="Body"/>
+                              <w:numPr>
+                                <w:ilvl w:val="0"/>
+                                <w:numId w:val="3"/>
+                              </w:numPr>
+                              <w:spacing w:line="336" w:lineRule="auto"/>
+                              <w:rPr>
+                                <w:outline w:val="0"/>
+                                <w:color w:val="000000"/>
+                                <w:sz w:val="16"/>
+                                <w:szCs w:val="16"/>
+                                <w:lang w:val="it-IT"/>
+                                <w14:textFill>
+                                  <w14:solidFill>
+                                    <w14:srgbClr w14:val="000000"/>
+                                  </w14:solidFill>
+                                </w14:textFill>
+                              </w:rPr>
+                            </w:pPr>
+                            <w:r>
+                              <w:rPr>
+                                <w:outline w:val="0"/>
+                                <w:color w:val="000000"/>
+                                <w:sz w:val="16"/>
+                                <w:szCs w:val="16"/>
+                                <w:rtl w:val="0"/>
+                                <w:lang w:val="it-IT"/>
+                                <w14:textFill>
+                                  <w14:solidFill>
+                                    <w14:srgbClr w14:val="000000"/>
+                                  </w14:solidFill>
+                                </w14:textFill>
+                              </w:rPr>
+                              <w:t>Fusce dapibus, tellus ac cursus commodo, tortor mauris condimentum nibh, ut fermentum massa justo sit amet.</w:t>
+                            </w:r>
+                            <w:r>
+                              <w:rPr>
+                                <w:outline w:val="0"/>
+                                <w:color w:val="000000"/>
+                                <w:sz w:val="16"/>
+                                <w:szCs w:val="16"/>
+                                <w14:textFill>
+                                  <w14:solidFill>
+                                    <w14:srgbClr w14:val="000000"/>
+                                  </w14:solidFill>
+                                </w14:textFill>
+                              </w:rPr>
+                            </w:r>
+                          </w:p>
+                          <w:p>
+                            <w:pPr>
+                              <w:pStyle w:val="Body"/>
+                              <w:numPr>
+                                <w:ilvl w:val="0"/>
+                                <w:numId w:val="3"/>
+                              </w:numPr>
+                              <w:spacing w:line="336" w:lineRule="auto"/>
+                              <w:rPr>
+                                <w:outline w:val="0"/>
+                                <w:color w:val="000000"/>
+                                <w:sz w:val="16"/>
+                                <w:szCs w:val="16"/>
+                                <w:lang w:val="it-IT"/>
+                                <w14:textFill>
+                                  <w14:solidFill>
+                                    <w14:srgbClr w14:val="000000"/>
+                                  </w14:solidFill>
+                                </w14:textFill>
+                              </w:rPr>
+                            </w:pPr>
+                            <w:r>
+                              <w:rPr>
+                                <w:outline w:val="0"/>
+                                <w:color w:val="000000"/>
+                                <w:sz w:val="16"/>
+                                <w:szCs w:val="16"/>
+                                <w:rtl w:val="0"/>
+                                <w:lang w:val="it-IT"/>
+                                <w14:textFill>
+                                  <w14:solidFill>
+                                    <w14:srgbClr w14:val="000000"/>
+                                  </w14:solidFill>
+                                </w14:textFill>
+                              </w:rPr>
+                              <w:t>Sed posuere consectetur est at lobortis. Donec id elit non mi porta gravida at eget metus.</w:t>
+                            </w:r>
+                            <w:r>
+                              <w:rPr>
+                                <w:outline w:val="0"/>
+                                <w:color w:val="000000"/>
+                                <w:sz w:val="16"/>
+                                <w:szCs w:val="16"/>
+                                <w14:textFill>
+                                  <w14:solidFill>
+                                    <w14:srgbClr w14:val="000000"/>
+                                  </w14:solidFill>
+                                </w14:textFill>
+                              </w:rPr>
+                            </w:r>
+                          </w:p>
+                          <w:p>
+                            <w:pPr>
+                              <w:pStyle w:val="Body"/>
+                              <w:numPr>
+                                <w:ilvl w:val="0"/>
+                                <w:numId w:val="3"/>
+                              </w:numPr>
+                              <w:spacing w:line="336" w:lineRule="auto"/>
+                              <w:rPr>
+                                <w:outline w:val="0"/>
+                                <w:color w:val="000000"/>
+                                <w:sz w:val="16"/>
+                                <w:szCs w:val="16"/>
+                                <w14:textFill>
+                                  <w14:solidFill>
+                                    <w14:srgbClr w14:val="000000"/>
+                                  </w14:solidFill>
+                                </w14:textFill>
+                              </w:rPr>
+                            </w:pPr>
+                            <w:r>
+                              <w:rPr>
+                                <w:outline w:val="0"/>
+                                <w:color w:val="000000"/>
+                                <w:sz w:val="16"/>
+                                <w:szCs w:val="16"/>
+                                <w:rtl w:val="0"/>
+                                <w14:textFill>
+                                  <w14:solidFill>
+                                    <w14:srgbClr w14:val="000000"/>
+                                  </w14:solidFill>
+                                </w14:textFill>
+                              </w:rPr>
+                              <w:t>Nullam id dolor id nibh ultricies vehicula ut id elit. Morbi leo risus, porta ac consectetur ac, vestibulum at eros.</w:t>
+                            </w:r>
+                            <w:r>
+                              <w:rPr>
+                                <w:outline w:val="0"/>
+                                <w:color w:val="000000"/>
+                                <w:sz w:val="16"/>
+                                <w:szCs w:val="16"/>
+                                <w:rtl w:val="0"/>
+                                <w:lang w:val="en-US"/>
+                                <w14:textFill>
+                                  <w14:solidFill>
+                                    <w14:srgbClr w14:val="000000"/>
+                                  </w14:solidFill>
+                                </w14:textFill>
+                              </w:rPr>
+                              <w:t xml:space="preserve"> </w:t>
+                            </w:r>
+                          </w:p>
+                        </w:txbxContent>
+                      </wps:txbx>
+                      <wps:bodyPr wrap="square" lIns="0" tIns="0" rIns="0" bIns="0" numCol="1" anchor="t">
+                        <a:noAutofit/>
+                      </wps:bodyPr>
+                    </wps:wsp>
+                  </a:graphicData>
+                </a:graphic>
+              </wp:anchor>
+            </w:drawing>
+          </mc:Choice>
+          <mc:Fallback>
+            <w:pict>
+              <v:shape id="_x0000_s1035" type="#_x0000_t202" style="visibility:visible;position:absolute;margin-left:-0.5pt;margin-top:574.4pt;width:448.6pt;height:73.2pt;z-index:251666432;mso-position-horizontal:absolute;mso-position-horizontal-relative:margin;mso-position-vertical:absolute;mso-position-vertical-relative:line;mso-wrap-distance-left:0.0pt;mso-wrap-distance-top:0.0pt;mso-wrap-distance-right:0.0pt;mso-wrap-distance-bottom:0.0pt;">
+                <v:fill on="f"/>
+                <v:stroke on="f" weight="1.0pt" dashstyle="solid" endcap="flat" miterlimit="400.0%" joinstyle="miter" linestyle="single" startarrow="none" startarrowwidth="medium" startarrowlength="medium" endarrow="none" endarrowwidth="medium" endarrowlength="medium"/>
+                <v:textbox>
+                  <w:txbxContent>
+                    <w:p>
+                      <w:pPr>
+                        <w:pStyle w:val="Body"/>
+                        <w:spacing w:line="288" w:lineRule="auto"/>
+                        <w:rPr>
+                          <w:b w:val="1"/>
+                          <w:bCs w:val="1"/>
+                          <w:outline w:val="0"/>
+                          <w:color w:val="000000"/>
+                          <w:sz w:val="16"/>
+                          <w:szCs w:val="16"/>
+                          <w14:textFill>
+                            <w14:solidFill>
+                              <w14:srgbClr w14:val="000000"/>
+                            </w14:solidFill>
+                          </w14:textFill>
+                        </w:rPr>
+                      </w:pPr>
+                      <w:r>
+                        <w:rPr>
+                          <w:b w:val="1"/>
+                          <w:bCs w:val="1"/>
+                          <w:outline w:val="0"/>
+                          <w:color w:val="000000"/>
+                          <w:sz w:val="16"/>
+                          <w:szCs w:val="16"/>
+                          <w:rtl w:val="0"/>
+                          <w:lang w:val="de-DE"/>
+                          <w14:textFill>
+                            <w14:solidFill>
+                              <w14:srgbClr w14:val="000000"/>
+                            </w14:solidFill>
+                          </w14:textFill>
+                        </w:rPr>
+                        <w:t>JOB TITLE</w:t>
+                      </w:r>
+                      <w:r>
+                        <w:rPr>
+                          <w:b w:val="1"/>
+                          <w:bCs w:val="1"/>
+                          <w:outline w:val="0"/>
+                          <w:color w:val="000000"/>
+                          <w:sz w:val="16"/>
+                          <w:szCs w:val="16"/>
+                          <w14:textFill>
+                            <w14:solidFill>
+                              <w14:srgbClr w14:val="000000"/>
+                            </w14:solidFill>
+                          </w14:textFill>
+                        </w:rPr>
+                      </w:r>
+                    </w:p>
+                    <w:p>
+                      <w:pPr>
+                        <w:pStyle w:val="Body"/>
+                        <w:spacing w:line="336" w:lineRule="auto"/>
+                        <w:rPr>
+                          <w:rFonts w:ascii="Helvetica Neue Medium" w:cs="Helvetica Neue Medium" w:hAnsi="Helvetica Neue Medium" w:eastAsia="Helvetica Neue Medium"/>
+                          <w:i w:val="1"/>
+                          <w:iCs w:val="1"/>
+                          <w:outline w:val="0"/>
+                          <w:color w:val="000000"/>
+                          <w:sz w:val="16"/>
+                          <w:szCs w:val="16"/>
+                          <w14:textFill>
+                            <w14:solidFill>
+                              <w14:srgbClr w14:val="000000"/>
+                            </w14:solidFill>
+                          </w14:textFill>
+                        </w:rPr>
+                      </w:pPr>
+                      <w:r>
+                        <w:rPr>
+                          <w:rFonts w:ascii="Helvetica Neue Medium" w:hAnsi="Helvetica Neue Medium"/>
+                          <w:i w:val="1"/>
+                          <w:iCs w:val="1"/>
+                          <w:outline w:val="0"/>
+                          <w:color w:val="000000"/>
+                          <w:sz w:val="16"/>
+                          <w:szCs w:val="16"/>
+                          <w:rtl w:val="0"/>
+                          <w:lang w:val="en-US"/>
+                          <w14:textFill>
+                            <w14:solidFill>
+                              <w14:srgbClr w14:val="000000"/>
+                            </w14:solidFill>
+                          </w14:textFill>
+                        </w:rPr>
+                        <w:t>Company Name</w:t>
+                      </w:r>
+                      <w:r>
+                        <w:rPr>
+                          <w:rFonts w:ascii="Helvetica Neue Medium" w:cs="Helvetica Neue Medium" w:hAnsi="Helvetica Neue Medium" w:eastAsia="Helvetica Neue Medium"/>
+                          <w:i w:val="1"/>
+                          <w:iCs w:val="1"/>
+                          <w:outline w:val="0"/>
+                          <w:color w:val="000000"/>
+                          <w:sz w:val="16"/>
+                          <w:szCs w:val="16"/>
+                          <w14:textFill>
+                            <w14:solidFill>
+                              <w14:srgbClr w14:val="000000"/>
+                            </w14:solidFill>
+                          </w14:textFill>
+                        </w:rPr>
+                      </w:r>
+                    </w:p>
+                    <w:p>
+                      <w:pPr>
+                        <w:pStyle w:val="Body"/>
+                        <w:numPr>
+                          <w:ilvl w:val="0"/>
+                          <w:numId w:val="3"/>
+                        </w:numPr>
+                        <w:spacing w:line="336" w:lineRule="auto"/>
+                        <w:rPr>
+                          <w:outline w:val="0"/>
+                          <w:color w:val="000000"/>
+                          <w:sz w:val="16"/>
+                          <w:szCs w:val="16"/>
+                          <w:lang w:val="it-IT"/>
+                          <w14:textFill>
+                            <w14:solidFill>
+                              <w14:srgbClr w14:val="000000"/>
+                            </w14:solidFill>
+                          </w14:textFill>
+                        </w:rPr>
+                      </w:pPr>
+                      <w:r>
+                        <w:rPr>
+                          <w:outline w:val="0"/>
+                          <w:color w:val="000000"/>
+                          <w:sz w:val="16"/>
+                          <w:szCs w:val="16"/>
+                          <w:rtl w:val="0"/>
+                          <w:lang w:val="it-IT"/>
+                          <w14:textFill>
+                            <w14:solidFill>
+                              <w14:srgbClr w14:val="000000"/>
+                            </w14:solidFill>
+                          </w14:textFill>
+                        </w:rPr>
+                        <w:t>Fusce dapibus, tellus ac cursus commodo, tortor mauris condimentum nibh, ut fermentum massa justo sit amet.</w:t>
+                      </w:r>
+                      <w:r>
+                        <w:rPr>
+                          <w:outline w:val="0"/>
+                          <w:color w:val="000000"/>
+                          <w:sz w:val="16"/>
+                          <w:szCs w:val="16"/>
+                          <w14:textFill>
+                            <w14:solidFill>
+                              <w14:srgbClr w14:val="000000"/>
+                            </w14:solidFill>
+                          </w14:textFill>
+                        </w:rPr>
+                      </w:r>
+                    </w:p>
+                    <w:p>
+                      <w:pPr>
+                        <w:pStyle w:val="Body"/>
+                        <w:numPr>
+                          <w:ilvl w:val="0"/>
+                          <w:numId w:val="3"/>
+                        </w:numPr>
+                        <w:spacing w:line="336" w:lineRule="auto"/>
+                        <w:rPr>
+                          <w:outline w:val="0"/>
+                          <w:color w:val="000000"/>
+                          <w:sz w:val="16"/>
+                          <w:szCs w:val="16"/>
+                          <w:lang w:val="it-IT"/>
+                          <w14:textFill>
+                            <w14:solidFill>
+                              <w14:srgbClr w14:val="000000"/>
+                            </w14:solidFill>
+                          </w14:textFill>
+                        </w:rPr>
+                      </w:pPr>
+                      <w:r>
+                        <w:rPr>
+                          <w:outline w:val="0"/>
+                          <w:color w:val="000000"/>
+                          <w:sz w:val="16"/>
+                          <w:szCs w:val="16"/>
+                          <w:rtl w:val="0"/>
+                          <w:lang w:val="it-IT"/>
+                          <w14:textFill>
+                            <w14:solidFill>
+                              <w14:srgbClr w14:val="000000"/>
+                            </w14:solidFill>
+                          </w14:textFill>
+                        </w:rPr>
+                        <w:t>Sed posuere consectetur est at lobortis. Donec id elit non mi porta gravida at eget metus.</w:t>
+                      </w:r>
+                      <w:r>
+                        <w:rPr>
+                          <w:outline w:val="0"/>
+                          <w:color w:val="000000"/>
+                          <w:sz w:val="16"/>
+                          <w:szCs w:val="16"/>
+                          <w14:textFill>
+                            <w14:solidFill>
+                              <w14:srgbClr w14:val="000000"/>
+                            </w14:solidFill>
+                          </w14:textFill>
+                        </w:rPr>
+                      </w:r>
+                    </w:p>
+                    <w:p>
+                      <w:pPr>
+                        <w:pStyle w:val="Body"/>
+                        <w:numPr>
+                          <w:ilvl w:val="0"/>
+                          <w:numId w:val="3"/>
+                        </w:numPr>
+                        <w:spacing w:line="336" w:lineRule="auto"/>
+                        <w:rPr>
+                          <w:outline w:val="0"/>
+                          <w:color w:val="000000"/>
+                          <w:sz w:val="16"/>
+                          <w:szCs w:val="16"/>
+                          <w14:textFill>
+                            <w14:solidFill>
+                              <w14:srgbClr w14:val="000000"/>
+                            </w14:solidFill>
+                          </w14:textFill>
+                        </w:rPr>
+                      </w:pPr>
+                      <w:r>
+                        <w:rPr>
+                          <w:outline w:val="0"/>
+                          <w:color w:val="000000"/>
+                          <w:sz w:val="16"/>
+                          <w:szCs w:val="16"/>
+                          <w:rtl w:val="0"/>
+                          <w14:textFill>
+                            <w14:solidFill>
+                              <w14:srgbClr w14:val="000000"/>
+                            </w14:solidFill>
+                          </w14:textFill>
+                        </w:rPr>
+                        <w:t>Nullam id dolor id nibh ultricies vehicula ut id elit. Morbi leo risus, porta ac consectetur ac, vestibulum at eros.</w:t>
+                      </w:r>
+                      <w:r>
+                        <w:rPr>
+                          <w:outline w:val="0"/>
+                          <w:color w:val="000000"/>
+                          <w:sz w:val="16"/>
+                          <w:szCs w:val="16"/>
+                          <w:rtl w:val="0"/>
+                          <w:lang w:val="en-US"/>
+                          <w14:textFill>
+                            <w14:solidFill>
+                              <w14:srgbClr w14:val="000000"/>
+                            </w14:solidFill>
+                          </w14:textFill>
+                        </w:rPr>
+                        <w:t xml:space="preserve"> </w:t>
+                      </w:r>
+                    </w:p>
+                  </w:txbxContent>
+                </v:textbox>
+                <w10:wrap type="topAndBottom" side="bothSides" anchorx="margin"/>
+              </v:shape>
+            </w:pict>
+          </mc:Fallback>
+        </mc:AlternateContent>
+      </w:r>
+      <w:r>
+        <mc:AlternateContent>
+          <mc:Choice Requires="wps">
+            <w:drawing xmlns:a="http://schemas.openxmlformats.org/drawingml/2006/main">
+              <wp:anchor distT="0" distB="0" distL="0" distR="0" simplePos="0" relativeHeight="251679744" behindDoc="0" locked="0" layoutInCell="1" allowOverlap="1">
+                <wp:simplePos x="0" y="0"/>
+                <wp:positionH relativeFrom="margin">
+                  <wp:posOffset>6350</wp:posOffset>
+                </wp:positionH>
+                <wp:positionV relativeFrom="line">
+                  <wp:posOffset>1154310</wp:posOffset>
+                </wp:positionV>
+                <wp:extent cx="6858000" cy="0"/>
+                <wp:effectExtent l="0" t="0" r="0" b="0"/>
+                <wp:wrapTopAndBottom distT="0" distB="0"/>
+                <wp:docPr id="1073741835" name="officeArt object" descr="Line"/>
+                <wp:cNvGraphicFramePr/>
+                <a:graphic xmlns:a="http://schemas.openxmlformats.org/drawingml/2006/main">
+                  <a:graphicData uri="http://schemas.microsoft.com/office/word/2010/wordprocessingShape">
+                    <wps:wsp>
+                      <wps:cNvSpPr/>
+                      <wps:spPr>
+                        <a:xfrm>
+                          <a:off x="0" y="0"/>
+                          <a:ext cx="6858000" cy="0"/>
+                        </a:xfrm>
+                        <a:prstGeom prst="line">
+                          <a:avLst/>
+                        </a:prstGeom>
+                        <a:noFill/>
+                        <a:ln w="6350" cap="flat">
+                          <a:solidFill>
+                            <a:srgbClr val="000000"/>
+                          </a:solidFill>
+                          <a:prstDash val="solid"/>
+                          <a:miter lim="400000"/>
+                        </a:ln>
+                        <a:effectLst/>
+                      </wps:spPr>
+                      <wps:bodyPr/>
+                    </wps:wsp>
+                  </a:graphicData>
+                </a:graphic>
+              </wp:anchor>
+            </w:drawing>
+          </mc:Choice>
+          <mc:Fallback>
+            <w:pict>
+              <v:line id="_x0000_s1036" style="visibility:visible;position:absolute;margin-left:0.5pt;margin-top:90.9pt;width:540.0pt;height:0.0pt;z-index:251679744;mso-position-horizontal:absolute;mso-position-horizontal-relative:margin;mso-position-vertical:absolute;mso-position-vertical-relative:line;mso-wrap-distance-left:0.0pt;mso-wrap-distance-top:0.0pt;mso-wrap-distance-right:0.0pt;mso-wrap-distance-bottom:0.0pt;">
+                <v:fill on="f"/>
+                <v:stroke filltype="solid" color="#000000" opacity="100.0%" weight="0.5pt" dashstyle="solid" endcap="flat" miterlimit="400.0%" joinstyle="miter" linestyle="single" startarrow="none" startarrowwidth="medium" startarrowlength="medium" endarrow="none" endarrowwidth="medium" endarrowlength="medium"/>
+                <w10:wrap type="topAndBottom" side="bothSides" anchorx="margin"/>
+              </v:line>
+            </w:pict>
+          </mc:Fallback>
+        </mc:AlternateContent>
+      </w:r>
+      <w:r>
+        <mc:AlternateContent>
+          <mc:Choice Requires="wps">
+            <w:drawing xmlns:a="http://schemas.openxmlformats.org/drawingml/2006/main">
+              <wp:anchor distT="152400" distB="152400" distL="152400" distR="152400" simplePos="0" relativeHeight="251660288" behindDoc="0" locked="0" layoutInCell="1" allowOverlap="1">
+                <wp:simplePos x="0" y="0"/>
+                <wp:positionH relativeFrom="margin">
+                  <wp:posOffset>-6350</wp:posOffset>
+                </wp:positionH>
+                <wp:positionV relativeFrom="line">
+                  <wp:posOffset>4171996</wp:posOffset>
+                </wp:positionV>
+                <wp:extent cx="1728317" cy="621308"/>
+                <wp:effectExtent l="0" t="0" r="0" b="0"/>
+                <wp:wrapThrough wrapText="bothSides" distL="152400" distR="152400">
+                  <wp:wrapPolygon edited="1">
+                    <wp:start x="0" y="0"/>
+                    <wp:lineTo x="21600" y="0"/>
+                    <wp:lineTo x="21600" y="21600"/>
+                    <wp:lineTo x="0" y="21600"/>
+                    <wp:lineTo x="0" y="0"/>
+                  </wp:wrapPolygon>
+                </wp:wrapThrough>
+                <wp:docPr id="1073741836" name="officeArt object" descr="LANGUAGES &amp; FRAMEWORKS…"/>
+                <wp:cNvGraphicFramePr/>
+                <a:graphic xmlns:a="http://schemas.openxmlformats.org/drawingml/2006/main">
+                  <a:graphicData uri="http://schemas.microsoft.com/office/word/2010/wordprocessingShape">
+                    <wps:wsp>
+                      <wps:cNvSpPr txBox="1"/>
+                      <wps:spPr>
+                        <a:xfrm>
+                          <a:off x="0" y="0"/>
+                          <a:ext cx="1728317" cy="621308"/>
+                        </a:xfrm>
+                        <a:prstGeom prst="rect">
+                          <a:avLst/>
+                        </a:prstGeom>
+                        <a:noFill/>
+                        <a:ln w="12700" cap="flat">
+                          <a:noFill/>
+                          <a:miter lim="400000"/>
+                        </a:ln>
+                        <a:effectLst/>
+                      </wps:spPr>
+                      <wps:txbx>
+                        <w:txbxContent>
+                          <w:p>
+                            <w:pPr>
+                              <w:pStyle w:val="Body"/>
+                              <w:spacing w:line="336" w:lineRule="auto"/>
+                              <w:rPr>
+                                <w:rFonts w:ascii="Helvetica Neue Medium" w:cs="Helvetica Neue Medium" w:hAnsi="Helvetica Neue Medium" w:eastAsia="Helvetica Neue Medium"/>
+                                <w:outline w:val="0"/>
+                                <w:color w:val="000000"/>
+                                <w:sz w:val="16"/>
+                                <w:szCs w:val="16"/>
+                                <w14:textFill>
+                                  <w14:solidFill>
+                                    <w14:srgbClr w14:val="000000"/>
+                                  </w14:solidFill>
+                                </w14:textFill>
+                              </w:rPr>
+                            </w:pPr>
+                            <w:r>
+                              <w:rPr>
+                                <w:rFonts w:ascii="Helvetica Neue Medium" w:hAnsi="Helvetica Neue Medium"/>
+                                <w:outline w:val="0"/>
+                                <w:color w:val="000000"/>
+                                <w:sz w:val="16"/>
+                                <w:szCs w:val="16"/>
+                                <w:rtl w:val="0"/>
+                                <w:lang w:val="en-US"/>
+                                <w14:textFill>
+                                  <w14:solidFill>
+                                    <w14:srgbClr w14:val="000000"/>
+                                  </w14:solidFill>
+                                </w14:textFill>
+                              </w:rPr>
+                              <w:t>LANGUAGES &amp; FRAMEWORKS</w:t>
+                            </w:r>
+                          </w:p>
+                          <w:p>
+                            <w:pPr>
+                              <w:pStyle w:val="Body"/>
+                              <w:spacing w:line="336" w:lineRule="auto"/>
+                              <w:rPr>
+                                <w:rFonts w:ascii="Helvetica Neue Medium" w:cs="Helvetica Neue Medium" w:hAnsi="Helvetica Neue Medium" w:eastAsia="Helvetica Neue Medium"/>
+                                <w:outline w:val="0"/>
+                                <w:color w:val="000000"/>
+                                <w:sz w:val="16"/>
+                                <w:szCs w:val="16"/>
+                                <w14:textFill>
+                                  <w14:solidFill>
+                                    <w14:srgbClr w14:val="000000"/>
+                                  </w14:solidFill>
+                                </w14:textFill>
+                              </w:rPr>
+                            </w:pPr>
+                            <w:r>
+                              <w:rPr>
+                                <w:rFonts w:ascii="Helvetica Neue Medium" w:hAnsi="Helvetica Neue Medium"/>
+                                <w:outline w:val="0"/>
+                                <w:color w:val="000000"/>
+                                <w:sz w:val="16"/>
+                                <w:szCs w:val="16"/>
+                                <w:rtl w:val="0"/>
+                                <w:lang w:val="en-US"/>
+                                <w14:textFill>
+                                  <w14:solidFill>
+                                    <w14:srgbClr w14:val="000000"/>
+                                  </w14:solidFill>
+                                </w14:textFill>
+                              </w:rPr>
+                              <w:t>SOFTWARE</w:t>
+                            </w:r>
+                          </w:p>
+                          <w:p>
+                            <w:pPr>
+                              <w:pStyle w:val="Body"/>
+                              <w:spacing w:line="336" w:lineRule="auto"/>
+                            </w:pPr>
+                            <w:r>
+                              <w:rPr>
+                                <w:rFonts w:ascii="Helvetica Neue Medium" w:hAnsi="Helvetica Neue Medium"/>
+                                <w:outline w:val="0"/>
+                                <w:color w:val="000000"/>
+                                <w:sz w:val="16"/>
+                                <w:szCs w:val="16"/>
+                                <w:rtl w:val="0"/>
+                                <w:lang w:val="en-US"/>
+                                <w14:textFill>
+                                  <w14:solidFill>
+                                    <w14:srgbClr w14:val="000000"/>
+                                  </w14:solidFill>
+                                </w14:textFill>
+                              </w:rPr>
+                              <w:t>LIBRARIES &amp; MISC.</w:t>
+                            </w:r>
+                          </w:p>
+                        </w:txbxContent>
+                      </wps:txbx>
+                      <wps:bodyPr wrap="square" lIns="0" tIns="0" rIns="0" bIns="0" numCol="1" anchor="t">
+                        <a:noAutofit/>
+                      </wps:bodyPr>
+                    </wps:wsp>
+                  </a:graphicData>
+                </a:graphic>
+              </wp:anchor>
+            </w:drawing>
+          </mc:Choice>
+          <mc:Fallback>
+            <w:pict>
+              <v:shape id="_x0000_s1037" type="#_x0000_t202" style="visibility:visible;position:absolute;margin-left:-0.5pt;margin-top:328.5pt;width:136.1pt;height:48.9pt;z-index:251660288;mso-position-horizontal:absolute;mso-position-horizontal-relative:margin;mso-position-vertical:absolute;mso-position-vertical-relative:line;mso-wrap-distance-left:12.0pt;mso-wrap-distance-top:12.0pt;mso-wrap-distance-right:12.0pt;mso-wrap-distance-bottom:12.0pt;">
+                <v:fill on="f"/>
+                <v:stroke on="f" weight="1.0pt" dashstyle="solid" endcap="flat" miterlimit="400.0%" joinstyle="miter" linestyle="single" startarrow="none" startarrowwidth="medium" startarrowlength="medium" endarrow="none" endarrowwidth="medium" endarrowlength="medium"/>
+                <v:textbox>
+                  <w:txbxContent>
+                    <w:p>
+                      <w:pPr>
+                        <w:pStyle w:val="Body"/>
+                        <w:spacing w:line="336" w:lineRule="auto"/>
+                        <w:rPr>
+                          <w:rFonts w:ascii="Helvetica Neue Medium" w:cs="Helvetica Neue Medium" w:hAnsi="Helvetica Neue Medium" w:eastAsia="Helvetica Neue Medium"/>
+                          <w:outline w:val="0"/>
+                          <w:color w:val="000000"/>
+                          <w:sz w:val="16"/>
+                          <w:szCs w:val="16"/>
+                          <w14:textFill>
+                            <w14:solidFill>
+                              <w14:srgbClr w14:val="000000"/>
+                            </w14:solidFill>
+                          </w14:textFill>
+                        </w:rPr>
+                      </w:pPr>
+                      <w:r>
+                        <w:rPr>
+                          <w:rFonts w:ascii="Helvetica Neue Medium" w:hAnsi="Helvetica Neue Medium"/>
+                          <w:outline w:val="0"/>
+                          <w:color w:val="000000"/>
+                          <w:sz w:val="16"/>
+                          <w:szCs w:val="16"/>
+                          <w:rtl w:val="0"/>
+                          <w:lang w:val="en-US"/>
+                          <w14:textFill>
+                            <w14:solidFill>
+                              <w14:srgbClr w14:val="000000"/>
+                            </w14:solidFill>
+                          </w14:textFill>
+                        </w:rPr>
+                        <w:t>LANGUAGES &amp; FRAMEWORKS</w:t>
+                      </w:r>
+                    </w:p>
+                    <w:p>
+                      <w:pPr>
+                        <w:pStyle w:val="Body"/>
+                        <w:spacing w:line="336" w:lineRule="auto"/>
+                        <w:rPr>
+                          <w:rFonts w:ascii="Helvetica Neue Medium" w:cs="Helvetica Neue Medium" w:hAnsi="Helvetica Neue Medium" w:eastAsia="Helvetica Neue Medium"/>
+                          <w:outline w:val="0"/>
+                          <w:color w:val="000000"/>
+                          <w:sz w:val="16"/>
+                          <w:szCs w:val="16"/>
+                          <w14:textFill>
+                            <w14:solidFill>
+                              <w14:srgbClr w14:val="000000"/>
+                            </w14:solidFill>
+                          </w14:textFill>
+                        </w:rPr>
+                      </w:pPr>
+                      <w:r>
+                        <w:rPr>
+                          <w:rFonts w:ascii="Helvetica Neue Medium" w:hAnsi="Helvetica Neue Medium"/>
+                          <w:outline w:val="0"/>
+                          <w:color w:val="000000"/>
+                          <w:sz w:val="16"/>
+                          <w:szCs w:val="16"/>
+                          <w:rtl w:val="0"/>
+                          <w:lang w:val="en-US"/>
+                          <w14:textFill>
+                            <w14:solidFill>
+                              <w14:srgbClr w14:val="000000"/>
+                            </w14:solidFill>
+                          </w14:textFill>
+                        </w:rPr>
+                        <w:t>SOFTWARE</w:t>
+                      </w:r>
+                    </w:p>
+                    <w:p>
+                      <w:pPr>
+                        <w:pStyle w:val="Body"/>
+                        <w:spacing w:line="336" w:lineRule="auto"/>
+                      </w:pPr>
+                      <w:r>
+                        <w:rPr>
+                          <w:rFonts w:ascii="Helvetica Neue Medium" w:hAnsi="Helvetica Neue Medium"/>
+                          <w:outline w:val="0"/>
+                          <w:color w:val="000000"/>
+                          <w:sz w:val="16"/>
+                          <w:szCs w:val="16"/>
+                          <w:rtl w:val="0"/>
+                          <w:lang w:val="en-US"/>
+                          <w14:textFill>
+                            <w14:solidFill>
+                              <w14:srgbClr w14:val="000000"/>
+                            </w14:solidFill>
+                          </w14:textFill>
+                        </w:rPr>
+                        <w:t>LIBRARIES &amp; MISC.</w:t>
+                      </w:r>
+                    </w:p>
+                  </w:txbxContent>
+                </v:textbox>
+                <w10:wrap type="through" side="bothSides" anchorx="margin"/>
               </v:shape>
             </w:pict>
           </mc:Fallback>
@@ -3074,7 +3368,7 @@
                   <wp:posOffset>5570884</wp:posOffset>
                 </wp:positionH>
                 <wp:positionV relativeFrom="line">
-                  <wp:posOffset>7160368</wp:posOffset>
+                  <wp:posOffset>7142621</wp:posOffset>
                 </wp:positionV>
                 <wp:extent cx="1280766" cy="929928"/>
                 <wp:effectExtent l="0" t="0" r="0" b="0"/>
@@ -3281,7 +3575,7 @@
           </mc:Choice>
           <mc:Fallback>
             <w:pict>
-              <v:shape id="_x0000_s1038" type="#_x0000_t202" style="visibility:visible;position:absolute;margin-left:438.7pt;margin-top:563.8pt;width:100.8pt;height:73.2pt;z-index:251667456;mso-position-horizontal:absolute;mso-position-horizontal-relative:margin;mso-position-vertical:absolute;mso-position-vertical-relative:line;mso-wrap-distance-left:12.0pt;mso-wrap-distance-top:12.0pt;mso-wrap-distance-right:12.0pt;mso-wrap-distance-bottom:12.0pt;">
+              <v:shape id="_x0000_s1038" type="#_x0000_t202" style="visibility:visible;position:absolute;margin-left:438.7pt;margin-top:562.4pt;width:100.8pt;height:73.2pt;z-index:251667456;mso-position-horizontal:absolute;mso-position-horizontal-relative:margin;mso-position-vertical:absolute;mso-position-vertical-relative:line;mso-wrap-distance-left:12.0pt;mso-wrap-distance-top:12.0pt;mso-wrap-distance-right:12.0pt;mso-wrap-distance-bottom:12.0pt;">
                 <v:fill on="f"/>
                 <v:stroke on="f" weight="1.0pt" dashstyle="solid" endcap="flat" miterlimit="400.0%" joinstyle="miter" linestyle="single" startarrow="none" startarrowwidth="medium" startarrowlength="medium" endarrow="none" endarrowwidth="medium" endarrowlength="medium"/>
                 <v:textbox>
@@ -3456,18 +3750,26 @@
         <mc:AlternateContent>
           <mc:Choice Requires="wps">
             <w:drawing xmlns:a="http://schemas.openxmlformats.org/drawingml/2006/main">
-              <wp:anchor distT="0" distB="0" distL="0" distR="0" simplePos="0" relativeHeight="251662336" behindDoc="0" locked="0" layoutInCell="1" allowOverlap="1">
+              <wp:anchor distT="152400" distB="152400" distL="152400" distR="152400" simplePos="0" relativeHeight="251663360" behindDoc="0" locked="0" layoutInCell="1" allowOverlap="1">
                 <wp:simplePos x="0" y="0"/>
                 <wp:positionH relativeFrom="margin">
-                  <wp:posOffset>-6350</wp:posOffset>
+                  <wp:posOffset>5570884</wp:posOffset>
                 </wp:positionH>
                 <wp:positionV relativeFrom="line">
-                  <wp:posOffset>5290641</wp:posOffset>
+                  <wp:posOffset>5120493</wp:posOffset>
                 </wp:positionV>
-                <wp:extent cx="5697166" cy="929928"/>
+                <wp:extent cx="1280766" cy="929928"/>
                 <wp:effectExtent l="0" t="0" r="0" b="0"/>
-                <wp:wrapTopAndBottom distT="0" distB="0"/>
-                <wp:docPr id="1073741838" name="officeArt object" descr="JOB TITLE…"/>
+                <wp:wrapThrough wrapText="bothSides" distL="152400" distR="152400">
+                  <wp:wrapPolygon edited="1">
+                    <wp:start x="0" y="0"/>
+                    <wp:lineTo x="21600" y="0"/>
+                    <wp:lineTo x="21600" y="21600"/>
+                    <wp:lineTo x="0" y="21600"/>
+                    <wp:lineTo x="0" y="0"/>
+                  </wp:wrapPolygon>
+                </wp:wrapThrough>
+                <wp:docPr id="1073741838" name="officeArt object" descr="May 2021 - Present…"/>
                 <wp:cNvGraphicFramePr/>
                 <a:graphic xmlns:a="http://schemas.openxmlformats.org/drawingml/2006/main">
                   <a:graphicData uri="http://schemas.microsoft.com/office/word/2010/wordprocessingShape">
@@ -3476,7 +3778,7 @@
                       <wps:spPr>
                         <a:xfrm>
                           <a:off x="0" y="0"/>
-                          <a:ext cx="5697166" cy="929928"/>
+                          <a:ext cx="1280766" cy="929928"/>
                         </a:xfrm>
                         <a:prstGeom prst="rect">
                           <a:avLst/>
@@ -3487,11 +3789,6 @@
                           <a:miter lim="400000"/>
                         </a:ln>
                         <a:effectLst/>
-                        <a:extLst>
-                          <a:ext uri="{C572A759-6A51-4108-AA02-DFA0A04FC94B}">
-                            <ma14:wrappingTextBoxFlag xmlns:ma14="http://schemas.microsoft.com/office/mac/drawingml/2011/main" val="1"/>
-                          </a:ext>
-                        </a:extLst>
                       </wps:spPr>
                       <wps:txbx>
                         <w:txbxContent>
@@ -3499,9 +3796,9 @@
                             <w:pPr>
                               <w:pStyle w:val="Body"/>
                               <w:spacing w:line="288" w:lineRule="auto"/>
-                              <w:rPr>
-                                <w:b w:val="1"/>
-                                <w:bCs w:val="1"/>
+                              <w:jc w:val="right"/>
+                              <w:rPr>
+                                <w:rFonts w:ascii="Helvetica Neue Medium" w:cs="Helvetica Neue Medium" w:hAnsi="Helvetica Neue Medium" w:eastAsia="Helvetica Neue Medium"/>
                                 <w:outline w:val="0"/>
                                 <w:color w:val="000000"/>
                                 <w:sz w:val="16"/>
@@ -3515,8 +3812,7 @@
                             </w:pPr>
                             <w:r>
                               <w:rPr>
-                                <w:b w:val="1"/>
-                                <w:bCs w:val="1"/>
+                                <w:rFonts w:ascii="Helvetica Neue Medium" w:hAnsi="Helvetica Neue Medium"/>
                                 <w:outline w:val="0"/>
                                 <w:color w:val="000000"/>
                                 <w:sz w:val="16"/>
@@ -3529,37 +3825,57 @@
                                   </w14:solidFill>
                                 </w14:textFill>
                               </w:rPr>
-                              <w:t>JOB TITLE</w:t>
+                              <w:t>May 2021 - Present</w:t>
+                            </w:r>
+                          </w:p>
+                          <w:p>
+                            <w:pPr>
+                              <w:pStyle w:val="Body"/>
+                              <w:spacing w:line="288" w:lineRule="auto"/>
+                              <w:jc w:val="right"/>
+                              <w:rPr>
+                                <w:outline w:val="0"/>
+                                <w:color w:val="000000"/>
+                                <w:sz w:val="16"/>
+                                <w:szCs w:val="16"/>
+                                <w14:textFill>
+                                  <w14:solidFill>
+                                    <w14:srgbClr w14:val="000000"/>
+                                  </w14:solidFill>
+                                </w14:textFill>
+                              </w:rPr>
+                            </w:pPr>
+                            <w:r>
+                              <w:rPr>
+                                <w:outline w:val="0"/>
+                                <w:color w:val="000000"/>
+                                <w:sz w:val="16"/>
+                                <w:szCs w:val="16"/>
+                                <w:rtl w:val="0"/>
+                                <w:lang w:val="en-US"/>
+                                <w14:textFill>
+                                  <w14:solidFill>
+                                    <w14:srgbClr w14:val="000000"/>
+                                  </w14:solidFill>
+                                </w14:textFill>
+                              </w:rPr>
+                              <w:t>City, CA</w:t>
                             </w:r>
                           </w:p>
                           <w:p>
                             <w:pPr>
                               <w:pStyle w:val="Body"/>
                               <w:spacing w:line="336" w:lineRule="auto"/>
-                              <w:rPr>
-                                <w:rFonts w:ascii="Helvetica Neue Medium" w:cs="Helvetica Neue Medium" w:hAnsi="Helvetica Neue Medium" w:eastAsia="Helvetica Neue Medium"/>
+                              <w:jc w:val="right"/>
+                            </w:pPr>
+                            <w:r>
+                              <w:rPr>
                                 <w:i w:val="1"/>
                                 <w:iCs w:val="1"/>
                                 <w:outline w:val="0"/>
                                 <w:color w:val="000000"/>
                                 <w:sz w:val="16"/>
                                 <w:szCs w:val="16"/>
-                                <w14:textFill>
-                                  <w14:solidFill>
-                                    <w14:srgbClr w14:val="000000"/>
-                                  </w14:solidFill>
-                                </w14:textFill>
-                              </w:rPr>
-                            </w:pPr>
-                            <w:r>
-                              <w:rPr>
-                                <w:rFonts w:ascii="Helvetica Neue Medium" w:hAnsi="Helvetica Neue Medium"/>
-                                <w:i w:val="1"/>
-                                <w:iCs w:val="1"/>
-                                <w:outline w:val="0"/>
-                                <w:color w:val="000000"/>
-                                <w:sz w:val="16"/>
-                                <w:szCs w:val="16"/>
                                 <w:rtl w:val="0"/>
                                 <w:lang w:val="en-US"/>
                                 <w14:textFill>
@@ -3568,177 +3884,7 @@
                                   </w14:solidFill>
                                 </w14:textFill>
                               </w:rPr>
-                              <w:t>Company Name</w:t>
-                            </w:r>
-                          </w:p>
-                          <w:p>
-                            <w:pPr>
-                              <w:pStyle w:val="Body"/>
-                              <w:numPr>
-                                <w:ilvl w:val="0"/>
-                                <w:numId w:val="3"/>
-                              </w:numPr>
-                              <w:spacing w:line="336" w:lineRule="auto"/>
-                              <w:rPr>
-                                <w:outline w:val="0"/>
-                                <w:color w:val="000000"/>
-                                <w:sz w:val="16"/>
-                                <w:szCs w:val="16"/>
-                                <w:lang w:val="it-IT"/>
-                                <w14:textFill>
-                                  <w14:solidFill>
-                                    <w14:srgbClr w14:val="000000"/>
-                                  </w14:solidFill>
-                                </w14:textFill>
-                              </w:rPr>
-                            </w:pPr>
-                            <w:r>
-                              <w:rPr>
-                                <w:outline w:val="0"/>
-                                <w:color w:val="000000"/>
-                                <w:sz w:val="16"/>
-                                <w:szCs w:val="16"/>
-                                <w:rtl w:val="0"/>
-                                <w:lang w:val="it-IT"/>
-                                <w14:textFill>
-                                  <w14:solidFill>
-                                    <w14:srgbClr w14:val="000000"/>
-                                  </w14:solidFill>
-                                </w14:textFill>
-                              </w:rPr>
-                              <w:t>Fusce dapibus, tellus ac cursus commodo, tortor mauris condimentum nibh, ut fermentum massa justo sit amet risus.</w:t>
-                            </w:r>
-                            <w:r>
-                              <w:rPr>
-                                <w:outline w:val="0"/>
-                                <w:color w:val="000000"/>
-                                <w:sz w:val="16"/>
-                                <w:szCs w:val="16"/>
-                                <w14:textFill>
-                                  <w14:solidFill>
-                                    <w14:srgbClr w14:val="000000"/>
-                                  </w14:solidFill>
-                                </w14:textFill>
-                              </w:rPr>
-                            </w:r>
-                          </w:p>
-                          <w:p>
-                            <w:pPr>
-                              <w:pStyle w:val="Body"/>
-                              <w:numPr>
-                                <w:ilvl w:val="0"/>
-                                <w:numId w:val="3"/>
-                              </w:numPr>
-                              <w:spacing w:line="336" w:lineRule="auto"/>
-                              <w:rPr>
-                                <w:outline w:val="0"/>
-                                <w:color w:val="000000"/>
-                                <w:sz w:val="16"/>
-                                <w:szCs w:val="16"/>
-                                <w14:textFill>
-                                  <w14:solidFill>
-                                    <w14:srgbClr w14:val="000000"/>
-                                  </w14:solidFill>
-                                </w14:textFill>
-                              </w:rPr>
-                            </w:pPr>
-                            <w:r>
-                              <w:rPr>
-                                <w:outline w:val="0"/>
-                                <w:color w:val="000000"/>
-                                <w:sz w:val="16"/>
-                                <w:szCs w:val="16"/>
-                                <w:rtl w:val="0"/>
-                                <w14:textFill>
-                                  <w14:solidFill>
-                                    <w14:srgbClr w14:val="000000"/>
-                                  </w14:solidFill>
-                                </w14:textFill>
-                              </w:rPr>
-                              <w:t>Nullam id dolor id nibh ultricies vehicula ut id elit.</w:t>
-                            </w:r>
-                            <w:r>
-                              <w:rPr>
-                                <w:outline w:val="0"/>
-                                <w:color w:val="000000"/>
-                                <w:sz w:val="16"/>
-                                <w:szCs w:val="16"/>
-                                <w:rtl w:val="0"/>
-                                <w:lang w:val="en-US"/>
-                                <w14:textFill>
-                                  <w14:solidFill>
-                                    <w14:srgbClr w14:val="000000"/>
-                                  </w14:solidFill>
-                                </w14:textFill>
-                              </w:rPr>
-                              <w:t xml:space="preserve"> </w:t>
-                            </w:r>
-                            <w:r>
-                              <w:rPr>
-                                <w:outline w:val="0"/>
-                                <w:color w:val="000000"/>
-                                <w:sz w:val="16"/>
-                                <w:szCs w:val="16"/>
-                                <w:rtl w:val="0"/>
-                                <w:lang w:val="it-IT"/>
-                                <w14:textFill>
-                                  <w14:solidFill>
-                                    <w14:srgbClr w14:val="000000"/>
-                                  </w14:solidFill>
-                                </w14:textFill>
-                              </w:rPr>
-                              <w:t>Morbi leo risus, porta ac consectetur ac, vestibulum at eros.</w:t>
-                            </w:r>
-                            <w:r>
-                              <w:rPr>
-                                <w:outline w:val="0"/>
-                                <w:color w:val="000000"/>
-                                <w:sz w:val="16"/>
-                                <w:szCs w:val="16"/>
-                                <w14:textFill>
-                                  <w14:solidFill>
-                                    <w14:srgbClr w14:val="000000"/>
-                                  </w14:solidFill>
-                                </w14:textFill>
-                              </w:rPr>
-                            </w:r>
-                          </w:p>
-                          <w:p>
-                            <w:pPr>
-                              <w:pStyle w:val="Body"/>
-                              <w:numPr>
-                                <w:ilvl w:val="0"/>
-                                <w:numId w:val="3"/>
-                              </w:numPr>
-                              <w:spacing w:line="336" w:lineRule="auto"/>
-                              <w:rPr>
-                                <w:outline w:val="0"/>
-                                <w:color w:val="000000"/>
-                                <w:sz w:val="16"/>
-                                <w:szCs w:val="16"/>
-                                <w:lang w:val="it-IT"/>
-                                <w14:textFill>
-                                  <w14:solidFill>
-                                    <w14:srgbClr w14:val="000000"/>
-                                  </w14:solidFill>
-                                </w14:textFill>
-                              </w:rPr>
-                            </w:pPr>
-                            <w:r>
-                              <w:rPr>
-                                <w:outline w:val="0"/>
-                                <w:color w:val="000000"/>
-                                <w:sz w:val="16"/>
-                                <w:szCs w:val="16"/>
-                                <w:rtl w:val="0"/>
-                                <w:lang w:val="it-IT"/>
-                                <w14:textFill>
-                                  <w14:solidFill>
-                                    <w14:srgbClr w14:val="000000"/>
-                                  </w14:solidFill>
-                                </w14:textFill>
-                              </w:rPr>
-                              <w:t>Sed posuere consectetur est at lobortis. Donec id elit non mi porta gravida at eget metus.</w:t>
+                              <w:t>Hybrid</w:t>
                             </w:r>
                           </w:p>
                         </w:txbxContent>
@@ -3754,7 +3900,7 @@
           </mc:Choice>
           <mc:Fallback>
             <w:pict>
-              <v:shape id="_x0000_s1039" type="#_x0000_t202" style="visibility:visible;position:absolute;margin-left:-0.5pt;margin-top:416.6pt;width:448.6pt;height:73.2pt;z-index:251662336;mso-position-horizontal:absolute;mso-position-horizontal-relative:margin;mso-position-vertical:absolute;mso-position-vertical-relative:line;mso-wrap-distance-left:0.0pt;mso-wrap-distance-top:0.0pt;mso-wrap-distance-right:0.0pt;mso-wrap-distance-bottom:0.0pt;">
+              <v:shape id="_x0000_s1039" type="#_x0000_t202" style="visibility:visible;position:absolute;margin-left:438.7pt;margin-top:403.2pt;width:100.8pt;height:73.2pt;z-index:251663360;mso-position-horizontal:absolute;mso-position-horizontal-relative:margin;mso-position-vertical:absolute;mso-position-vertical-relative:line;mso-wrap-distance-left:12.0pt;mso-wrap-distance-top:12.0pt;mso-wrap-distance-right:12.0pt;mso-wrap-distance-bottom:12.0pt;">
                 <v:fill on="f"/>
                 <v:stroke on="f" weight="1.0pt" dashstyle="solid" endcap="flat" miterlimit="400.0%" joinstyle="miter" linestyle="single" startarrow="none" startarrowwidth="medium" startarrowlength="medium" endarrow="none" endarrowwidth="medium" endarrowlength="medium"/>
                 <v:textbox>
@@ -3763,9 +3909,9 @@
                       <w:pPr>
                         <w:pStyle w:val="Body"/>
                         <w:spacing w:line="288" w:lineRule="auto"/>
-                        <w:rPr>
-                          <w:b w:val="1"/>
-                          <w:bCs w:val="1"/>
+                        <w:jc w:val="right"/>
+                        <w:rPr>
+                          <w:rFonts w:ascii="Helvetica Neue Medium" w:cs="Helvetica Neue Medium" w:hAnsi="Helvetica Neue Medium" w:eastAsia="Helvetica Neue Medium"/>
                           <w:outline w:val="0"/>
                           <w:color w:val="000000"/>
                           <w:sz w:val="16"/>
@@ -3779,8 +3925,7 @@
                       </w:pPr>
                       <w:r>
                         <w:rPr>
-                          <w:b w:val="1"/>
-                          <w:bCs w:val="1"/>
+                          <w:rFonts w:ascii="Helvetica Neue Medium" w:hAnsi="Helvetica Neue Medium"/>
                           <w:outline w:val="0"/>
                           <w:color w:val="000000"/>
                           <w:sz w:val="16"/>
@@ -3793,37 +3938,57 @@
                             </w14:solidFill>
                           </w14:textFill>
                         </w:rPr>
-                        <w:t>JOB TITLE</w:t>
+                        <w:t>May 2021 - Present</w:t>
+                      </w:r>
+                    </w:p>
+                    <w:p>
+                      <w:pPr>
+                        <w:pStyle w:val="Body"/>
+                        <w:spacing w:line="288" w:lineRule="auto"/>
+                        <w:jc w:val="right"/>
+                        <w:rPr>
+                          <w:outline w:val="0"/>
+                          <w:color w:val="000000"/>
+                          <w:sz w:val="16"/>
+                          <w:szCs w:val="16"/>
+                          <w14:textFill>
+                            <w14:solidFill>
+                              <w14:srgbClr w14:val="000000"/>
+                            </w14:solidFill>
+                          </w14:textFill>
+                        </w:rPr>
+                      </w:pPr>
+                      <w:r>
+                        <w:rPr>
+                          <w:outline w:val="0"/>
+                          <w:color w:val="000000"/>
+                          <w:sz w:val="16"/>
+                          <w:szCs w:val="16"/>
+                          <w:rtl w:val="0"/>
+                          <w:lang w:val="en-US"/>
+                          <w14:textFill>
+                            <w14:solidFill>
+                              <w14:srgbClr w14:val="000000"/>
+                            </w14:solidFill>
+                          </w14:textFill>
+                        </w:rPr>
+                        <w:t>City, CA</w:t>
                       </w:r>
                     </w:p>
                     <w:p>
                       <w:pPr>
                         <w:pStyle w:val="Body"/>
                         <w:spacing w:line="336" w:lineRule="auto"/>
-                        <w:rPr>
-                          <w:rFonts w:ascii="Helvetica Neue Medium" w:cs="Helvetica Neue Medium" w:hAnsi="Helvetica Neue Medium" w:eastAsia="Helvetica Neue Medium"/>
+                        <w:jc w:val="right"/>
+                      </w:pPr>
+                      <w:r>
+                        <w:rPr>
                           <w:i w:val="1"/>
                           <w:iCs w:val="1"/>
                           <w:outline w:val="0"/>
                           <w:color w:val="000000"/>
                           <w:sz w:val="16"/>
                           <w:szCs w:val="16"/>
-                          <w14:textFill>
-                            <w14:solidFill>
-                              <w14:srgbClr w14:val="000000"/>
-                            </w14:solidFill>
-                          </w14:textFill>
-                        </w:rPr>
-                      </w:pPr>
-                      <w:r>
-                        <w:rPr>
-                          <w:rFonts w:ascii="Helvetica Neue Medium" w:hAnsi="Helvetica Neue Medium"/>
-                          <w:i w:val="1"/>
-                          <w:iCs w:val="1"/>
-                          <w:outline w:val="0"/>
-                          <w:color w:val="000000"/>
-                          <w:sz w:val="16"/>
-                          <w:szCs w:val="16"/>
                           <w:rtl w:val="0"/>
                           <w:lang w:val="en-US"/>
                           <w14:textFill>
@@ -3832,182 +3997,12 @@
                             </w14:solidFill>
                           </w14:textFill>
                         </w:rPr>
-                        <w:t>Company Name</w:t>
-                      </w:r>
-                    </w:p>
-                    <w:p>
-                      <w:pPr>
-                        <w:pStyle w:val="Body"/>
-                        <w:numPr>
-                          <w:ilvl w:val="0"/>
-                          <w:numId w:val="3"/>
-                        </w:numPr>
-                        <w:spacing w:line="336" w:lineRule="auto"/>
-                        <w:rPr>
-                          <w:outline w:val="0"/>
-                          <w:color w:val="000000"/>
-                          <w:sz w:val="16"/>
-                          <w:szCs w:val="16"/>
-                          <w:lang w:val="it-IT"/>
-                          <w14:textFill>
-                            <w14:solidFill>
-                              <w14:srgbClr w14:val="000000"/>
-                            </w14:solidFill>
-                          </w14:textFill>
-                        </w:rPr>
-                      </w:pPr>
-                      <w:r>
-                        <w:rPr>
-                          <w:outline w:val="0"/>
-                          <w:color w:val="000000"/>
-                          <w:sz w:val="16"/>
-                          <w:szCs w:val="16"/>
-                          <w:rtl w:val="0"/>
-                          <w:lang w:val="it-IT"/>
-                          <w14:textFill>
-                            <w14:solidFill>
-                              <w14:srgbClr w14:val="000000"/>
-                            </w14:solidFill>
-                          </w14:textFill>
-                        </w:rPr>
-                        <w:t>Fusce dapibus, tellus ac cursus commodo, tortor mauris condimentum nibh, ut fermentum massa justo sit amet risus.</w:t>
-                      </w:r>
-                      <w:r>
-                        <w:rPr>
-                          <w:outline w:val="0"/>
-                          <w:color w:val="000000"/>
-                          <w:sz w:val="16"/>
-                          <w:szCs w:val="16"/>
-                          <w14:textFill>
-                            <w14:solidFill>
-                              <w14:srgbClr w14:val="000000"/>
-                            </w14:solidFill>
-                          </w14:textFill>
-                        </w:rPr>
-                      </w:r>
-                    </w:p>
-                    <w:p>
-                      <w:pPr>
-                        <w:pStyle w:val="Body"/>
-                        <w:numPr>
-                          <w:ilvl w:val="0"/>
-                          <w:numId w:val="3"/>
-                        </w:numPr>
-                        <w:spacing w:line="336" w:lineRule="auto"/>
-                        <w:rPr>
-                          <w:outline w:val="0"/>
-                          <w:color w:val="000000"/>
-                          <w:sz w:val="16"/>
-                          <w:szCs w:val="16"/>
-                          <w14:textFill>
-                            <w14:solidFill>
-                              <w14:srgbClr w14:val="000000"/>
-                            </w14:solidFill>
-                          </w14:textFill>
-                        </w:rPr>
-                      </w:pPr>
-                      <w:r>
-                        <w:rPr>
-                          <w:outline w:val="0"/>
-                          <w:color w:val="000000"/>
-                          <w:sz w:val="16"/>
-                          <w:szCs w:val="16"/>
-                          <w:rtl w:val="0"/>
-                          <w14:textFill>
-                            <w14:solidFill>
-                              <w14:srgbClr w14:val="000000"/>
-                            </w14:solidFill>
-                          </w14:textFill>
-                        </w:rPr>
-                        <w:t>Nullam id dolor id nibh ultricies vehicula ut id elit.</w:t>
-                      </w:r>
-                      <w:r>
-                        <w:rPr>
-                          <w:outline w:val="0"/>
-                          <w:color w:val="000000"/>
-                          <w:sz w:val="16"/>
-                          <w:szCs w:val="16"/>
-                          <w:rtl w:val="0"/>
-                          <w:lang w:val="en-US"/>
-                          <w14:textFill>
-                            <w14:solidFill>
-                              <w14:srgbClr w14:val="000000"/>
-                            </w14:solidFill>
-                          </w14:textFill>
-                        </w:rPr>
-                        <w:t xml:space="preserve"> </w:t>
-                      </w:r>
-                      <w:r>
-                        <w:rPr>
-                          <w:outline w:val="0"/>
-                          <w:color w:val="000000"/>
-                          <w:sz w:val="16"/>
-                          <w:szCs w:val="16"/>
-                          <w:rtl w:val="0"/>
-                          <w:lang w:val="it-IT"/>
-                          <w14:textFill>
-                            <w14:solidFill>
-                              <w14:srgbClr w14:val="000000"/>
-                            </w14:solidFill>
-                          </w14:textFill>
-                        </w:rPr>
-                        <w:t>Morbi leo risus, porta ac consectetur ac, vestibulum at eros.</w:t>
-                      </w:r>
-                      <w:r>
-                        <w:rPr>
-                          <w:outline w:val="0"/>
-                          <w:color w:val="000000"/>
-                          <w:sz w:val="16"/>
-                          <w:szCs w:val="16"/>
-                          <w14:textFill>
-                            <w14:solidFill>
-                              <w14:srgbClr w14:val="000000"/>
-                            </w14:solidFill>
-                          </w14:textFill>
-                        </w:rPr>
-                      </w:r>
-                    </w:p>
-                    <w:p>
-                      <w:pPr>
-                        <w:pStyle w:val="Body"/>
-                        <w:numPr>
-                          <w:ilvl w:val="0"/>
-                          <w:numId w:val="3"/>
-                        </w:numPr>
-                        <w:spacing w:line="336" w:lineRule="auto"/>
-                        <w:rPr>
-                          <w:outline w:val="0"/>
-                          <w:color w:val="000000"/>
-                          <w:sz w:val="16"/>
-                          <w:szCs w:val="16"/>
-                          <w:lang w:val="it-IT"/>
-                          <w14:textFill>
-                            <w14:solidFill>
-                              <w14:srgbClr w14:val="000000"/>
-                            </w14:solidFill>
-                          </w14:textFill>
-                        </w:rPr>
-                      </w:pPr>
-                      <w:r>
-                        <w:rPr>
-                          <w:outline w:val="0"/>
-                          <w:color w:val="000000"/>
-                          <w:sz w:val="16"/>
-                          <w:szCs w:val="16"/>
-                          <w:rtl w:val="0"/>
-                          <w:lang w:val="it-IT"/>
-                          <w14:textFill>
-                            <w14:solidFill>
-                              <w14:srgbClr w14:val="000000"/>
-                            </w14:solidFill>
-                          </w14:textFill>
-                        </w:rPr>
-                        <w:t>Sed posuere consectetur est at lobortis. Donec id elit non mi porta gravida at eget metus.</w:t>
+                        <w:t>Hybrid</w:t>
                       </w:r>
                     </w:p>
                   </w:txbxContent>
                 </v:textbox>
-                <w10:wrap type="topAndBottom" side="bothSides" anchorx="margin"/>
+                <w10:wrap type="through" side="bothSides" anchorx="margin"/>
               </v:shape>
             </w:pict>
           </mc:Fallback>
@@ -4023,7 +4018,7 @@
                   <wp:posOffset>457200</wp:posOffset>
                 </wp:positionH>
                 <wp:positionV relativeFrom="page">
-                  <wp:posOffset>4973480</wp:posOffset>
+                  <wp:posOffset>4955733</wp:posOffset>
                 </wp:positionV>
                 <wp:extent cx="1572097" cy="243880"/>
                 <wp:effectExtent l="0" t="0" r="0" b="0"/>
@@ -4099,7 +4094,7 @@
           </mc:Choice>
           <mc:Fallback>
             <w:pict>
-              <v:shape id="_x0000_s1040" type="#_x0000_t202" style="visibility:visible;position:absolute;margin-left:36.0pt;margin-top:391.6pt;width:123.8pt;height:19.2pt;z-index:251659264;mso-position-horizontal:absolute;mso-position-horizontal-relative:page;mso-position-vertical:absolute;mso-position-vertical-relative:page;mso-wrap-distance-left:12.0pt;mso-wrap-distance-top:12.0pt;mso-wrap-distance-right:12.0pt;mso-wrap-distance-bottom:12.0pt;">
+              <v:shape id="_x0000_s1040" type="#_x0000_t202" style="visibility:visible;position:absolute;margin-left:36.0pt;margin-top:390.2pt;width:123.8pt;height:19.2pt;z-index:251659264;mso-position-horizontal:absolute;mso-position-horizontal-relative:page;mso-position-vertical:absolute;mso-position-vertical-relative:page;mso-wrap-distance-left:12.0pt;mso-wrap-distance-top:12.0pt;mso-wrap-distance-right:12.0pt;mso-wrap-distance-bottom:12.0pt;">
                 <v:fill on="f"/>
                 <v:stroke on="f" weight="1.0pt" dashstyle="solid" endcap="flat" miterlimit="400.0%" joinstyle="miter" linestyle="single" startarrow="none" startarrowwidth="medium" startarrowlength="medium" endarrow="none" endarrowwidth="medium" endarrowlength="medium"/>
                 <v:textbox>
@@ -4394,7 +4389,7 @@
                   <wp:posOffset>457200</wp:posOffset>
                 </wp:positionH>
                 <wp:positionV relativeFrom="page">
-                  <wp:posOffset>4842933</wp:posOffset>
+                  <wp:posOffset>4825186</wp:posOffset>
                 </wp:positionV>
                 <wp:extent cx="864159" cy="130548"/>
                 <wp:effectExtent l="0" t="0" r="0" b="0"/>
@@ -4532,7 +4527,7 @@
           </mc:Choice>
           <mc:Fallback>
             <w:pict>
-              <v:shape id="_x0000_s1042" type="#_x0000_t202" style="visibility:visible;position:absolute;margin-left:36.0pt;margin-top:381.3pt;width:68.0pt;height:10.3pt;z-index:251673600;mso-position-horizontal:absolute;mso-position-horizontal-relative:page;mso-position-vertical:absolute;mso-position-vertical-relative:page;mso-wrap-distance-left:0.0pt;mso-wrap-distance-top:0.0pt;mso-wrap-distance-right:0.0pt;mso-wrap-distance-bottom:0.0pt;">
+              <v:shape id="_x0000_s1042" type="#_x0000_t202" style="visibility:visible;position:absolute;margin-left:36.0pt;margin-top:379.9pt;width:68.0pt;height:10.3pt;z-index:251673600;mso-position-horizontal:absolute;mso-position-horizontal-relative:page;mso-position-vertical:absolute;mso-position-vertical-relative:page;mso-wrap-distance-left:0.0pt;mso-wrap-distance-top:0.0pt;mso-wrap-distance-right:0.0pt;mso-wrap-distance-bottom:0.0pt;">
                 <v:fill on="f"/>
                 <v:stroke on="f" weight="1.0pt" dashstyle="solid" endcap="flat" miterlimit="400.0%" joinstyle="miter" linestyle="single" startarrow="none" startarrowwidth="medium" startarrowlength="medium" endarrow="none" endarrowwidth="medium" endarrowlength="medium"/>
                 <v:textbox>
@@ -4644,7 +4639,7 @@
                   <wp:posOffset>457200</wp:posOffset>
                 </wp:positionH>
                 <wp:positionV relativeFrom="page">
-                  <wp:posOffset>5781310</wp:posOffset>
+                  <wp:posOffset>5763562</wp:posOffset>
                 </wp:positionV>
                 <wp:extent cx="2111755" cy="130548"/>
                 <wp:effectExtent l="0" t="0" r="0" b="0"/>
@@ -4782,7 +4777,7 @@
           </mc:Choice>
           <mc:Fallback>
             <w:pict>
-              <v:shape id="_x0000_s1043" type="#_x0000_t202" style="visibility:visible;position:absolute;margin-left:36.0pt;margin-top:455.2pt;width:166.3pt;height:10.3pt;z-index:251674624;mso-position-horizontal:absolute;mso-position-horizontal-relative:page;mso-position-vertical:absolute;mso-position-vertical-relative:page;mso-wrap-distance-left:0.0pt;mso-wrap-distance-top:0.0pt;mso-wrap-distance-right:0.0pt;mso-wrap-distance-bottom:0.0pt;">
+              <v:shape id="_x0000_s1043" type="#_x0000_t202" style="visibility:visible;position:absolute;margin-left:36.0pt;margin-top:453.8pt;width:166.3pt;height:10.3pt;z-index:251674624;mso-position-horizontal:absolute;mso-position-horizontal-relative:page;mso-position-vertical:absolute;mso-position-vertical-relative:page;mso-wrap-distance-left:0.0pt;mso-wrap-distance-top:0.0pt;mso-wrap-distance-right:0.0pt;mso-wrap-distance-bottom:0.0pt;">
                 <v:fill on="f"/>
                 <v:stroke on="f" weight="1.0pt" dashstyle="solid" endcap="flat" miterlimit="400.0%" joinstyle="miter" linestyle="single" startarrow="none" startarrowwidth="medium" startarrowlength="medium" endarrow="none" endarrowwidth="medium" endarrowlength="medium"/>
                 <v:textbox>
@@ -4894,7 +4889,7 @@
                   <wp:posOffset>457200</wp:posOffset>
                 </wp:positionH>
                 <wp:positionV relativeFrom="page">
-                  <wp:posOffset>9162398</wp:posOffset>
+                  <wp:posOffset>9144651</wp:posOffset>
                 </wp:positionV>
                 <wp:extent cx="2111755" cy="192692"/>
                 <wp:effectExtent l="0" t="0" r="0" b="0"/>
@@ -5032,7 +5027,7 @@
           </mc:Choice>
           <mc:Fallback>
             <w:pict>
-              <v:shape id="_x0000_s1044" type="#_x0000_t202" style="visibility:visible;position:absolute;margin-left:36.0pt;margin-top:721.4pt;width:166.3pt;height:15.2pt;z-index:251675648;mso-position-horizontal:absolute;mso-position-horizontal-relative:page;mso-position-vertical:absolute;mso-position-vertical-relative:page;mso-wrap-distance-left:0.0pt;mso-wrap-distance-top:0.0pt;mso-wrap-distance-right:0.0pt;mso-wrap-distance-bottom:0.0pt;">
+              <v:shape id="_x0000_s1044" type="#_x0000_t202" style="visibility:visible;position:absolute;margin-left:36.0pt;margin-top:720.1pt;width:166.3pt;height:15.2pt;z-index:251675648;mso-position-horizontal:absolute;mso-position-horizontal-relative:page;mso-position-vertical:absolute;mso-position-vertical-relative:page;mso-wrap-distance-left:0.0pt;mso-wrap-distance-top:0.0pt;mso-wrap-distance-right:0.0pt;mso-wrap-distance-bottom:0.0pt;">
                 <v:fill on="f"/>
                 <v:stroke on="f" weight="1.0pt" dashstyle="solid" endcap="flat" miterlimit="400.0%" joinstyle="miter" linestyle="single" startarrow="none" startarrowwidth="medium" startarrowlength="medium" endarrow="none" endarrowwidth="medium" endarrowlength="medium"/>
                 <v:textbox>
@@ -5144,7 +5139,7 @@
                   <wp:posOffset>457200</wp:posOffset>
                 </wp:positionH>
                 <wp:positionV relativeFrom="page">
-                  <wp:posOffset>1843615</wp:posOffset>
+                  <wp:posOffset>1881715</wp:posOffset>
                 </wp:positionV>
                 <wp:extent cx="5602288" cy="2150865"/>
                 <wp:effectExtent l="0" t="0" r="0" b="0"/>
@@ -5314,7 +5309,7 @@
                           <w:p>
                             <w:pPr>
                               <w:pStyle w:val="Body"/>
-                              <w:spacing w:after="100" w:line="360" w:lineRule="auto"/>
+                              <w:spacing w:line="288" w:lineRule="auto"/>
                               <w:rPr>
                                 <w:outline w:val="0"/>
                                 <w:color w:val="000000"/>
@@ -5393,8 +5388,6 @@
                               <w:pStyle w:val="Body"/>
                               <w:spacing w:line="288" w:lineRule="auto"/>
                               <w:rPr>
-                                <w:b w:val="1"/>
-                                <w:bCs w:val="1"/>
                                 <w:outline w:val="0"/>
                                 <w:color w:val="000000"/>
                                 <w:sz w:val="16"/>
@@ -5408,25 +5401,6 @@
                             </w:pPr>
                             <w:r>
                               <w:rPr>
-                                <w:b w:val="1"/>
-                                <w:bCs w:val="1"/>
-                                <w:outline w:val="0"/>
-                                <w:color w:val="000000"/>
-                                <w:sz w:val="16"/>
-                                <w:szCs w:val="16"/>
-                                <w:rtl w:val="0"/>
-                                <w14:textFill>
-                                  <w14:solidFill>
-                                    <w14:srgbClr w14:val="000000"/>
-                                  </w14:solidFill>
-                                </w14:textFill>
-                              </w:rPr>
-                              <w:t>PROJECT NAME</w:t>
-                            </w:r>
-                            <w:r>
-                              <w:rPr>
-                                <w:b w:val="1"/>
-                                <w:bCs w:val="1"/>
                                 <w:outline w:val="0"/>
                                 <w:color w:val="000000"/>
                                 <w:sz w:val="16"/>
@@ -5444,6 +5418,8 @@
                               <w:pStyle w:val="Body"/>
                               <w:spacing w:line="288" w:lineRule="auto"/>
                               <w:rPr>
+                                <w:b w:val="1"/>
+                                <w:bCs w:val="1"/>
                                 <w:outline w:val="0"/>
                                 <w:color w:val="000000"/>
                                 <w:sz w:val="16"/>
@@ -5457,6 +5433,8 @@
                             </w:pPr>
                             <w:r>
                               <w:rPr>
+                                <w:b w:val="1"/>
+                                <w:bCs w:val="1"/>
                                 <w:outline w:val="0"/>
                                 <w:color w:val="000000"/>
                                 <w:sz w:val="16"/>
@@ -5468,42 +5446,12 @@
                                   </w14:solidFill>
                                 </w14:textFill>
                               </w:rPr>
-                              <w:t>Nullam id dolor id nibh ultricies vehicula ut id elit. Morbi leo risus, porta ac consectetur ac, vestibulum at eros.</w:t>
-                            </w:r>
-                            <w:r>
-                              <w:rPr>
-                                <w:outline w:val="0"/>
-                                <w:color w:val="000000"/>
-                                <w:sz w:val="16"/>
-                                <w:szCs w:val="16"/>
-                                <w:rtl w:val="0"/>
-                                <w:lang w:val="en-US"/>
-                                <w14:textFill>
-                                  <w14:solidFill>
-                                    <w14:srgbClr w14:val="000000"/>
-                                  </w14:solidFill>
-                                </w14:textFill>
-                              </w:rPr>
-                              <w:t xml:space="preserve"> </w:t>
-                            </w:r>
-                            <w:r>
-                              <w:rPr>
-                                <w:outline w:val="0"/>
-                                <w:color w:val="000000"/>
-                                <w:sz w:val="16"/>
-                                <w:szCs w:val="16"/>
-                                <w:rtl w:val="0"/>
-                                <w:lang w:val="fr-FR"/>
-                                <w14:textFill>
-                                  <w14:solidFill>
-                                    <w14:srgbClr w14:val="000000"/>
-                                  </w14:solidFill>
-                                </w14:textFill>
-                              </w:rPr>
-                              <w:t>Sed posuere consectetur est at lobortis.</w:t>
-                            </w:r>
-                            <w:r>
-                              <w:rPr>
+                              <w:t>PROJECT NAME</w:t>
+                            </w:r>
+                            <w:r>
+                              <w:rPr>
+                                <w:b w:val="1"/>
+                                <w:bCs w:val="1"/>
                                 <w:outline w:val="0"/>
                                 <w:color w:val="000000"/>
                                 <w:sz w:val="16"/>
@@ -5538,6 +5486,53 @@
                                 <w:color w:val="000000"/>
                                 <w:sz w:val="16"/>
                                 <w:szCs w:val="16"/>
+                                <w:rtl w:val="0"/>
+                                <w14:textFill>
+                                  <w14:solidFill>
+                                    <w14:srgbClr w14:val="000000"/>
+                                  </w14:solidFill>
+                                </w14:textFill>
+                              </w:rPr>
+                              <w:t>Nullam id dolor id nibh ultricies vehicula ut id elit. Morbi leo risus, porta ac consectetur ac, vestibulum at eros.</w:t>
+                            </w:r>
+                            <w:r>
+                              <w:rPr>
+                                <w:outline w:val="0"/>
+                                <w:color w:val="000000"/>
+                                <w:sz w:val="16"/>
+                                <w:szCs w:val="16"/>
+                                <w:rtl w:val="0"/>
+                                <w:lang w:val="en-US"/>
+                                <w14:textFill>
+                                  <w14:solidFill>
+                                    <w14:srgbClr w14:val="000000"/>
+                                  </w14:solidFill>
+                                </w14:textFill>
+                              </w:rPr>
+                              <w:t xml:space="preserve"> </w:t>
+                            </w:r>
+                            <w:r>
+                              <w:rPr>
+                                <w:outline w:val="0"/>
+                                <w:color w:val="000000"/>
+                                <w:sz w:val="16"/>
+                                <w:szCs w:val="16"/>
+                                <w:rtl w:val="0"/>
+                                <w:lang w:val="fr-FR"/>
+                                <w14:textFill>
+                                  <w14:solidFill>
+                                    <w14:srgbClr w14:val="000000"/>
+                                  </w14:solidFill>
+                                </w14:textFill>
+                              </w:rPr>
+                              <w:t>Sed posuere consectetur est at lobortis.</w:t>
+                            </w:r>
+                            <w:r>
+                              <w:rPr>
+                                <w:outline w:val="0"/>
+                                <w:color w:val="000000"/>
+                                <w:sz w:val="16"/>
+                                <w:szCs w:val="16"/>
                                 <w14:textFill>
                                   <w14:solidFill>
                                     <w14:srgbClr w14:val="000000"/>
@@ -5551,8 +5546,6 @@
                               <w:pStyle w:val="Body"/>
                               <w:spacing w:line="288" w:lineRule="auto"/>
                               <w:rPr>
-                                <w:b w:val="1"/>
-                                <w:bCs w:val="1"/>
                                 <w:outline w:val="0"/>
                                 <w:color w:val="000000"/>
                                 <w:sz w:val="16"/>
@@ -5566,27 +5559,59 @@
                             </w:pPr>
                             <w:r>
                               <w:rPr>
-                                <w:b w:val="1"/>
-                                <w:bCs w:val="1"/>
-                                <w:outline w:val="0"/>
-                                <w:color w:val="000000"/>
-                                <w:sz w:val="16"/>
-                                <w:szCs w:val="16"/>
-                                <w:rtl w:val="0"/>
-                                <w:lang w:val="en-US"/>
-                                <w14:textFill>
-                                  <w14:solidFill>
-                                    <w14:srgbClr w14:val="000000"/>
-                                  </w14:solidFill>
-                                </w14:textFill>
-                              </w:rPr>
-                              <w:t>PROJECT NAME</w:t>
+                                <w:outline w:val="0"/>
+                                <w:color w:val="000000"/>
+                                <w:sz w:val="16"/>
+                                <w:szCs w:val="16"/>
+                                <w14:textFill>
+                                  <w14:solidFill>
+                                    <w14:srgbClr w14:val="000000"/>
+                                  </w14:solidFill>
+                                </w14:textFill>
+                              </w:rPr>
                             </w:r>
                           </w:p>
                           <w:p>
                             <w:pPr>
                               <w:pStyle w:val="Body"/>
-                              <w:spacing w:after="100" w:line="360" w:lineRule="auto"/>
+                              <w:spacing w:line="288" w:lineRule="auto"/>
+                              <w:rPr>
+                                <w:b w:val="1"/>
+                                <w:bCs w:val="1"/>
+                                <w:outline w:val="0"/>
+                                <w:color w:val="000000"/>
+                                <w:sz w:val="16"/>
+                                <w:szCs w:val="16"/>
+                                <w14:textFill>
+                                  <w14:solidFill>
+                                    <w14:srgbClr w14:val="000000"/>
+                                  </w14:solidFill>
+                                </w14:textFill>
+                              </w:rPr>
+                            </w:pPr>
+                            <w:r>
+                              <w:rPr>
+                                <w:b w:val="1"/>
+                                <w:bCs w:val="1"/>
+                                <w:outline w:val="0"/>
+                                <w:color w:val="000000"/>
+                                <w:sz w:val="16"/>
+                                <w:szCs w:val="16"/>
+                                <w:rtl w:val="0"/>
+                                <w:lang w:val="en-US"/>
+                                <w14:textFill>
+                                  <w14:solidFill>
+                                    <w14:srgbClr w14:val="000000"/>
+                                  </w14:solidFill>
+                                </w14:textFill>
+                              </w:rPr>
+                              <w:t>PROJECT NAME</w:t>
+                            </w:r>
+                          </w:p>
+                          <w:p>
+                            <w:pPr>
+                              <w:pStyle w:val="Body"/>
+                              <w:spacing w:after="100" w:line="288" w:lineRule="auto"/>
                             </w:pPr>
                             <w:r>
                               <w:rPr>
@@ -5665,7 +5690,7 @@
           </mc:Choice>
           <mc:Fallback>
             <w:pict>
-              <v:shape id="_x0000_s1045" type="#_x0000_t202" style="visibility:visible;position:absolute;margin-left:36.0pt;margin-top:145.2pt;width:441.1pt;height:169.4pt;z-index:251676672;mso-position-horizontal:absolute;mso-position-horizontal-relative:page;mso-position-vertical:absolute;mso-position-vertical-relative:page;mso-wrap-distance-left:12.0pt;mso-wrap-distance-top:12.0pt;mso-wrap-distance-right:12.0pt;mso-wrap-distance-bottom:12.0pt;">
+              <v:shape id="_x0000_s1045" type="#_x0000_t202" style="visibility:visible;position:absolute;margin-left:36.0pt;margin-top:148.2pt;width:441.1pt;height:169.4pt;z-index:251676672;mso-position-horizontal:absolute;mso-position-horizontal-relative:page;mso-position-vertical:absolute;mso-position-vertical-relative:page;mso-wrap-distance-left:12.0pt;mso-wrap-distance-top:12.0pt;mso-wrap-distance-right:12.0pt;mso-wrap-distance-bottom:12.0pt;">
                 <v:fill on="f"/>
                 <v:stroke on="f" weight="1.0pt" dashstyle="solid" endcap="flat" miterlimit="400.0%" joinstyle="miter" linestyle="single" startarrow="none" startarrowwidth="medium" startarrowlength="medium" endarrow="none" endarrowwidth="medium" endarrowlength="medium"/>
                 <v:textbox>
@@ -5812,7 +5837,7 @@
                     <w:p>
                       <w:pPr>
                         <w:pStyle w:val="Body"/>
-                        <w:spacing w:after="100" w:line="360" w:lineRule="auto"/>
+                        <w:spacing w:line="288" w:lineRule="auto"/>
                         <w:rPr>
                           <w:outline w:val="0"/>
                           <w:color w:val="000000"/>
@@ -5891,8 +5916,6 @@
                         <w:pStyle w:val="Body"/>
                         <w:spacing w:line="288" w:lineRule="auto"/>
                         <w:rPr>
-                          <w:b w:val="1"/>
-                          <w:bCs w:val="1"/>
                           <w:outline w:val="0"/>
                           <w:color w:val="000000"/>
                           <w:sz w:val="16"/>
@@ -5906,25 +5929,6 @@
                       </w:pPr>
                       <w:r>
                         <w:rPr>
-                          <w:b w:val="1"/>
-                          <w:bCs w:val="1"/>
-                          <w:outline w:val="0"/>
-                          <w:color w:val="000000"/>
-                          <w:sz w:val="16"/>
-                          <w:szCs w:val="16"/>
-                          <w:rtl w:val="0"/>
-                          <w14:textFill>
-                            <w14:solidFill>
-                              <w14:srgbClr w14:val="000000"/>
-                            </w14:solidFill>
-                          </w14:textFill>
-                        </w:rPr>
-                        <w:t>PROJECT NAME</w:t>
-                      </w:r>
-                      <w:r>
-                        <w:rPr>
-                          <w:b w:val="1"/>
-                          <w:bCs w:val="1"/>
                           <w:outline w:val="0"/>
                           <w:color w:val="000000"/>
                           <w:sz w:val="16"/>
@@ -5942,6 +5946,8 @@
                         <w:pStyle w:val="Body"/>
                         <w:spacing w:line="288" w:lineRule="auto"/>
                         <w:rPr>
+                          <w:b w:val="1"/>
+                          <w:bCs w:val="1"/>
                           <w:outline w:val="0"/>
                           <w:color w:val="000000"/>
                           <w:sz w:val="16"/>
@@ -5955,6 +5961,8 @@
                       </w:pPr>
                       <w:r>
                         <w:rPr>
+                          <w:b w:val="1"/>
+                          <w:bCs w:val="1"/>
                           <w:outline w:val="0"/>
                           <w:color w:val="000000"/>
                           <w:sz w:val="16"/>
@@ -5966,42 +5974,12 @@
                             </w14:solidFill>
                           </w14:textFill>
                         </w:rPr>
-                        <w:t>Nullam id dolor id nibh ultricies vehicula ut id elit. Morbi leo risus, porta ac consectetur ac, vestibulum at eros.</w:t>
-                      </w:r>
-                      <w:r>
-                        <w:rPr>
-                          <w:outline w:val="0"/>
-                          <w:color w:val="000000"/>
-                          <w:sz w:val="16"/>
-                          <w:szCs w:val="16"/>
-                          <w:rtl w:val="0"/>
-                          <w:lang w:val="en-US"/>
-                          <w14:textFill>
-                            <w14:solidFill>
-                              <w14:srgbClr w14:val="000000"/>
-                            </w14:solidFill>
-                          </w14:textFill>
-                        </w:rPr>
-                        <w:t xml:space="preserve"> </w:t>
-                      </w:r>
-                      <w:r>
-                        <w:rPr>
-                          <w:outline w:val="0"/>
-                          <w:color w:val="000000"/>
-                          <w:sz w:val="16"/>
-                          <w:szCs w:val="16"/>
-                          <w:rtl w:val="0"/>
-                          <w:lang w:val="fr-FR"/>
-                          <w14:textFill>
-                            <w14:solidFill>
-                              <w14:srgbClr w14:val="000000"/>
-                            </w14:solidFill>
-                          </w14:textFill>
-                        </w:rPr>
-                        <w:t>Sed posuere consectetur est at lobortis.</w:t>
-                      </w:r>
-                      <w:r>
-                        <w:rPr>
+                        <w:t>PROJECT NAME</w:t>
+                      </w:r>
+                      <w:r>
+                        <w:rPr>
+                          <w:b w:val="1"/>
+                          <w:bCs w:val="1"/>
                           <w:outline w:val="0"/>
                           <w:color w:val="000000"/>
                           <w:sz w:val="16"/>
@@ -6036,6 +6014,53 @@
                           <w:color w:val="000000"/>
                           <w:sz w:val="16"/>
                           <w:szCs w:val="16"/>
+                          <w:rtl w:val="0"/>
+                          <w14:textFill>
+                            <w14:solidFill>
+                              <w14:srgbClr w14:val="000000"/>
+                            </w14:solidFill>
+                          </w14:textFill>
+                        </w:rPr>
+                        <w:t>Nullam id dolor id nibh ultricies vehicula ut id elit. Morbi leo risus, porta ac consectetur ac, vestibulum at eros.</w:t>
+                      </w:r>
+                      <w:r>
+                        <w:rPr>
+                          <w:outline w:val="0"/>
+                          <w:color w:val="000000"/>
+                          <w:sz w:val="16"/>
+                          <w:szCs w:val="16"/>
+                          <w:rtl w:val="0"/>
+                          <w:lang w:val="en-US"/>
+                          <w14:textFill>
+                            <w14:solidFill>
+                              <w14:srgbClr w14:val="000000"/>
+                            </w14:solidFill>
+                          </w14:textFill>
+                        </w:rPr>
+                        <w:t xml:space="preserve"> </w:t>
+                      </w:r>
+                      <w:r>
+                        <w:rPr>
+                          <w:outline w:val="0"/>
+                          <w:color w:val="000000"/>
+                          <w:sz w:val="16"/>
+                          <w:szCs w:val="16"/>
+                          <w:rtl w:val="0"/>
+                          <w:lang w:val="fr-FR"/>
+                          <w14:textFill>
+                            <w14:solidFill>
+                              <w14:srgbClr w14:val="000000"/>
+                            </w14:solidFill>
+                          </w14:textFill>
+                        </w:rPr>
+                        <w:t>Sed posuere consectetur est at lobortis.</w:t>
+                      </w:r>
+                      <w:r>
+                        <w:rPr>
+                          <w:outline w:val="0"/>
+                          <w:color w:val="000000"/>
+                          <w:sz w:val="16"/>
+                          <w:szCs w:val="16"/>
                           <w14:textFill>
                             <w14:solidFill>
                               <w14:srgbClr w14:val="000000"/>
@@ -6049,8 +6074,6 @@
                         <w:pStyle w:val="Body"/>
                         <w:spacing w:line="288" w:lineRule="auto"/>
                         <w:rPr>
-                          <w:b w:val="1"/>
-                          <w:bCs w:val="1"/>
                           <w:outline w:val="0"/>
                           <w:color w:val="000000"/>
                           <w:sz w:val="16"/>
@@ -6064,27 +6087,59 @@
                       </w:pPr>
                       <w:r>
                         <w:rPr>
-                          <w:b w:val="1"/>
-                          <w:bCs w:val="1"/>
-                          <w:outline w:val="0"/>
-                          <w:color w:val="000000"/>
-                          <w:sz w:val="16"/>
-                          <w:szCs w:val="16"/>
-                          <w:rtl w:val="0"/>
-                          <w:lang w:val="en-US"/>
-                          <w14:textFill>
-                            <w14:solidFill>
-                              <w14:srgbClr w14:val="000000"/>
-                            </w14:solidFill>
-                          </w14:textFill>
-                        </w:rPr>
-                        <w:t>PROJECT NAME</w:t>
+                          <w:outline w:val="0"/>
+                          <w:color w:val="000000"/>
+                          <w:sz w:val="16"/>
+                          <w:szCs w:val="16"/>
+                          <w14:textFill>
+                            <w14:solidFill>
+                              <w14:srgbClr w14:val="000000"/>
+                            </w14:solidFill>
+                          </w14:textFill>
+                        </w:rPr>
                       </w:r>
                     </w:p>
                     <w:p>
                       <w:pPr>
                         <w:pStyle w:val="Body"/>
-                        <w:spacing w:after="100" w:line="360" w:lineRule="auto"/>
+                        <w:spacing w:line="288" w:lineRule="auto"/>
+                        <w:rPr>
+                          <w:b w:val="1"/>
+                          <w:bCs w:val="1"/>
+                          <w:outline w:val="0"/>
+                          <w:color w:val="000000"/>
+                          <w:sz w:val="16"/>
+                          <w:szCs w:val="16"/>
+                          <w14:textFill>
+                            <w14:solidFill>
+                              <w14:srgbClr w14:val="000000"/>
+                            </w14:solidFill>
+                          </w14:textFill>
+                        </w:rPr>
+                      </w:pPr>
+                      <w:r>
+                        <w:rPr>
+                          <w:b w:val="1"/>
+                          <w:bCs w:val="1"/>
+                          <w:outline w:val="0"/>
+                          <w:color w:val="000000"/>
+                          <w:sz w:val="16"/>
+                          <w:szCs w:val="16"/>
+                          <w:rtl w:val="0"/>
+                          <w:lang w:val="en-US"/>
+                          <w14:textFill>
+                            <w14:solidFill>
+                              <w14:srgbClr w14:val="000000"/>
+                            </w14:solidFill>
+                          </w14:textFill>
+                        </w:rPr>
+                        <w:t>PROJECT NAME</w:t>
+                      </w:r>
+                    </w:p>
+                    <w:p>
+                      <w:pPr>
+                        <w:pStyle w:val="Body"/>
+                        <w:spacing w:after="100" w:line="288" w:lineRule="auto"/>
                       </w:pPr>
                       <w:r>
                         <w:rPr>
@@ -6168,7 +6223,7 @@
                   <wp:posOffset>6288087</wp:posOffset>
                 </wp:positionH>
                 <wp:positionV relativeFrom="page">
-                  <wp:posOffset>1843615</wp:posOffset>
+                  <wp:posOffset>1881715</wp:posOffset>
                 </wp:positionV>
                 <wp:extent cx="1027113" cy="2150865"/>
                 <wp:effectExtent l="0" t="0" r="0" b="0"/>
@@ -6550,7 +6605,7 @@
           </mc:Choice>
           <mc:Fallback>
             <w:pict>
-              <v:shape id="_x0000_s1046" type="#_x0000_t202" style="visibility:visible;position:absolute;margin-left:495.1pt;margin-top:145.2pt;width:80.9pt;height:169.4pt;z-index:251677696;mso-position-horizontal:absolute;mso-position-horizontal-relative:page;mso-position-vertical:absolute;mso-position-vertical-relative:page;mso-wrap-distance-left:12.0pt;mso-wrap-distance-top:12.0pt;mso-wrap-distance-right:12.0pt;mso-wrap-distance-bottom:12.0pt;">
+              <v:shape id="_x0000_s1046" type="#_x0000_t202" style="visibility:visible;position:absolute;margin-left:495.1pt;margin-top:148.2pt;width:80.9pt;height:169.4pt;z-index:251677696;mso-position-horizontal:absolute;mso-position-horizontal-relative:page;mso-position-vertical:absolute;mso-position-vertical-relative:page;mso-wrap-distance-left:12.0pt;mso-wrap-distance-top:12.0pt;mso-wrap-distance-right:12.0pt;mso-wrap-distance-bottom:12.0pt;">
                 <v:fill on="f"/>
                 <v:stroke on="f" weight="1.0pt" dashstyle="solid" endcap="flat" miterlimit="400.0%" joinstyle="miter" linestyle="single" startarrow="none" startarrowwidth="medium" startarrowlength="medium" endarrow="none" endarrowwidth="medium" endarrowlength="medium"/>
                 <v:textbox>
@@ -6906,7 +6961,7 @@
                   <wp:posOffset>457200</wp:posOffset>
                 </wp:positionH>
                 <wp:positionV relativeFrom="page">
-                  <wp:posOffset>1645793</wp:posOffset>
+                  <wp:posOffset>1683893</wp:posOffset>
                 </wp:positionV>
                 <wp:extent cx="1728317" cy="130548"/>
                 <wp:effectExtent l="0" t="0" r="0" b="0"/>
@@ -7044,7 +7099,7 @@
           </mc:Choice>
           <mc:Fallback>
             <w:pict>
-              <v:shape id="_x0000_s1047" type="#_x0000_t202" style="visibility:visible;position:absolute;margin-left:36.0pt;margin-top:129.6pt;width:136.1pt;height:10.3pt;z-index:251678720;mso-position-horizontal:absolute;mso-position-horizontal-relative:page;mso-position-vertical:absolute;mso-position-vertical-relative:page;mso-wrap-distance-left:0.0pt;mso-wrap-distance-top:0.0pt;mso-wrap-distance-right:0.0pt;mso-wrap-distance-bottom:0.0pt;">
+              <v:shape id="_x0000_s1047" type="#_x0000_t202" style="visibility:visible;position:absolute;margin-left:36.0pt;margin-top:132.6pt;width:136.1pt;height:10.3pt;z-index:251678720;mso-position-horizontal:absolute;mso-position-horizontal-relative:page;mso-position-vertical:absolute;mso-position-vertical-relative:page;mso-wrap-distance-left:0.0pt;mso-wrap-distance-top:0.0pt;mso-wrap-distance-right:0.0pt;mso-wrap-distance-bottom:0.0pt;">
                 <v:fill on="f"/>
                 <v:stroke on="f" weight="1.0pt" dashstyle="solid" endcap="flat" miterlimit="400.0%" joinstyle="miter" linestyle="single" startarrow="none" startarrowwidth="medium" startarrowlength="medium" endarrow="none" endarrowwidth="medium" endarrowlength="medium"/>
                 <v:textbox>
@@ -7156,7 +7211,7 @@
                   <wp:posOffset>457200</wp:posOffset>
                 </wp:positionH>
                 <wp:positionV relativeFrom="page">
-                  <wp:posOffset>4349748</wp:posOffset>
+                  <wp:posOffset>4332001</wp:posOffset>
                 </wp:positionV>
                 <wp:extent cx="5602288" cy="302155"/>
                 <wp:effectExtent l="0" t="0" r="0" b="0"/>
@@ -7286,7 +7341,7 @@
           </mc:Choice>
           <mc:Fallback>
             <w:pict>
-              <v:shape id="_x0000_s1048" type="#_x0000_t202" style="visibility:visible;position:absolute;margin-left:36.0pt;margin-top:342.5pt;width:441.1pt;height:23.8pt;z-index:251680768;mso-position-horizontal:absolute;mso-position-horizontal-relative:page;mso-position-vertical:absolute;mso-position-vertical-relative:page;mso-wrap-distance-left:12.0pt;mso-wrap-distance-top:12.0pt;mso-wrap-distance-right:12.0pt;mso-wrap-distance-bottom:12.0pt;">
+              <v:shape id="_x0000_s1048" type="#_x0000_t202" style="visibility:visible;position:absolute;margin-left:36.0pt;margin-top:341.1pt;width:441.1pt;height:23.8pt;z-index:251680768;mso-position-horizontal:absolute;mso-position-horizontal-relative:page;mso-position-vertical:absolute;mso-position-vertical-relative:page;mso-wrap-distance-left:12.0pt;mso-wrap-distance-top:12.0pt;mso-wrap-distance-right:12.0pt;mso-wrap-distance-bottom:12.0pt;">
                 <v:fill on="f"/>
                 <v:stroke on="f" weight="1.0pt" dashstyle="solid" endcap="flat" miterlimit="400.0%" joinstyle="miter" linestyle="single" startarrow="none" startarrowwidth="medium" startarrowlength="medium" endarrow="none" endarrowwidth="medium" endarrowlength="medium"/>
                 <v:textbox>
@@ -7398,7 +7453,7 @@
                   <wp:posOffset>6288087</wp:posOffset>
                 </wp:positionH>
                 <wp:positionV relativeFrom="page">
-                  <wp:posOffset>4349748</wp:posOffset>
+                  <wp:posOffset>4332001</wp:posOffset>
                 </wp:positionV>
                 <wp:extent cx="1027113" cy="302155"/>
                 <wp:effectExtent l="0" t="0" r="0" b="0"/>
@@ -7471,7 +7526,7 @@
           </mc:Choice>
           <mc:Fallback>
             <w:pict>
-              <v:shape id="_x0000_s1049" type="#_x0000_t202" style="visibility:visible;position:absolute;margin-left:495.1pt;margin-top:342.5pt;width:80.9pt;height:23.8pt;z-index:251681792;mso-position-horizontal:absolute;mso-position-horizontal-relative:page;mso-position-vertical:absolute;mso-position-vertical-relative:page;mso-wrap-distance-left:12.0pt;mso-wrap-distance-top:12.0pt;mso-wrap-distance-right:12.0pt;mso-wrap-distance-bottom:12.0pt;">
+              <v:shape id="_x0000_s1049" type="#_x0000_t202" style="visibility:visible;position:absolute;margin-left:495.1pt;margin-top:341.1pt;width:80.9pt;height:23.8pt;z-index:251681792;mso-position-horizontal:absolute;mso-position-horizontal-relative:page;mso-position-vertical:absolute;mso-position-vertical-relative:page;mso-wrap-distance-left:12.0pt;mso-wrap-distance-top:12.0pt;mso-wrap-distance-right:12.0pt;mso-wrap-distance-bottom:12.0pt;">
                 <v:fill on="f"/>
                 <v:stroke on="f" weight="1.0pt" dashstyle="solid" endcap="flat" miterlimit="400.0%" joinstyle="miter" linestyle="single" startarrow="none" startarrowwidth="medium" startarrowlength="medium" endarrow="none" endarrowwidth="medium" endarrowlength="medium"/>
                 <v:textbox>
@@ -7518,7 +7573,7 @@
                   <wp:posOffset>457200</wp:posOffset>
                 </wp:positionH>
                 <wp:positionV relativeFrom="page">
-                  <wp:posOffset>4151926</wp:posOffset>
+                  <wp:posOffset>4134179</wp:posOffset>
                 </wp:positionV>
                 <wp:extent cx="1728317" cy="130548"/>
                 <wp:effectExtent l="0" t="0" r="0" b="0"/>
@@ -7656,7 +7711,7 @@
           </mc:Choice>
           <mc:Fallback>
             <w:pict>
-              <v:shape id="_x0000_s1050" type="#_x0000_t202" style="visibility:visible;position:absolute;margin-left:36.0pt;margin-top:326.9pt;width:136.1pt;height:10.3pt;z-index:251682816;mso-position-horizontal:absolute;mso-position-horizontal-relative:page;mso-position-vertical:absolute;mso-position-vertical-relative:page;mso-wrap-distance-left:0.0pt;mso-wrap-distance-top:0.0pt;mso-wrap-distance-right:0.0pt;mso-wrap-distance-bottom:0.0pt;">
+              <v:shape id="_x0000_s1050" type="#_x0000_t202" style="visibility:visible;position:absolute;margin-left:36.0pt;margin-top:325.5pt;width:136.1pt;height:10.3pt;z-index:251682816;mso-position-horizontal:absolute;mso-position-horizontal-relative:page;mso-position-vertical:absolute;mso-position-vertical-relative:page;mso-wrap-distance-left:0.0pt;mso-wrap-distance-top:0.0pt;mso-wrap-distance-right:0.0pt;mso-wrap-distance-bottom:0.0pt;">
                 <v:fill on="f"/>
                 <v:stroke on="f" weight="1.0pt" dashstyle="solid" endcap="flat" miterlimit="400.0%" joinstyle="miter" linestyle="single" startarrow="none" startarrowwidth="medium" startarrowlength="medium" endarrow="none" endarrowwidth="medium" endarrowlength="medium"/>
                 <v:textbox>

</xml_diff>